<commit_message>
Öz, Abstract ve Extended Summary taslağı; şablona bağlandı
Co-Authored-By: Claude Opus 5.5 <noreply@anthropic.com>
Claude-Session: https://claude.ai/code/session_015BkByremFh97j9aWiMCq3J
</commit_message>
<xml_diff>
--- a/makaleler/turkiye-cin-ortaklasa-rekabet/teslim/makale-anonim-taslak-v1.docx
+++ b/makaleler/turkiye-cin-ortaklasa-rekabet/teslim/makale-anonim-taslak-v1.docx
@@ -784,10 +784,28 @@
               </w:rPr>
             </w:pPr>
             <w:r>
+              <w:rPr/>
+              <w:t xml:space="preserve">Bu çalışma, Türkiye ile Çin'in İpek Yolu turizm mirası üzerinde hangi alanlarda iş birliği, hangi alanlarda rekabet yürüttüğünü ortaklaşa rekabet kuramı çerçevesinde incelemektedir. Firma ve destinasyon düzeyinde geliştirilen ayrıştırma ilkesi, iş birliğinin müşteriden uzak, rekabetin müşteriye yakın faaliyetlerde yoğunlaşacağını öngörür; çalışma bu öngörüyü iki devlet arasındaki miras turizmine taşımaktadır. Tek durumlu, iç içe birimli örnek olay deseninde 2010–2026 dönemine ait 49 resmî belge ve bu belgelerden çıkarılan 368 anlam birimi, bağlantısallık, turist akışı, anlatı ve değer yakalama alanlarına göre iki bağımsız kodlayıcı tarafından açık işaretlere dayalı bir şemayla kodlanmış; TÜİK'in Çin uyruklu giriş serisi betimsel olarak okunmuştur. </w:t>
+            </w:r>
+            <w:r>
               <w:rPr>
                 <w:highlight w:val="yellow"/>
               </w:rPr>
-              <w:t xml:space="preserve">ÖZ (150–200 kelime): amaç, yöntem, temel bulgular ve sonuç. Bulgular kesinleşince yazılacak.</w:t>
+              <w:t xml:space="preserve">BULGU: Rekabet kodlarının payı bağlantısallıkta %__ iken değer yakalamada %__'dir; ayrıştırma ilkesi desteklenmektedir / kısmen desteklenmektedir / desteklenmemektedir.</w:t>
+            </w:r>
+            <w:r>
+              <w:rPr/>
+              <w:t xml:space="preserve"> Çin uyruklu girişler 2013–2025 döneminde üç katına çıkmış, ancak toplam yabancı girişler içindeki payı hiçbir yıl yüzde biri aşmamıştır. </w:t>
+            </w:r>
+            <w:r>
+              <w:rPr>
+                <w:highlight w:val="yellow"/>
+              </w:rPr>
+              <w:t xml:space="preserve">SONUÇ: tek cümle, Tartışma ve Sonuç bölümündeki ana iddiayla aynı.</w:t>
+            </w:r>
+            <w:r>
+              <w:rPr/>
+              <w:t xml:space="preserve"> Bulgular, paylaşılan İpek Yolu mirasının nötr bir ortak varlıktan çok ortaklaşa rekabetin nesnesi olarak işlediğini düşündürmektedir.</w:t>
             </w:r>
           </w:p>
           <w:sdt>
@@ -845,9 +863,34 @@
             <w:r>
               <w:rPr>
                 <w:lang w:val="en-US"/>
+              </w:rPr>
+              <w:t xml:space="preserve">This study examines in which domains Türkiye and China cooperate and in which they compete over the tourism heritage of the Silk Road, drawing on coopetition theory. The separation principle, developed at firm and destination level, predicts that cooperation concentrates in activities far from the customer and competition in activities close to the customer; the study transfers this prediction to inter-state heritage tourism. In a single embedded case design, 49 official documents from 2010–2026 and the 368 meaning units extracted from them were coded by two independent coders, using a scheme based on manifest markers, across four domains: connectivity, tourist flows, narrative and value capture. The Turkish Statistical Institute series on arrivals of Chinese nationals was read descriptively. </w:t>
+            </w:r>
+            <w:r>
+              <w:rPr>
+                <w:lang w:val="en-US"/>
                 <w:highlight w:val="yellow"/>
               </w:rPr>
-              <w:t xml:space="preserve">ABSTRACT (150–200 words): to mirror the Turkish Öz once findings are final.</w:t>
+              <w:t xml:space="preserve">FINDING: The share of competition codes is __% in connectivity and __% in value capture; the separation principle is supported / partially supported / not supported.</w:t>
+            </w:r>
+            <w:r>
+              <w:rPr>
+                <w:lang w:val="en-US"/>
+              </w:rPr>
+              <w:t xml:space="preserve"> Arrivals of Chinese nationals tripled between 2013 and 2025, yet their share of all foreign arrivals never exceeded one per cent. </w:t>
+            </w:r>
+            <w:r>
+              <w:rPr>
+                <w:lang w:val="en-US"/>
+                <w:highlight w:val="yellow"/>
+              </w:rPr>
+              <w:t xml:space="preserve">CONCLUSION: one sentence, mirroring the Turkish Öz.</w:t>
+            </w:r>
+            <w:r>
+              <w:rPr>
+                <w:lang w:val="en-US"/>
+              </w:rPr>
+              <w:t xml:space="preserve"> The findings suggest that the shared Silk Road heritage operates less as a neutral common asset than as the object of coopetition.</w:t>
             </w:r>
           </w:p>
         </w:tc>
@@ -934,7 +977,7 @@
       </w:pPr>
       <w:r>
         <w:rPr/>
-        <w:t xml:space="preserve">Türkiye ile Çin arasındaki turizm ilişkisini konu alan yazın, ilişkiyi büyük ölçüde Kuşak ve Yol Girişimi'nin açtığı bir karşılıklı kazanç alanı olarak okumaktadır. Turizm, Çin ile girişim güzergâhındaki ülkeler arasında iş birliğinin başlıca alanlarından biri sayılmış, 2018'de Çin'de düzenlenen Türkiye Turizm Yılı da bu iş birliğinin somut göstergesi olarak ele alınmıştır (Niu ve Li, 2019). Türkçe yazında girişimin Türkiye turizmini olumlu etkileyeceği, Çin'den ve diğer Asya ülkelerinden gelen seyahati kolaylaştıracağı ve yeni pazarlar açacağı beklentisi ağır basmaktadır (İbiş, 2019; Kılıç, 2021; Palidan, 2024). Türk devletleri arasındaki turizmi inceleyen nitel bir çalışma da ülkeler arası ilişkiyi ortak tanıtım ve bir çatı örgüt önerisi etrafında, yalnız iş birliği ekseninde kurmaktadır (Tuna vd., 2022). Bu çerçevede sorunlar ilişkinin kendisine değil, iş birliğinin önündeki engellere bağlanır. Güvenlik istikrarsızlığı, iki ülke arasındaki siyasi anlaşmazlıklar ve Çince hizmet veren rehber eksikliği bu engellerin başında gelir (Niu ve Li, 2019; Akyılmaz, 2021).</w:t>
+        <w:t xml:space="preserve">Türkiye ile Çin arasındaki turizm ilişkisini konu alan yazın, ilişkiyi büyük ölçüde Kuşak ve Yol Girişimi'nin açtığı bir karşılıklı kazanç alanı olarak okumaktadır. Turizm, Çin ile girişim güzergâhındaki ülkeler arasında iş birliğinin başlıca alanlarından biri sayılmış, 2018'de Çin'de düzenlenen Türkiye Turizm Yılı da bu iş birliğinin somut göstergesi olarak ele alınmıştır (Niu ve Li, 2019). Türkçe yazında girişimin Türkiye turizmini olumlu etkileyeceği, Çin'den ve diğer Asya ülkelerinden gelen seyahati kolaylaştıracağı ve yeni pazarlar açacağı beklentisi ağır basmaktadır (İbiş, 2019; Kılıç, 2021; Palidan, 2024). Türk devletleri arasındaki turizmi inceleyen nitel bir çalışma da ülkeler arası ilişkiyi ortak tanıtım ve bir çatı örgüt önerisi etrafında, yalnız iş birliği ekseninde kurmaktadır (Tuna vd., 2022). Bu çerçevede sorunlar ilişkinin kendisine değil, iş birliğinin önündeki engellere bağlanır. Güvenlik istikrarsızlığı, iki ülke arasındaki siyasi anlaşmazlıklar ve Çince hizmet veren rehber eksikliği bu engellerin başında gelir (Akyılmaz, 2021; Niu ve Li, 2019).</w:t>
       </w:r>
     </w:p>
     <w:p>
@@ -943,7 +986,7 @@
       </w:pPr>
       <w:r>
         <w:rPr/>
-        <w:t xml:space="preserve">Uzlaşının zayıf noktası, ampirik bulgudan çok beklentiye dayanmasıdır. Girişimin turizmde doğuracağı sinerjiye dair ampirik çalışma eksikliği bu yazının kendi içinden de dile getirilmiş, ortak kalkınma söyleminin ardında kazanımların taraflar arasında nasıl dağılacağı sorusu açık bırakılmıştır (Kılıç, 2021; Zengin ve Koç, 2021). İki ülke ilişkisinin bütününü inceleyen uluslararası ilişkiler yazını ise daha temkinli bir tablo çizer. Bu yazına göre Çin ile Türkiye arasındaki ilişki 2010'dan bu yana düşük düzeyli bir stratejik iş birliğinde kalmış, taraflar birbirini ekonomik ortak, siyasi rakip ve güvenlik rakibi karışımı olarak algılamıştır (Wang ve Sun, 2024). Kuşak ve Yol ile Orta Koridor birbirinden bağımsız geliştirilmiş iki tasarımdır; aralarındaki sinerji büyük ölçüde ikili ilişkinin niteliğine bağlıdır (Chaziza, 2021; Akçay ve Guo, 2023). Turizm yazını iş birliğini başlangıç varsayımı olarak alırken ilişkinin bütününe bakan yazın aynı ikilide rekabetçi rollerin de bulunduğunu göstermektedir. Bu rollerin turizm ve İpek Yolu mirası alanında nasıl dağıldığı ise sınanmamıştır.</w:t>
+        <w:t xml:space="preserve">Uzlaşının zayıf noktası, ampirik bulgudan çok beklentiye dayanmasıdır. Girişimin turizmde doğuracağı sinerjiye dair ampirik çalışma eksikliği bu yazının kendi içinden de dile getirilmiş, ortak kalkınma söyleminin ardında kazanımların taraflar arasında nasıl dağılacağı sorusu açık bırakılmıştır (Kılıç, 2021; Zengin ve Koç, 2021). İki ülke ilişkisinin bütününü inceleyen uluslararası ilişkiler yazını ise daha temkinli bir tablo çizer. Bu yazına göre Çin ile Türkiye arasındaki ilişki 2010'dan bu yana düşük düzeyli bir stratejik iş birliğinde kalmış, taraflar birbirini ekonomik ortak, siyasi rakip ve güvenlik rakibi karışımı olarak algılamıştır (Wang ve Sun, 2024). Kuşak ve Yol ile Orta Koridor birbirinden bağımsız geliştirilmiş iki tasarımdır; aralarındaki sinerji büyük ölçüde ikili ilişkinin niteliğine bağlıdır (Akçay ve Guo, 2023; Chaziza, 2021). Turizm yazını iş birliğini başlangıç varsayımı olarak alırken ilişkinin bütününe bakan yazın aynı ikilide rekabetçi rollerin de bulunduğunu göstermektedir. Bu rollerin turizm ve İpek Yolu mirası alanında nasıl dağıldığı ise sınanmamıştır.</w:t>
       </w:r>
     </w:p>
     <w:p>
@@ -1070,7 +1113,7 @@
       </w:pPr>
       <w:r>
         <w:rPr/>
-        <w:t xml:space="preserve">Aynı miras rota merkezi, başlangıç noktası ya da köprü iddialarına konu olduğunda pay alma mücadelesinin nesnesine dönüşür. Paylaşılan mirasın karşıt sahiplenmeler ürettiğini gösteren miras siyaseti yazını (Debarbieux vd., 2023; Brown ve O'Brien, 2025), bu işlevin özellikle tek taraflı tanıtım ve politika anlatılarında görünür olmasını beklemeyi gerektirir.</w:t>
+        <w:t xml:space="preserve">Aynı miras rota merkezi, başlangıç noktası ya da köprü iddialarına konu olduğunda pay alma mücadelesinin nesnesine dönüşür. Paylaşılan mirasın karşıt sahiplenmeler ürettiğini gösteren miras siyaseti yazını (Brown ve O'Brien, 2025; Debarbieux vd., 2023), bu işlevin özellikle tek taraflı tanıtım ve politika anlatılarında görünür olmasını beklemeyi gerektirir.</w:t>
       </w:r>
     </w:p>
     <w:p>
@@ -3297,10 +3340,8 @@
         </w:rPr>
       </w:pPr>
       <w:r>
-        <w:rPr>
-          <w:highlight w:val="yellow"/>
-        </w:rPr>
-        <w:t xml:space="preserve">EXTENDED SUMMARY – Purpose: to be written in English once findings are final (whole summary 750–1,000 words, with in-text citations, no separate reference list).</w:t>
+        <w:rPr/>
+        <w:t xml:space="preserve">Official discourse between Türkiye and China presents the Silk Road as a shared heritage and tourism as a natural field of cooperation. Türkiye aligned its Middle Corridor with the Belt and Road Initiative through a memorandum signed in Antalya in 2015 (Resmî Gazete, 2017), 2018 was celebrated as the Year of Turkish Tourism in China (Niu &amp; Li, 2019), the two culture and tourism ministries signed a tourism cooperation memorandum in 2024, and from 2 January 2026 Türkiye granted Chinese citizens unilateral visa-free entry (Türkiye Turizm Tanıtım ve Geliştirme Ajansı [TGA], 2026). The Turkish tourism literature reads this relationship largely as a win-win partnership and treats its problems, such as security perceptions, language and distance, as technical obstacles (İbiş, 2019; Kılıç, 2021; Palidan, 2024). Heritage politics research, however, shows that "shared" heritage also generates competing claims of ownership and centrality (Brown &amp; O'Brien, 2025; Debarbieux et al., 2023), and China's historicisation of the Silk Road has been described as Sinocentric (Sciorati, 2023). The study asks two questions. First, in which domains do Türkiye and China cooperate and in which do they compete over Silk Road tourism heritage between 2010 and 2026, and does this distribution follow the activity's proximity to the tourist? Second, to what extent have the two countries' cooperation discourse and agreements been reflected in arrivals of Chinese nationals to Türkiye?</w:t>
       </w:r>
     </w:p>
     <w:p>
@@ -3322,10 +3363,18 @@
         </w:rPr>
       </w:pPr>
       <w:r>
+        <w:rPr/>
+        <w:t xml:space="preserve">The study adopts a critical realist stance and a single embedded case design, with the Türkiye–China dyad as the case and four domains, ordered in advance by proximity to the tourist, as embedded units: connectivity, tourist flows, narrative and value capture. The theoretical mechanism tested is the separation principle derived from Bengtsson and Kock (2000, p. 421), according to which competitors cooperate in input activities far from the customer and compete in output activities close to the customer. Systematic document analysis (Bowen, 2009) was applied to two corpora: 25 bilateral or joint official documents (Corpus A) and 24 unilateral Silk Road promotion and policy narratives (Corpus B), collected through criterion sampling from Turkish and Chinese official sources. The documents were segmented into 368 meaning units. Orientation was derived mechanically from three manifest markers (a joint subject, self-promotion, and exclusion or one-sidedness) to produce cooperation, competition, mixed or neutral codes. A pilot round showed that interpretive judgement produced very low agreement, which led to the marker-based scheme; pilot codes were not used in the analysis. Final coding was carried out by two independent human coders, and inter-coder agreement is reported with Cohen's kappa </w:t>
+      </w:r>
+      <w:r>
         <w:rPr>
           <w:highlight w:val="yellow"/>
         </w:rPr>
-        <w:t xml:space="preserve">Methodology: single embedded case; systematic document analysis of 49 official documents (368 meaning units); two independent human coders; TÜİK arrivals series 2010–2025 (descriptive).</w:t>
+        <w:t xml:space="preserve">κ domain = __; κ orientation = __</w:t>
+      </w:r>
+      <w:r>
+        <w:rPr/>
+        <w:t xml:space="preserve">. The decision rule for the separation principle was written before the analysis: a monotonic increase in the share of competition codes from connectivity to value capture, or a difference of at least 20 percentage points between the two ends, counts as support. Arrivals of Chinese nationals from the Turkish Statistical Institute series for 2010–2025 were used descriptively, without causal testing (Türkiye İstatistik Kurumu [TÜİK], 2026).</w:t>
       </w:r>
     </w:p>
     <w:p>
@@ -3349,7 +3398,41 @@
         <w:rPr>
           <w:highlight w:val="yellow"/>
         </w:rPr>
-        <w:t xml:space="preserve">Findings: P1–P5 in order; to be filled after the human coding is complete.</w:t>
+        <w:t xml:space="preserve">P1 and P2: shares of cooperation codes in Corpus A and of competition codes in Corpus B, with one short documentary example each; asymmetry between Turkish and Chinese sources in self-promotion and exclusion markers.</w:t>
+      </w:r>
+    </w:p>
+    <w:p>
+      <w:pPr>
+        <w:pStyle w:val="Gvdemetin"/>
+        <w:rPr>
+          <w:b/>
+          <w:bCs/>
+        </w:rPr>
+      </w:pPr>
+      <w:r>
+        <w:rPr>
+          <w:highlight w:val="yellow"/>
+        </w:rPr>
+        <w:t xml:space="preserve">P3: shares of competition codes across the four domains (connectivity __%, tourist flows __%, narrative __%, value capture __%), with and without neutral units; outcome of the pre-registered rule; number and character of negative cases.</w:t>
+      </w:r>
+    </w:p>
+    <w:p>
+      <w:pPr>
+        <w:pStyle w:val="Gvdemetin"/>
+        <w:rPr>
+          <w:b/>
+          <w:bCs/>
+        </w:rPr>
+      </w:pPr>
+      <w:r>
+        <w:rPr/>
+        <w:t xml:space="preserve">The descriptive series shows a clear gap between discourse and flows. Arrivals of Chinese nationals rose from 138,876 in 2013 to 426,344 in 2019 and stood at 425,348 in 2025, but their share of all foreign arrivals peaked at 0.998% in 2018 and never exceeded one per cent (TÜİK, 2026). Connectivity cooperation along the Middle Corridor has produced freight capacity rather than passenger services; the corridor carried about 5.2 million tonnes of freight in 2025 without a scheduled international passenger service on its main axis (Farmanov et al., 2026). </w:t>
+      </w:r>
+      <w:r>
+        <w:rPr>
+          <w:highlight w:val="yellow"/>
+        </w:rPr>
+        <w:t xml:space="preserve">P4 and P5: what the coding adds to this picture, for example Chinese narratives that market domestic Silk Road destinations.</w:t>
       </w:r>
     </w:p>
     <w:p>
@@ -3373,7 +3456,7 @@
         <w:rPr>
           <w:highlight w:val="yellow"/>
         </w:rPr>
-        <w:t xml:space="preserve">Conclusions: to be filled after Discussion and Conclusion is written by the author.</w:t>
+        <w:t xml:space="preserve">Conclusions (author): whether and how far the separation principle travels to inter-state heritage tourism; how the competing explanations of market-based separation (Bengtsson &amp; Kock, 2000, p. 420), geographic and cultural distance (Deng &amp; Hu, 2019) and status asymmetry (Norheim-Hansen et al., 2026) fare against the findings; one or two policy implications for Türkiye; limitations (corpus selection, Chinese-language sources, the construct–measure gap in value capture, arrivals as border records rather than tourist counts).</w:t>
       </w:r>
     </w:p>
     <w:p>
@@ -3395,10 +3478,8 @@
         </w:rPr>
       </w:pPr>
       <w:r>
-        <w:rPr>
-          <w:highlight w:val="yellow"/>
-        </w:rPr>
-        <w:t xml:space="preserve">Originality and value: first transfer of the separation principle (Bengtsson &amp; Kock, 2000) to inter-state heritage tourism; the Silk Road heritage as the object of coopetition rather than a neutral shared asset.</w:t>
+        <w:rPr/>
+        <w:t xml:space="preserve">The study makes three contributions. Theoretically, it carries the separation principle, so far examined among firms and destinations (Chim-Miki &amp; Batista-Canino, 2017a; Wang &amp; Krakover, 2008), to heritage tourism between two states. Existing work on Silk Road coopetition addresses multilateral programme management (Redi &amp; Pulido Fernández, 2018), and international relations studies of the Türkiye–China dyad or of great power coopetition explain the relationship as a whole without asking in which activities cooperation and competition concentrate (Wang &amp; Sun, 2024; Wisniewski, 2025). Conceptually, it shows that the discourse of a "shared Silk Road" can carry partnership and ownership claims at the same time, and proposes that the Silk Road heritage is the object of coopetition rather than a neutral common asset. Practically, it offers a framework for identifying where Türkiye's China tourism policy gains from cooperation and where it needs differentiation.</w:t>
       </w:r>
       <w:r>
         <w:br w:type="page"/>

</xml_diff>

<commit_message>
Bölümler bağlantılı yazımla yeniden yazıldı (v2); 'yazın' yerine 'literatür'
Co-Authored-By: Claude Opus 5.5 <noreply@anthropic.com>
Claude-Session: https://claude.ai/code/session_015BkByremFh97j9aWiMCq3J
</commit_message>
<xml_diff>
--- a/makaleler/turkiye-cin-ortaklasa-rekabet/teslim/makale-anonim-taslak-v1.docx
+++ b/makaleler/turkiye-cin-ortaklasa-rekabet/teslim/makale-anonim-taslak-v1.docx
@@ -785,17 +785,17 @@
             </w:pPr>
             <w:r>
               <w:rPr/>
-              <w:t xml:space="preserve">Bu çalışma, Türkiye ile Çin'in İpek Yolu turizm mirası üzerinde hangi alanlarda iş birliği, hangi alanlarda rekabet yürüttüğünü ortaklaşa rekabet kuramı çerçevesinde incelemektedir. Firma ve destinasyon düzeyinde geliştirilen ayrıştırma ilkesi, iş birliğinin müşteriden uzak, rekabetin müşteriye yakın faaliyetlerde yoğunlaşacağını öngörür; çalışma bu öngörüyü iki devlet arasındaki miras turizmine taşımaktadır. Tek durumlu, iç içe birimli örnek olay deseninde 2010–2026 dönemine ait 49 resmî belge ve bu belgelerden çıkarılan 368 anlam birimi, bağlantısallık, turist akışı, anlatı ve değer yakalama alanlarına göre iki bağımsız kodlayıcı tarafından açık işaretlere dayalı bir şemayla kodlanmış; TÜİK'in Çin uyruklu giriş serisi betimsel olarak okunmuştur. </w:t>
+              <w:t xml:space="preserve">Türkiye ile Çin, İpek Yolu'nu ortak bir miras olarak sunan güçlü bir iş birliği söylemine sahiptir; buna karşın Çin uyruklu girişler 2013–2025 döneminde üç katına çıkmasına rağmen Türkiye'ye yapılan toplam yabancı girişlerin hiçbir yıl yüzde birini aşmamıştır. Literatür bu açığı iş birliğinin önündeki engellerle açıklarken, bu çalışma ilişkinin kendisine bakmakta ve iki ülkenin aynı mirası paylaşırken onun üzerinde rekabet de edip etmediğini ortaklaşa rekabet kuramıyla incelemektedir. Kuramın ayrıştırma ilkesine göre iş birliği müşteriden uzak, rekabet müşteriye yakın faaliyetlerde yoğunlaşır. Bu öngörüyü sınamak için 2010–2026 dönemine ait 49 resmî belge 368 anlam birimine ayrılmış ve bağlantısallık, turist akışı, anlatı ve değer yakalama alanlarında iki bağımsız kodlayıcı tarafından açık işaretlere dayalı bir şemayla kodlanmıştır. </w:t>
             </w:r>
             <w:r>
               <w:rPr>
                 <w:highlight w:val="yellow"/>
               </w:rPr>
-              <w:t xml:space="preserve">BULGU: Rekabet kodlarının payı bağlantısallıkta %__ iken değer yakalamada %__'dir; ayrıştırma ilkesi desteklenmektedir / kısmen desteklenmektedir / desteklenmemektedir.</w:t>
+              <w:t xml:space="preserve">BULGU: Rekabet kodlarının payı bağlantısallıkta %__ iken değer yakalamada %__'dir; dolayısıyla ayrıştırma ilkesi desteklenmektedir / kısmen desteklenmektedir / desteklenmemektedir.</w:t>
             </w:r>
             <w:r>
               <w:rPr/>
-              <w:t xml:space="preserve"> Çin uyruklu girişler 2013–2025 döneminde üç katına çıkmış, ancak toplam yabancı girişler içindeki payı hiçbir yıl yüzde biri aşmamıştır. </w:t>
+              <w:t xml:space="preserve"> </w:t>
             </w:r>
             <w:r>
               <w:rPr>
@@ -805,7 +805,7 @@
             </w:r>
             <w:r>
               <w:rPr/>
-              <w:t xml:space="preserve"> Bulgular, paylaşılan İpek Yolu mirasının nötr bir ortak varlıktan çok ortaklaşa rekabetin nesnesi olarak işlediğini düşündürmektedir.</w:t>
+              <w:t xml:space="preserve"> Bu sonuç, paylaşılan İpek Yolu mirasının nötr bir ortak varlıktan çok ortaklaşa rekabetin nesnesi olarak işlediğini düşündürmektedir.</w:t>
             </w:r>
           </w:p>
           <w:sdt>
@@ -864,20 +864,20 @@
               <w:rPr>
                 <w:lang w:val="en-US"/>
               </w:rPr>
-              <w:t xml:space="preserve">This study examines in which domains Türkiye and China cooperate and in which they compete over the tourism heritage of the Silk Road, drawing on coopetition theory. The separation principle, developed at firm and destination level, predicts that cooperation concentrates in activities far from the customer and competition in activities close to the customer; the study transfers this prediction to inter-state heritage tourism. In a single embedded case design, 49 official documents from 2010–2026 and the 368 meaning units extracted from them were coded by two independent coders, using a scheme based on manifest markers, across four domains: connectivity, tourist flows, narrative and value capture. The Turkish Statistical Institute series on arrivals of Chinese nationals was read descriptively. </w:t>
+              <w:t xml:space="preserve">Türkiye and China share a strong discourse of cooperation that presents the Silk Road as a common heritage; yet although arrivals of Chinese nationals in Türkiye tripled between 2013 and 2025, they never exceeded one per cent of all foreign arrivals. While the literature explains this gap by obstacles to cooperation, this study looks at the relationship itself and uses coopetition theory to ask whether the two countries also compete over the heritage they share. According to the separation principle of the theory, cooperation concentrates in activities far from the customer and competition in activities close to the customer. To test this prediction, 49 official documents from 2010–2026 were divided into 368 meaning units, which two independent coders coded across the domains of connectivity, tourist flows, narrative and value capture using a scheme based on manifest markers. </w:t>
             </w:r>
             <w:r>
               <w:rPr>
                 <w:lang w:val="en-US"/>
                 <w:highlight w:val="yellow"/>
               </w:rPr>
-              <w:t xml:space="preserve">FINDING: The share of competition codes is __% in connectivity and __% in value capture; the separation principle is supported / partially supported / not supported.</w:t>
+              <w:t xml:space="preserve">FINDING: The share of competition codes is __% in connectivity and __% in value capture; the separation principle is therefore supported / partially supported / not supported.</w:t>
             </w:r>
             <w:r>
               <w:rPr>
                 <w:lang w:val="en-US"/>
               </w:rPr>
-              <w:t xml:space="preserve"> Arrivals of Chinese nationals tripled between 2013 and 2025, yet their share of all foreign arrivals never exceeded one per cent. </w:t>
+              <w:t xml:space="preserve"> </w:t>
             </w:r>
             <w:r>
               <w:rPr>
@@ -890,7 +890,7 @@
               <w:rPr>
                 <w:lang w:val="en-US"/>
               </w:rPr>
-              <w:t xml:space="preserve"> The findings suggest that the shared Silk Road heritage operates less as a neutral common asset than as the object of coopetition.</w:t>
+              <w:t xml:space="preserve"> This suggests that the shared Silk Road heritage operates less as a neutral common asset than as the object of coopetition.</w:t>
             </w:r>
           </w:p>
         </w:tc>
@@ -912,7 +912,7 @@
       </w:pPr>
       <w:r>
         <w:rPr/>
-        <w:t xml:space="preserve">Türkiye ile Çin, aynı tarihî güzergâhın iki ucunda durmaktadır. Bu konum iki ülkenin resmî metinlerinde ortak bir mirasın paylaşımı olarak anlatılır: Türkiye Kuşak ve Yol Girişimi'ni 2015'te Antalya'da imzalanan mutabakat zaptıyla Orta Koridor'la uyumlaştırmış (Resmî Gazete, 2017), 2018 yılı Çin'de Türkiye Turizm Yılı olarak kutlanmış (Niu ve Li, 2019), 2024'te iki ülkenin kültür ve turizm bakanlıkları bir turizm iş birliği mutabakatı imzalamış (Çin Halk Cumhuriyeti Kültür ve Turizm Bakanlığı, 2024), 2 Ocak 2026'dan itibaren Türkiye Çin vatandaşlarına tek taraflı vize muafiyeti tanımıştır (Türkiye Turizm Tanıtım ve Geliştirme Ajansı [TGA], 2026). Bu dizinin ima ettiği beklenti açıktır: miras ortaktır, iş birliği kurulmuştur, turist gelecektir.</w:t>
+        <w:t xml:space="preserve">Türkiye ile Çin, İpek Yolu olarak anılan tarihî güzergâhın iki ucunda durmaktadır ve iki ülkenin resmî metinleri bu konumu ortak bir mirasın paylaşımı olarak anlatır. Son on yıldaki adımlar da bu anlatıyı izler: Türkiye 2015'te Antalya'da imzalanan mutabakat zaptıyla Orta Koridor'u Kuşak ve Yol Girişimi ile uyumlaştırmış (Resmî Gazete, 2017), 2018 yılı Çin'de Türkiye Turizm Yılı olarak kutlanmış (Niu ve Li, 2019), 2024'te iki ülkenin kültür ve turizm bakanlıkları bir turizm iş birliği mutabakatı imzalamış (Çin Halk Cumhuriyeti Kültür ve Turizm Bakanlığı, 2024) ve Türkiye 2 Ocak 2026'dan itibaren Çin vatandaşlarına tek taraflı vize muafiyeti tanımıştır (Türkiye Turizm Tanıtım ve Geliştirme Ajansı [TGA], 2026). Bu adımlar art arda okunduğunda açık bir beklenti ortaya çıkar: miras ortaksa ve iş birliği kurulmuşsa, Çinli turistin de gelmesi gerekir.</w:t>
       </w:r>
     </w:p>
     <w:p>
@@ -921,7 +921,7 @@
       </w:pPr>
       <w:r>
         <w:rPr/>
-        <w:t xml:space="preserve">Veri bu beklentiyi yalnız kısmen karşılamaktadır. Türkiye'ye giriş yapan Çin uyruklu kişi sayısı 2013'te 138.876 iken 2019'da 426.344'e yükselmiş, 2025'te 425.348 olarak gerçekleşmiştir (Türkiye İstatistik Kurumu [TÜİK], 2026). Mutlak artış belirgindir; ancak Çin uyrukluların toplam yabancı girişleri içindeki payı hiçbir yıl yüzde birin üstüne çıkmamış, en yüksek değerine 2018'de (%0,998) ulaşmıştır. On yılı aşan iş birliği söylemi, altyapı anlaşmaları ve tanıtım kampanyaları, dünyanın en büyük kaynak pazarından gelen akışı Türkiye'nin toplam ziyaretçi profili içinde marjinal bir paydan öteye taşıyamamıştır. Söylem ile akış arasındaki bu açık, bu çalışmanın çıkış noktasıdır.</w:t>
+        <w:t xml:space="preserve">Veri bu beklentiyi ancak kısmen karşılamaktadır. Türkiye'ye giriş yapan Çin uyruklu kişi sayısı 2013'te 138.876 iken 2019'da 426.344'e yükselmiş ve 2025'te 425.348 olmuştur (Türkiye İstatistik Kurumu [TÜİK], 2026). Sayı üç katına çıkmıştır; buna karşın Çin uyrukluların toplam yabancı girişler içindeki payı hiçbir yıl yüzde biri aşmamış, en yüksek değerine 2018'de %0,998 ile ulaşmıştır. Başka bir deyişle, on yılı aşan iş birliği söylemi, altyapı anlaşmaları ve tanıtım kampanyaları, dünyanın en büyük kaynak pazarlarından birinden gelen akışı Türkiye'nin ziyaretçi profilinde marjinal bir paydan öteye taşıyamamıştır. Bu çalışmanın çıkış noktası, söylem ile akış arasındaki bu açıktır.</w:t>
       </w:r>
     </w:p>
     <w:p>
@@ -930,7 +930,7 @@
       </w:pPr>
       <w:r>
         <w:rPr/>
-        <w:t xml:space="preserve">Açığı açıklamanın alışılmış yolu iş birliğinin önündeki engelleri saymaktır: güvenlik algısı, dil, uçuş kapasitesi, coğrafi uzaklık. Bu çalışma farklı bir yol izlemekte ve ilişkinin kendisini sorgulamaktadır. İki ülke İpek Yolu mirası üzerinde yalnız iş birliği yapmıyor olabilir; aynı mirasın hikâyesini kimin anlatacağı, rotanın merkezinin nerede olduğu ve turist harcamasının hangi tarafta kalacağı konusunda rekabet de ediyor olabilir. Yönetim yazınında ortaklaşa rekabet (coopetition) olarak adlandırılan bu eşzamanlılık, iş birliğinin bazı faaliyetlerde, rekabetin başka faaliyetlerde yoğunlaştığını öngörür. Buradaki soru, bu öngörünün iki devlet arasındaki miras turizminde geçerli olup olmadığıdır.</w:t>
+        <w:t xml:space="preserve">Açığı açıklamanın alışılmış yolu, iş birliğinin önündeki engelleri saymaktır: güvenlik algısı, dil, uçuş kapasitesi ve coğrafi uzaklık. Bu açıklama, engeller kalktığında iş birliğinin kendiliğinden turiste dönüşeceğini varsayar. Oysa sorun engellerde değil, ilişkinin kendisinde olabilir. İki ülke İpek Yolu mirası üzerinde yalnızca iş birliği yapmıyor, aynı zamanda bu mirasın hikâyesini kimin anlatacağı, rotanın merkezinin nerede olduğu ve turist harcamasının hangi tarafta kalacağı konusunda rekabet de ediyor olabilir. Yönetim literatüründe bu eşzamanlılığa ortaklaşa rekabet (coopetition) denir ve bu literatür, iş birliği ile rekabetin aynı ilişkide farklı faaliyetlere ayrıştığını öngörür. Bu öngörü doğruysa, iş birliğinin turiste uzak alanlarda toplanması ve turiste yakın alanlarda rekabete dönüşmesi söylem ile akış arasındaki açığı açıklayabilir.</w:t>
       </w:r>
     </w:p>
     <w:p>
@@ -939,7 +939,7 @@
       </w:pPr>
       <w:r>
         <w:rPr/>
-        <w:t xml:space="preserve">Çalışma iki soruya yanıt aramaktadır. Birincisi, 2010–2026 döneminde Türkiye ve Çin'in İpek Yolu turizm mirası üzerinde hangi alanlarda iş birliği, hangi alanlarda rekabet yürüttüğü ve bu dağılımın faaliyetin turiste yakınlığına göre ayrışıp ayrışmadığıdır. İkincisi, iki ülkenin iş birliği söylemi ve anlaşmalarının Türkiye'ye Çin uyruklu giriş akışına ne ölçüde yansıdığıdır. Yanıt, iki ülkenin ikili ve tek taraflı resmî belgelerinden oluşan 49 belgelik bir korpusun sistematik doküman analizi ile TÜİK'in giriş serisinin betimsel okumasına dayanmaktadır.</w:t>
+        <w:t xml:space="preserve">Bu olasılık iki soruyu gündeme getirmektedir. Birincisi, 2010–2026 döneminde Türkiye ve Çin'in İpek Yolu turizm mirası üzerinde hangi alanlarda iş birliği, hangi alanlarda rekabet yürüttüğü ve bu dağılımın faaliyetin turiste yakınlığına göre ayrışıp ayrışmadığıdır. İkincisi, iki ülkenin iş birliği söylemi ve anlaşmalarının Türkiye'ye yönelik Çin uyruklu girişlere ne ölçüde yansıdığıdır. Birinci soru, iki ülkenin ikili ve tek taraflı resmî belgelerinden oluşan 49 belgelik bir korpusun sistematik doküman analiziyle; ikinci soru ise TÜİK'in giriş serisinin betimsel okumasıyla yanıtlanmaktadır.</w:t>
       </w:r>
     </w:p>
     <w:p>
@@ -948,7 +948,7 @@
       </w:pPr>
       <w:r>
         <w:rPr/>
-        <w:t xml:space="preserve">Çalışmanın katkısı üç düzeydedir. Kuramsal düzeyde, firma ve destinasyon düzeyinde geliştirilen ayrıştırma ilkesi ilk kez iki devlet arasındaki miras turizmine taşınmaktadır. Kavramsal düzeyde, "paylaşılan İpek Yolu" söyleminin ortaklık ile sahiplik iddiasını aynı anda taşıyabildiği gösterilmekte ve İpek Yolu mirası nötr bir ortak varlık değil, ortaklaşa rekabetin nesnesi olarak önerilmektedir. Uygulama düzeyinde ise Türkiye'nin Çin pazarına yönelik politikasının hangi alanlarda iş birliğinden, hangi alanlarda farklılaşmadan yarar sağlayabileceğine dair bir çerçeve sunulmaktadır. Makalenin bundan sonraki kısmı şöyle düzenlenmiştir: Kuramsal Çerçeve bölümü yazındaki iş birliği uzlaşısını, miras siyasetinin bu uzlaşıya itirazını ve ortaklaşa rekabet çerçevesini kurarak beş önermeyi türetmektedir; Yöntem bölümü korpusu, kodlama şemasını ve güvenirlik sürecini anlatmakta; Bulgular bölümü önermeleri sırasıyla değerlendirmekte; Tartışma ve Sonuç bölümü bulguları kurama ve politikaya bağlamaktadır.</w:t>
+        <w:t xml:space="preserve">Bu yanıtların katkısı üç düzeydedir. Kuramsal düzeyde, firmalar ve destinasyonlar için geliştirilen ayrıştırma ilkesi ilk kez iki devlet arasındaki miras turizmine taşınmaktadır. Kavramsal düzeyde, "paylaşılan İpek Yolu" söyleminin ortaklık ile sahiplik iddiasını aynı anda taşıyabildiği gösterilmekte, bu nedenle İpek Yolu mirası nötr bir ortak varlık olarak değil, ortaklaşa rekabetin nesnesi olarak ele alınmaktadır. Uygulama düzeyinde ise Türkiye'nin Çin pazarına yönelik politikasının hangi alanlarda iş birliğinden, hangi alanlarda farklılaşmadan yarar sağlayabileceği gösterilmektedir. Bu amaçla makale şu sırayı izlemektedir: Kuramsal Çerçeve bölümü literatürdeki iş birliği uzlaşısını, miras siyasetinin bu uzlaşıya itirazını ve iki okumayı birleştiren ortaklaşa rekabet çerçevesini kurarak beş önerme türetmekte; Yöntem bölümü korpusu, kodlama şemasını ve güvenirlik sürecini anlatmakta; Bulgular bölümü önermeleri sırasıyla değerlendirmekte; Tartışma ve Sonuç bölümü ise bulguları kurama ve politikaya bağlamaktadır.</w:t>
       </w:r>
     </w:p>
     <w:p>
@@ -968,7 +968,7 @@
         <w:rPr>
           <w:szCs w:val="22"/>
         </w:rPr>
-        <w:t xml:space="preserve">2.1. Türkiye–Çin Turizm Yazınında Sınanmamış Bir İş Birliği Uzlaşısı</w:t>
+        <w:t xml:space="preserve">2.1. Türkiye–Çin Turizm Literatüründe Sınanmamış Bir İş Birliği Uzlaşısı</w:t>
       </w:r>
     </w:p>
     <w:p>
@@ -977,7 +977,7 @@
       </w:pPr>
       <w:r>
         <w:rPr/>
-        <w:t xml:space="preserve">Türkiye ile Çin arasındaki turizm ilişkisini konu alan yazın, ilişkiyi büyük ölçüde Kuşak ve Yol Girişimi'nin açtığı bir karşılıklı kazanç alanı olarak okumaktadır. Turizm, Çin ile girişim güzergâhındaki ülkeler arasında iş birliğinin başlıca alanlarından biri sayılmış, 2018'de Çin'de düzenlenen Türkiye Turizm Yılı da bu iş birliğinin somut göstergesi olarak ele alınmıştır (Niu ve Li, 2019). Türkçe yazında girişimin Türkiye turizmini olumlu etkileyeceği, Çin'den ve diğer Asya ülkelerinden gelen seyahati kolaylaştıracağı ve yeni pazarlar açacağı beklentisi ağır basmaktadır (İbiş, 2019; Kılıç, 2021; Palidan, 2024). Türk devletleri arasındaki turizmi inceleyen nitel bir çalışma da ülkeler arası ilişkiyi ortak tanıtım ve bir çatı örgüt önerisi etrafında, yalnız iş birliği ekseninde kurmaktadır (Tuna vd., 2022). Bu çerçevede sorunlar ilişkinin kendisine değil, iş birliğinin önündeki engellere bağlanır. Güvenlik istikrarsızlığı, iki ülke arasındaki siyasi anlaşmazlıklar ve Çince hizmet veren rehber eksikliği bu engellerin başında gelir (Akyılmaz, 2021; Niu ve Li, 2019).</w:t>
+        <w:t xml:space="preserve">Türkiye–Çin turizm literatürünün ortak bir başlangıç noktası vardır: iki ülke arasındaki ilişki, Kuşak ve Yol Girişimi'nin açtığı bir kazan-kazan alanı olarak görülür. Bu bakışa göre turizm, girişimin halklar arası boyutunun en somut parçasıdır; 2018'de Çin'de kutlanan Türkiye Turizm Yılı da bunun kanıtı olarak sunulur (Niu ve Li, 2019). Türkçe çalışmalar aynı varsayımdan hareketle girişimin Türkiye'ye daha fazla Çinli turist getireceğini ve yeni pazarlar açacağını öngörür (İbiş, 2019; Kılıç, 2021; Palidan, 2024). İlişki baştan iş birliği olarak tanımlanınca, karşılaşılan sorunlar da ilişkinin doğasına değil, iş birliğinin önündeki engellere bağlanır: güvenlik kaygısı, siyasi anlaşmazlıklar ve Çince rehber eksikliği (Akyılmaz, 2021; Niu ve Li, 2019). Böylece engeller kalktığında iş birliğinin kendiliğinden turist akışına dönüşeceği varsayılmış olur.</w:t>
       </w:r>
     </w:p>
     <w:p>
@@ -986,7 +986,7 @@
       </w:pPr>
       <w:r>
         <w:rPr/>
-        <w:t xml:space="preserve">Uzlaşının zayıf noktası, ampirik bulgudan çok beklentiye dayanmasıdır. Girişimin turizmde doğuracağı sinerjiye dair ampirik çalışma eksikliği bu yazının kendi içinden de dile getirilmiş, ortak kalkınma söyleminin ardında kazanımların taraflar arasında nasıl dağılacağı sorusu açık bırakılmıştır (Kılıç, 2021; Zengin ve Koç, 2021). İki ülke ilişkisinin bütününü inceleyen uluslararası ilişkiler yazını ise daha temkinli bir tablo çizer. Bu yazına göre Çin ile Türkiye arasındaki ilişki 2010'dan bu yana düşük düzeyli bir stratejik iş birliğinde kalmış, taraflar birbirini ekonomik ortak, siyasi rakip ve güvenlik rakibi karışımı olarak algılamıştır (Wang ve Sun, 2024). Kuşak ve Yol ile Orta Koridor birbirinden bağımsız geliştirilmiş iki tasarımdır; aralarındaki sinerji büyük ölçüde ikili ilişkinin niteliğine bağlıdır (Akçay ve Guo, 2023; Chaziza, 2021). Turizm yazını iş birliğini başlangıç varsayımı olarak alırken ilişkinin bütününe bakan yazın aynı ikilide rekabetçi rollerin de bulunduğunu göstermektedir. Bu rollerin turizm ve İpek Yolu mirası alanında nasıl dağıldığı ise sınanmamıştır.</w:t>
+        <w:t xml:space="preserve">Bu varsayımın iki zayıf yanı vardır. Birincisi, ampirik dayanağı yoktur. Girişimin turizmde doğuracağı sinerjinin ölçülmediğini bu literatür de kabul eder; kazanımların taraflar arasında nasıl paylaşılacağı sorusunu da açık bırakır (Kılıç, 2021; Zengin ve Koç, 2021). İkincisi, iki ülke ilişkisinin bütününe bakan uluslararası ilişkiler literatürüyle çelişir. Bu literatüre göre Türkiye ile Çin 2010'dan bu yana düşük düzeyli bir stratejik iş birliğinde kalmış, birbirlerini aynı anda ekonomik ortak, siyasi rakip ve güvenlik rakibi olarak görmüştür (Wang ve Sun, 2024). Bağlantısallıktaki uyum bile koşulludur: Kuşak ve Yol ile Orta Koridor ayrı ayrı tasarlanmıştır ve aralarındaki sinerji ikili ilişkinin niteliğine bağlıdır (Akçay ve Guo, 2023; Chaziza, 2021). İlişkinin geneli hem iş birliği hem rekabet içeriyorsa, turizmin bu karışımın dışında kaldığını varsaymak için bir neden yoktur. Turizm literatürünün sormadığı soru da budur: İpek Yolu turizminde iş birliği hangi alanlarda, rekabet hangi alanlarda yoğunlaşmaktadır? Bu sorunun cevabı, iki ülkenin ortak saydığı mirasın kendisinde aranmalıdır.</w:t>
       </w:r>
     </w:p>
     <w:p>
@@ -1006,7 +1006,7 @@
       </w:pPr>
       <w:r>
         <w:rPr/>
-        <w:t xml:space="preserve">Turizm yazınındaki uzlaşının dayandığı zımni varsayım, İpek Yolu mirasının taraflarca aynı yönde değerlendirilen nötr bir ortak varlık olduğudur. Miras diplomasisi yazını bu varsayımı iki yönden sorgular. Bir yandan miras hükümetler arası iş birliğinin ve kültürel yardımın aracıdır; miras diplomasisi kavramı, miras siyasetini büyük ölçüde çatışma ve uyuşmazlık üzerinden okuyan analizleri dengelemek üzere önerilmiştir (Winter, 2015). Bu çalışmada miras diplomasisi, mirasın devletlerarası ilişkilerde iş birliği ve nüfuz aracı olarak kullanılması anlamına gelir ve ortak miras söylemi ile UNESCO adaylıkları üzerinden izlenir. Öte yandan İpek Yolu, İkinci Dünya Savaşı sonrasında barış, uyum ve kültürlerarası diyalogla özdeşleşen romantik bir imgeye dönüşmüş, bu imge içinde İpek Yolu diplomasisi milliyetçi ve jeopolitik hırsların taşıyıcısı olmuştur (Winter, 2020). Kuşak ve Yol bu iki yüzü tek bir tasarımda birleştirir. İpek Yolları iş birliği ve çok sektörlü bağlantısallık için bir platform sunarken Çin'e "medeniyet devleti" sıfatıyla jeokültürel gücünü seferber etme imkânı da tanımaktadır (Winter, 2021a, 2021b).</w:t>
+        <w:t xml:space="preserve">Mirasa bakıldığında, turizm literatüründeki uzlaşının ikinci bir varsayıma dayandığı görülür: İpek Yolu, iki ülkenin aynı gözle baktığı nötr bir ortak varlık sayılır. Miras diplomasisi literatürü bu varsayımı sarsar, çünkü mirasın iki yüzü olduğunu gösterir. Bir yüzünde miras, hükümetler arası iş birliğinin ve kültürel yardımın aracıdır; miras diplomasisi kavramı da miras siyasetini yalnızca çatışma üzerinden okuyan çalışmaları dengelemek için önerilmiştir (Winter, 2015). Bu çalışmada miras diplomasisi, mirasın devletlerarası ilişkilerde iş birliği ve nüfuz aracı olarak kullanılması anlamına gelir ve ortak miras söylemi ile UNESCO adaylıkları üzerinden izlenir. Öteki yüzünde ise aynı miras ulusal hedeflerin taşıyıcısıdır. İpek Yolu, İkinci Dünya Savaşı'ndan sonra barış ve kültürlerarası diyalogla özdeşleşen romantik bir imgeye dönüşmüş, fakat bu imgenin içinde İpek Yolu diplomasisi milliyetçi ve jeopolitik hırslara hizmet etmiştir (Winter, 2020). Kuşak ve Yol, bu iki yüzü tek bir tasarımda buluşturur: İpek Yolları bir yandan iş birliği ve bağlantısallık için platform sunar, öte yandan Çin'e "medeniyet devleti" olarak jeokültürel gücünü seferber etme imkânı verir (Winter, 2021a, 2021b).</w:t>
       </w:r>
     </w:p>
     <w:p>
@@ -1015,7 +1015,7 @@
       </w:pPr>
       <w:r>
         <w:rPr/>
-        <w:t xml:space="preserve">"Paylaşılan miras" ifadesi bu yazında tek bir anlam taşımamaktadır. UNESCO politikaları mirasın uluslararası ölçekte paylaşılmasını teşvik eder; ancak paylaşılmışlık farklı biçimlerde yorumlanmakta ve aktörler arasında birbirine karşıt sahiplenmelere ve rakip toprak senaryolarına yol açmaktadır (Debarbieux vd., 2023). Türkiye bu çekişmenin dışında değildir. Karagöz'ün 2009'da Yunanistan dahil edilmeden aday gösterilmesi iki ülke arasında anlaşmazlık konusu olmuş (Debarbieux vd., 2023), Mevlana ve Nevruz İran ile yürütülen jeostratejik rekabette hem ulus inşasının hem yumuşak gücün aracına dönüşmüştür (Mozaffari ve Akbar, 2024). Geleneksel Türk okçuluğunun mirasa dönüştürülmesi de çok ölçekli, hegemonik bir anlam kurma süreci olarak okunmuştur (Hisarlıoğlu ve Yanık, 2025). Türk tarafının miras üretimi de bu nedenle rekabetçi okumanın kapsamına girer; rekabet yalnız Çin anlatısına özgü bir özellik olarak varsayılamaz.</w:t>
+        <w:t xml:space="preserve">İki yüzün düğümlendiği yer "paylaşılan miras" ifadesidir. UNESCO mirasın uluslararası ölçekte paylaşılmasını teşvik eder; ancak paylaşmanın ne anlama geldiği her aktör için farklıdır ve bu fark birbirine karşıt sahiplenmelere ve rakip toprak senaryolarına yol açar (Debarbieux vd., 2023). Türkiye bu çekişmenin dışında değil, içindedir. Karagöz'ü 2009'da Yunanistan'ı dahil etmeden aday göstermesi iki ülke arasında anlaşmazlığa yol açmış (Debarbieux vd., 2023); Mevlana ve Nevruz da İran ile süren rekabette hem ulus inşasının hem yumuşak gücün aracına dönüşmüştür (Mozaffari ve Akbar, 2024). Geleneksel Türk okçuluğunun mirasa dönüştürülmesi de aynı mantıkla çok ölçekli ve hegemonik bir anlam kurma süreci olarak okunmuştur (Hisarlıoğlu ve Yanık, 2025). Bu örnekler, rekabetçi miras kullanımının yalnızca Çin'e özgü olmadığını gösterir; Türk tarafının İpek Yolu anlatısı da aynı gözle okunmalıdır.</w:t>
       </w:r>
     </w:p>
     <w:p>
@@ -1024,7 +1024,7 @@
       </w:pPr>
       <w:r>
         <w:rPr/>
-        <w:t xml:space="preserve">Çin'in İpek Yolu mirasını kurma biçimi aynı çatallanmayı daha büyük bir ölçekte gösterir. Çin'in Kazakistan ve Kırgızistan ile ortak UNESCO adaylığını medya metinlerinde inşa edişini inceleyen bir söylem analizi, iş birliğinin miras paylaşılan bir geçmişe bağ olarak çerçevelendiğinde ortaya çıktığını; aynı metinlerin çatışma ve rekabet belleğinden kaçınan Sinomerkezci bir tarihselleştirme taşıdığını ortaya koymaktadır (Sciorati, 2023). UNESCO İpek Yolları projesinde Çin'in batı rotalarına yaptığı vurgu ve Japonya ile Güney Kore'nin buna verdiği tepkiler de ulusötesi bir miras projesinin rekabetçi yönünü görünür kılmıştır (Nakano, 2023). Turizm metinleri bu eğilimin dışında kalmaz. İpek Yolları sıklıkla "Doğu ile Batı" ya da "Çin ile Roma" arasında bir köprü olarak soyutlanmakta, paylaşılan miras retoriği İpek Yolları'nın Çinlileştirilmesiyle birlikte aldatıcı biçimde dışlayıcı hâle gelmektedir (Brown ve O'Brien, 2025). Avrupa'da da İpek Yolu varlıkları bölgesel destinasyon markası kurmanın bileşeni olarak değerlendirilmektedir (Kostopoulou vd., 2021). "Paylaşılan" sıfatı böylece iki damarda farklı anlamlara ayrılır: turizm yazınında ortaklığı, miras siyaseti yazınında sahiplik iddiasını anlatır. Türkiye'yi Asya ile Avrupa arasında bir köprü olarak konumlayan yerli okuma (Palidan, 2024) ile Çin merkezli tarihselleştirme aynı mirası farklı merkezlerden okumaktadır. İki anlamın Türkiye–Çin ikilisinde aynı anda geçerli olup olamayacağı, ancak iş birliği ile rekabeti birlikte kavrayan bir çerçeveyle sorulabilir.</w:t>
+        <w:t xml:space="preserve">Çin cephesinde aynı düğüm daha büyük ölçekte görülür. Çin'in Kazakistan ve Kırgızistan ile hazırladığı ortak UNESCO adaylığına ilişkin medya metinleri, iş birliğini paylaşılan bir geçmiş üzerinden kurarken çatışma ve rekabet belleğini dışarıda bırakan Sinomerkezci bir tarihselleştirme taşımaktadır (Sciorati, 2023). Aynı projede Çin'in batı rotalarına yaptığı vurgu Japonya ve Güney Kore'nin tepkisini çekmiş, böylece ulusötesi bir miras projesinin rekabetçi yüzü görünür hâle gelmiştir (Nakano, 2023). Bu eğilim turizm metinlerine de taşınır. İpek Yolları "Doğu ile Batı" ya da "Çin ile Roma" arasında bir köprü olarak soyutlandıkça, paylaşılan miras retoriği aldatıcı biçimde dışlayıcı bir hâl alır (Brown ve O'Brien, 2025); Avrupa'da bile İpek Yolu varlıkları bölgesel destinasyon markası kurmanın malzemesi olarak kullanılmaktadır (Kostopoulou vd., 2021). Sonuç olarak "paylaşılan" sözcüğü iki farklı anlam taşır: turizm literatüründe ortaklığı, miras siyaseti literatüründe sahiplik iddiasını. Türkiye'yi Asya ile Avrupa arasında bir köprü olarak konumlayan yerli okuma (Palidan, 2024) ile Çin merkezli tarihselleştirme, aynı mirası farklı merkezlerden okumaktadır. İki anlam aynı ikilide birlikte geçerliyse, bu ilişkiyi ne saf iş birliği ne saf rekabet olarak açıklamak mümkündür; ikisini birlikte kavrayan bir çerçeveye ihtiyaç vardır.</w:t>
       </w:r>
     </w:p>
     <w:p>
@@ -1044,7 +1044,7 @@
       </w:pPr>
       <w:r>
         <w:rPr/>
-        <w:t xml:space="preserve">Ortaklaşa rekabet kavramı, yukarıdaki iki okumayı birbirini dışlayan seçenekler olmaktan çıkarır. Kavram, iki firmanın bazı faaliyetlerde iş birliği yaparken diğer faaliyetlerde eşzamanlı olarak rekabet ettiği ikili ve paradoksal ilişkiyi adlandırır (Bengtsson ve Kock, 2000, s. 412). Aynı yazarların daha önceki vaka çalışması, bir firmanın rakipleriyle aynı anda saf rekabet, saf iş birliği, birlikte var olma ve ortaklaşa rekabet içeren farklı ilişkiler yürütebileceğini göstermişti (Bengtsson ve Kock, 1999). Ortaklaşa rekabette iki etkileşim mantığı taraflar arasında değil faaliyetler arasında bölünür, çünkü aynı faaliyette hem rekabet hem iş birliği yürütülemez (Bengtsson ve Kock, 2000, s. 415). Bölünmenin ölçütünü yazarların ikinci önermesi verir: firmalar müşteriye yakın çıktı faaliyetlerinde rekabet eder, müşteriden uzak girdi faaliyetlerinde iş birliği yapar (Bengtsson ve Kock, 2000, s. 421). Bu önerme, bu çalışmada "ayrıştırma ilkesi" olarak anılmaktadır; adlandırma yazarlara değil bu çalışmaya aittir.</w:t>
+        <w:t xml:space="preserve">Bu çerçeveyi ortaklaşa rekabet kavramı sağlar, çünkü kavram iş birliği ile rekabeti birbirinin alternatifi olarak değil, aynı ilişkinin iki parçası olarak ele alır. Ortaklaşa rekabet, iki firmanın bazı faaliyetlerde iş birliği yaparken diğer faaliyetlerde eşzamanlı olarak rekabet ettiği ikili ve paradoksal ilişkidir (Bengtsson ve Kock, 2000, s. 412). Bir firma rakipleriyle aynı anda saf rekabet, saf iş birliği, birlikte var olma ve ortaklaşa rekabet ilişkileri yürütebileceği için (Bengtsson ve Kock, 1999), belirleyici olan ilişkinin adı değil, iki mantığın nasıl bölündüğüdür. Yazarlara göre bu bölünme taraflar arasında değil faaliyetler arasında gerçekleşir, çünkü aynı faaliyette hem rekabet hem iş birliği yürütülemez (Bengtsson ve Kock, 2000, s. 415). Hangi faaliyetin hangi tarafa düşeceğini ise müşteriye yakınlık belirler: firmalar müşteriye yakın çıktı faaliyetlerinde rekabet eder, müşteriden uzak girdi faaliyetlerinde iş birliği yapar (Bengtsson ve Kock, 2000, s. 421). Bu önerme bu çalışmada "ayrıştırma ilkesi" olarak anılmaktadır; adlandırma yazarlara değil bu çalışmaya aittir.</w:t>
       </w:r>
     </w:p>
     <w:p>
@@ -1053,7 +1053,7 @@
       </w:pPr>
       <w:r>
         <w:rPr/>
-        <w:t xml:space="preserve">Ayrıştırma ilkesinin neyi ayırdığı, değer oluşturma ile değer yakalama ayrımıyla açıklanabilir. Değer ağı yaklaşımında müşteriler, tedarikçiler, rakipler ve tamamlayıcılar aynı ağın parçalarıdır; aktörler birlikte daha büyük bir pazar oluşturur, ardından bu pazardan pay almak için rekabet eder (Brandenburger ve Nalebuff, 1996). Sonraki kuramsal çalışmalar bu sürecin kazan-kazanla sonuçlanmak zorunda olmadığına dikkat çekmektedir. Ortaklaşa rekabetin sonucu tüm tarafların birlikte değer oluşturması olabileceği gibi, tek bir tarafın değer oluşturması ya da değer yıkımı da olabilir (Gnyawali ve Ryan Charleton, 2018); değer oluşturma ve yakalama ihtiyacı aktörlerin ortaklaşa rekabetçi davranışını yönlendirir (Chou ve Zolkiewski, 2018). Bu çalışmada değer oluşturma, tarafların ortak pazarı büyütmeye yönelik eylemleri (ortak tanıtım, vize ve uçuş kolaylığı, altyapı uyumu) olarak; değer yakalama ise oluşturulan değerden pay alma mücadelesi (rota ya da merkez konumu, marka sahipliği, gelir ve aracı denetimi) olarak tanımlanmaktadır. İlk küme iki ülkeyi aynı yöne çekerken ikinci küme aynı kaynağı farklı yönlere çeker.</w:t>
+        <w:t xml:space="preserve">Ayrıştırma ilkesinin neden işlediği, iki faaliyet türünün farklı bir şey ürettiği hatırlandığında anlaşılır. Değer ağı yaklaşımında rakipler ve tamamlayıcılar önce birlikte daha büyük bir pazar oluşturur, sonra bu pazardan pay almak için rekabet eder (Brandenburger ve Nalebuff, 1996). Müşteriden uzak faaliyetler çoğunlukla pazarı büyütür, müşteriye yakın faaliyetler ise payı belirler; bu yüzden iş birliği birinci türde, rekabet ikinci türde yoğunlaşır. Ancak bu süreç herkesin kazanacağını garanti etmez. Ortaklaşa rekabet tüm tarafların birlikte değer oluşturmasıyla sonuçlanabileceği gibi, yalnızca bir tarafın kazanmasıyla ya da değer yıkımıyla da sonuçlanabilir (Gnyawali ve Ryan Charleton, 2018); aktörlerin davranışını da değer oluşturma ve yakalama ihtiyacı birlikte yönlendirir (Chou ve Zolkiewski, 2018). Bu nokta Türkiye–Çin ilişkisi için önemlidir: "kazan-kazan" dili ortaklaşa rekabetin kaçınılmaz sonucu değil, olası sonuçlarından yalnızca biridir. Bu çalışmada değer oluşturma, iki tarafın ortak pazarı büyütmeye yönelik eylemleri (ortak tanıtım, vize ve uçuş kolaylığı, altyapı uyumu); değer yakalama ise oluşturulan değerden pay alma mücadelesi (rota ya da merkez konumu, marka sahipliği, gelir ve aracı denetimi) olarak tanımlanmaktadır.</w:t>
       </w:r>
     </w:p>
     <w:p>
@@ -1062,7 +1062,7 @@
       </w:pPr>
       <w:r>
         <w:rPr/>
-        <w:t xml:space="preserve">Turizm yazını kavramı firmadan destinasyona taşımıştır. Destinasyon ağlarındaki yüksek karşılıklı bağımlılık ve tamamlayıcılık, ortaklaşa rekabeti destinasyonun örgütlenme biçimi hâline getirmektedir (Chim-Miki ve Batista-Canino, 2017a); tek bir destinasyonda paydaşlar arasında iş birliği, rekabet ve ortaklaşa rekabet ilişkilerinin bir arada bulunduğu da gösterilmiştir (Wang ve Krakover, 2008). Çok ülkeli marka çalışmaları ayrıştırma ilkesinin turizmdeki karşılığına işaret eder. ASEAN örneğinde destinasyonun ortak ve tutarlı bir konumlandırması önerilirken ulusların rekabetçi konumlandırmasının korunması gerektiği vurgulanmış (Sirisuthikul, 2018), Büyük Körfez Bölgesi'nde de olası ortak marka içinde üyelerin özgünlüğünü koruyan bir yapı önerilmiştir (Kirillova vd., 2020). İki örnekte de iş birliği bölge markasında, rekabet ulusal ya da kentsel konumlandırmada yoğunlaşmaktadır. Ne var ki bu yazın da destinasyon içindeki ağlarda yoğunlaşmış, kavramın çok boyutlu ve göreli bir yapı olarak ele alınması bir araştırma gündemi olarak kalmıştır (Chim-Miki ve Batista-Canino, 2017a).</w:t>
+        <w:t xml:space="preserve">Bu ayrımın turizme de uygulanabildiğini destinasyon çalışmaları göstermektedir. Destinasyonlar yüksek karşılıklı bağımlılık ve tamamlayıcılık içinde çalıştığı için ortaklaşa rekabet turizmde istisna değil, olağan örgütlenme biçimidir (Chim-Miki ve Batista-Canino, 2017a); tek bir destinasyonun paydaşları arasında bile iş birliği, rekabet ve ortaklaşa rekabet bir arada bulunur (Wang ve Krakover, 2008). Ülkeler arasındaki ortak markalarda ayrıştırma ilkesinin izleri daha da belirgindir. ASEAN için önerilen çerçeve bölgenin ortak ve tutarlı bir konumlandırmasını isterken ulusların rekabetçi konumlandırmasını korumaktadır (Sirisuthikul, 2018); Büyük Körfez Bölgesi için önerilen ortak marka da üye kentlerin özgünlüğünü koruyacak biçimde kurulmuştur (Kirillova vd., 2020). Her iki örnekte de iş birliği turistten uzak olan bölge markasında, rekabet ise turistin seçim yaptığı ulusal ya da kentsel konumlandırmada toplanmaktadır. Ne var ki bu çalışmalar destinasyon içinde ya da bölgesel marka ölçeğinde kalmış, kavramın çok boyutlu ve göreli bir yapı olarak ele alınması hâlâ bir araştırma gündemi olarak durmaktadır (Chim-Miki ve Batista-Canino, 2017a).</w:t>
       </w:r>
     </w:p>
     <w:p>
@@ -1071,7 +1071,7 @@
       </w:pPr>
       <w:r>
         <w:rPr/>
-        <w:t xml:space="preserve">İpek Yolu'na en yakın uygulama, destinasyonlar arası ortaklaşa rekabeti ele alan ve UNWTO İpek Yolu Programı'nı bu türün en büyük girişimi olarak betimleyen çalışmadır (Redi ve Pulido Fernández, 2018). Bu çerçeve çok taraflı bir programın yönetimine bakar; iki devletin aynı miras üzerinde hangi faaliyette birleşip hangisinde ayrıştığı tasarımı gereği kapsamının dışında kalır. Devletlerarası düzeyde kavram ABD ile Çin arasındaki büyük güç ilişkilerine uygulanmış ve ortaklaşa rekabetin çözülüp stratejik rekabete dönüşmesine dair hipotezler önerilmiştir (Wisniewski, 2025). Türkiye–Çin ilişkisini uyumlu, rekabetçi ve çatışan rollerin katmanları olarak okuyan "karmaşık rol" yaklaşımı (Wang ve Sun, 2024) ile bu büyük güç uygulaması ilişkinin bütününü açıklar; iş birliğinin ve rekabetin hangi faaliyette toplandığını sormaz. Güç asimetrisi bu soruyu daha da önemli kılar. Fransa'daki 470 destinasyon üzerinde yapılan bir çalışmada baskın statü ile ortaklaşa rekabet eğilimi arasında negatif ilişki bulunmuştur (Norheim-Hansen vd., 2026). Firma düzeyindeki vakalar ise güçlü bir aktörün zayıf rakibiyle iş birliği kararının ağdaki tüm konumlar ve bunlar arasındaki bağlantılar dikkate alınarak verildiğini göstermektedir (Bengtsson ve Kock, 2000, s. 422). Büyük güç ile orta güç arasındaki bir ikilide ortaklaşa rekabetin hangi biçimi alacağı bu iki bulgudan kestirilemez; arenalara göre ayrı ayrı gözlenmesi gerekir.</w:t>
+        <w:t xml:space="preserve">Devletler arasındaki ilişkiye gelindiğinde bu boşluk daha görünür hâle gelir. İpek Yolu'na en yakın çalışma, destinasyonlar arası ortaklaşa rekabeti ele alır ve UNWTO İpek Yolu Programı'nı bu türün en büyük girişimi olarak betimler (Redi ve Pulido Fernández, 2018); ancak çok taraflı bir programın yönetimine baktığı için iki devletin aynı mirasta hangi faaliyette birleşip hangisinde ayrıştığını sormaz. Kavramı ABD ile Çin arasındaki büyük güç ilişkilerine uygulayan çalışma ortaklaşa rekabetin stratejik rekabete nasıl dönüşebileceğine dair hipotezler önerir (Wisniewski, 2025); Türkiye–Çin ilişkisini uyumlu, rekabetçi ve çatışan rollerin katmanları olarak okuyan "karmaşık rol" yaklaşımı da ilişkiyi bir bütün olarak açıklar (Wang ve Sun, 2024). Bu iki çalışma ilişkinin genel karakterini anlatır, fakat iş birliğinin ve rekabetin hangi faaliyette toplandığını sormaz. Oysa bu soru, taraflar arasında güç farkı olduğunda daha da önem kazanır. Fransa'daki 470 destinasyon üzerinde yapılan bir çalışmada baskın statüdeki destinasyonların ortaklaşa rekabete daha az yöneldiği bulunmuştur (Norheim-Hansen vd., 2026). Firma düzeyindeki vakalar ise güçlü bir aktörün zayıf rakibiyle yine de iş birliği yapabildiğini, çünkü bu kararın ağdaki tüm konumlar dikkate alınarak verildiğini göstermektedir (Bengtsson ve Kock, 2000, s. 422). Bu iki bulgu farklı yönleri işaret ettiğinden, büyük bir güç ile orta büyüklükte bir gücün ilişkisinde ortaklaşa rekabetin hangi biçimi alacağı önceden kestirilemez; alan alan gözlenmesi gerekir.</w:t>
       </w:r>
     </w:p>
     <w:p>
@@ -1080,7 +1080,7 @@
       </w:pPr>
       <w:r>
         <w:rPr/>
-        <w:t xml:space="preserve">Ayrıştırma ilkesinin devletlerarası miras turizmine taşınması iki sınır koşulu getirir. Birincisi rakip tanımıdır. Bengtsson ve Kock (2000, s. 415) rakipleri aynı ürünü üreten ve pazarlayan aktörler olarak dar tanımlar ve bu tanımı Brandenburger ile Nalebuff'un geniş tanımından bilinçli olarak ayırır. Türkiye ve Çin bu tanıma İpek Yolu destinasyonu ve anlatı sahibi olarak uymaktadır; Çin'den Türkiye'ye yönelen turist akışında ise Çin kaynak pazar konumundadır. Bu nedenle bu çalışmada rakiplik, İpek Yolu mirası üzerinden uluslararası turiste ve anlatı otoritesine yönelik konumlanma düzleminde tanımlanmaktadır. İkincisi müşteri kavramıdır: firma bağlamındaki müşteri burada turisttir. Bağlantısallık faaliyetleri turistten en uzak, değer yakalama faaliyetleri turiste en yakın konumdadır; bu eşleme özgün çalışmaya değil bu çalışmanın uyarlamasına aittir. İlkenin en güçlü rakip açıklaması da aynı kaynaktan gelir. Fin süt sektöründe iş birliği ile rekabet müşteriye yakınlığa göre değil, ürün ve pazar alanlarına göre ayrışmıştır (Bengtsson ve Kock, 2000, s. 420). Türkiye ile Çin arasında da iş birliği ve rekabet arenalara göre değil, coğrafyalara göre (örneğin Orta Asya rotası ya da üçüncü ülke turistleri) ayrışıyor olabilir. Bu olasılık, Yöntem bölümünde tanımlanan olumsuz vaka analiziyle ayrıca izlenmektedir.</w:t>
+        <w:t xml:space="preserve">Ayrıştırma ilkesini devletler arasındaki miras turizmine taşımak iki uyarlama gerektirir. İlki rakip tanımıyla ilgilidir. Bengtsson ve Kock (2000, s. 415) rakibi aynı ürünü üreten ve pazarlayan aktör olarak dar tanımlar. Türkiye ve Çin, İpek Yolu destinasyonu ve bu mirasın anlatıcısı olarak bu tanıma uyar; buna karşın Çin'den Türkiye'ye gelen turist akışında Çin bir rakip değil, kaynak pazardır. Bu yüzden bu çalışmada rakiplik, İpek Yolu mirası üzerinden uluslararası turist ve anlatı otoritesi için yürütülen konumlanma düzleminde ele alınmaktadır. İkinci uyarlama müşteriyle ilgilidir: firma bağlamındaki müşteri burada turisttir. Buna göre bağlantısallık faaliyetleri turistten en uzak, değer yakalama faaliyetleri turiste en yakın konumdadır; bu sıralama özgün çalışmaya değil bu çalışmanın uyarlamasına aittir. Uyarlamanın riski de aynı kaynakta görülür. Fin süt sektöründe iş birliği ile rekabet müşteriye yakınlığa göre değil, ürün ve pazar alanlarına göre ayrışmıştır (Bengtsson ve Kock, 2000, s. 420). Türkiye ile Çin arasında da ayrışma alanlara göre değil, coğrafyalara göre (örneğin Orta Asya rotası ya da üçüncü ülke turistleri) gerçekleşiyor olabilir. Bu rakip açıklama, Yöntem bölümünde tanımlanan olumsuz vaka analiziyle izlenmektedir.</w:t>
       </w:r>
     </w:p>
     <w:p>
@@ -1089,7 +1089,7 @@
       </w:pPr>
       <w:r>
         <w:rPr/>
-        <w:t xml:space="preserve">Bu çerçevede ortak İpek Yolu mirasının iki ayrı işlevi olabileceği öngörülmektedir. Ortak geçmiş söylemi tarafları aynı pazarı birlikte büyütmeye çağırır; ikili resmî metinlerde iki ülkeyi birlikte özne ve fayda sahibi yapan dil bu işlevin beklenen izidir (Niu ve Li, 2019; Sciorati, 2023).</w:t>
+        <w:t xml:space="preserve">Buraya kadarki tartışma, ortak İpek Yolu mirasının iki işlevi olabileceğini düşündürmektedir. İlk işlev pazarı büyütmektir: ortak geçmiş söylemi iki ülkeyi aynı hedef etrafında buluşturur ve bu işlevin izi, ikili resmî metinlerde iki ülkeyi birlikte özne ve fayda sahibi yapan dilde görülmelidir (Niu ve Li, 2019; Sciorati, 2023).</w:t>
       </w:r>
     </w:p>
     <w:p>
@@ -1113,7 +1113,7 @@
       </w:pPr>
       <w:r>
         <w:rPr/>
-        <w:t xml:space="preserve">Aynı miras rota merkezi, başlangıç noktası ya da köprü iddialarına konu olduğunda pay alma mücadelesinin nesnesine dönüşür. Paylaşılan mirasın karşıt sahiplenmeler ürettiğini gösteren miras siyaseti yazını (Brown ve O'Brien, 2025; Debarbieux vd., 2023), bu işlevin özellikle tek taraflı tanıtım ve politika anlatılarında görünür olmasını beklemeyi gerektirir.</w:t>
+        <w:t xml:space="preserve">İkinci işlev payı belirlemektir. Aynı miras rotanın merkezi, başlangıç noktası ya da köprüsü olma iddialarına konu olduğunda pay alma mücadelesinin nesnesine dönüşür. Paylaşılan mirasın karşıt sahiplenmeler ürettiği göz önüne alındığında (Brown ve O'Brien, 2025; Debarbieux vd., 2023), bu işlevin en çok tek taraflı tanıtım ve politika anlatılarında görünmesi beklenir.</w:t>
       </w:r>
     </w:p>
     <w:p>
@@ -1137,7 +1137,7 @@
       </w:pPr>
       <w:r>
         <w:rPr/>
-        <w:t xml:space="preserve">Ayrıştırma ilkesine göre bu iki işlevin ağırlığı faaliyetin müşteriye, burada turiste yakınlığına göre değişmelidir. Ulaşım koridorlarının uyumlaştırılması turistle doğrudan temas etmeyen bir girdi faaliyetidir; tanıtım, anlatı ve turist harcamasının paylaşımı ise turistle temas eden çıktı faaliyetlerine yakındır (Bengtsson ve Kock, 2000).</w:t>
+        <w:t xml:space="preserve">İki işlev aynı anda var olabiliyorsa, hangisinin ağır basacağını ayrıştırma ilkesi belirler. Ulaşım koridorlarının uyumlaştırılması turistle doğrudan temas etmeyen bir girdi faaliyetidir; tanıtım, anlatı ve turist harcamasının paylaşımı ise turistle temas eden çıktı faaliyetlerine yakındır (Bengtsson ve Kock, 2000). Dolayısıyla faaliyet turiste yaklaştıkça iş birliğinin yerini rekabetin alması beklenir.</w:t>
       </w:r>
     </w:p>
     <w:p>
@@ -1172,7 +1172,7 @@
       </w:pPr>
       <w:r>
         <w:rPr/>
-        <w:t xml:space="preserve">İş birliği söyleminin turist akışına dönüşeceği, Türkiye–Çin yazınının açık beklentisidir. Kuşak ve Yol'un kültürel alışverişi teşvik etme, turist akışlarını artırma ve turizm altyapısına yatırım yapma vurgusu taşıdığı belirtilmekte (Palidan, 2024) ve girişimin Türkiye'ye yönelik seyahati kolaylaştıracağı öngörülmektedir (İbiş, 2019). Girişimin İpek Yolları boyunca turizme ve mirasa etkisini derleyen sistematik bir inceleme yeni ürün ve destinasyon geliştirme potansiyelini doğrulamakla birlikte finansal dengesizlikleri ve faydalara eşitsiz erişimi önemli sorunlar arasında saymaktadır (Dayoub vd., 2024). Altyapı kanıtı beklentiyle uyuşmamaktadır. Hazar Ötesi Uluslararası Taşımacılık Güzergâhı (Orta Koridor) 2025'te yaklaşık 5,2 milyon ton yük taşımış, ancak ana ekseninde tarifeli uluslararası yolcu seferi sunmamıştır; Bakü–Tiflis–Kars demiryolu 2017'den bu yana Türkiye'yi Azerbaycan'a bağladığı hâlde kayda değer bir uluslararası turist seferi taşımamaktadır (Farmanov vd., 2026). Bağlantısallık alanındaki iş birliği, en azından demiryolu ekseninde, yük kapasitesi üretmiş, yolcu üretmemiştir. Ayrıştırma ilkesinin öngördüğü gibi iş birliği turistten uzak arenada yoğunlaşıyorsa, iş birliğinin akışa etkisi ancak turiste yakın arenalara aktarıldığı ölçüde beklenebilir.</w:t>
+        <w:t xml:space="preserve">Ö3 doğruysa, Türkiye ile Çin'in en güçlü iş birliği turistten en uzak alanda, yani bağlantısallıkta toplanıyor demektir. Bu durum Giriş'te belirtilen söylem ile akış arasındaki açığı açıklayabilir, çünkü turistten uzak bir alandaki iş birliğinin turiste ulaşması kendiliğinden gerçekleşmez. Türkiye–Çin literatürü ise tersini bekler: Kuşak ve Yol'un kültürel alışverişi teşvik edeceği, turist akışlarını artıracağı ve turizm altyapısına yatırım getireceği öngörülür (İbiş, 2019; Palidan, 2024). Girişimin İpek Yolları boyunca turizme ve mirasa etkisini derleyen sistematik bir inceleme bu potansiyeli kabul etmekle birlikte, finansal dengesizlikleri ve faydalara eşitsiz erişimi temel sorunlar arasında sayar (Dayoub vd., 2024). Altyapı verisi de beklentinin gerçekleşmediğini gösterir. Orta Koridor olarak da bilinen Hazar Ötesi Uluslararası Taşımacılık Güzergâhı 2025'te yaklaşık 5,2 milyon ton yük taşımış, ancak ana ekseninde tarifeli uluslararası yolcu seferi sunmamıştır; Bakü–Tiflis–Kars demiryolu da 2017'den bu yana Türkiye'yi Azerbaycan'a bağladığı hâlde kayda değer bir uluslararası turist seferi taşımamaktadır (Farmanov vd., 2026). Kısacası bağlantısallık alanındaki iş birliği, en azından demiryolu ekseninde, yük kapasitesi üretmiş ama yolcu üretmemiştir. Bu tablo iş birliğinin akış üzerindeki etkisini ortadan kaldırmaz, yalnızca sınırlar: iş birliği turisti ancak tanıtım ve vize gibi turiste yakın kanallara ulaştığı ölçüde etkileyebilir. Beklenen yön yine olumludur.</w:t>
       </w:r>
     </w:p>
     <w:p>
@@ -1196,7 +1196,7 @@
       </w:pPr>
       <w:r>
         <w:rPr/>
-        <w:t xml:space="preserve">Akışın neden sınırlı kaldığına dair yazında iki açıklama yan yana durmaktadır ve bu açıklamalar aynı mekanizmaya indirgenemez. Birincisi uzaklıktır. Kuşak ve Yol ülkeleri üzerine kurulan mekânsal panel modellerinde Çin ile destinasyon arasındaki coğrafi ve kültürel uzaklık Çinli turist akışını olumsuz etkilemektedir (Deng ve Hu, 2019). Bu açıklama düşük akışı ilişkinin dışında kalan bir sabite bağlar. İkincisi yönlendirmedir. Çin'de yurt dışı turizm siyasetle iç içedir ve hükümetin dış turizmi siyasi gündemiyle uyumlu biçimde şekillendirdiği görülmektedir (Tse, 2013). Kazakistan'daki paydaşlar Kuşak ve Yol'un ekonomik değerini desteklerken yerel özerkliği ve ülkenin özgün destinasyon markasını zayıflatabileceğinden kaygı duymaktadır (Daye vd., 2020). Türkiye'ye gelen Çinli turistlerin büyük çoğunluğunun seyahatini acenteler aracılığıyla düzenlemesi (İbiş ve Batman, 2018) ve Çinli acentelerin bölge tur içeriğine dair belirgin talepleri (Akyılmaz, 2021) değerin bir kısmının aracılarda kaldığı bir yapıya işaret eder; bu yapıyı ölçen bir çalışma ise bulunmamaktadır. Türkiye'nin jeopolitik yönelişinin Avrupa ve NATO'dan Rusya ve Çin ile güçlenen ilişkilere doğru kaydığının gözlendiği bir dönemde (Cihangir vd., 2022) Çin uyruklu girişlerin sınırlı kalması, uzaklık açıklamasını tek başına yetersiz bırakmaktadır. Bu çalışma yönlendirme ve rekabet açıklamasını önermekte, uzaklığı ise rakip açıklama olarak korumaktadır.</w:t>
+        <w:t xml:space="preserve">Etkinin neden sınırlı kaldığına dair literatürde iki açıklama vardır ve bunlar aynı mekanizmaya indirgenemez. Birinci açıklama uzaklıktır. Kuşak ve Yol ülkeleri üzerine kurulan mekânsal panel modellerinde, Çin ile destinasyon arasındaki coğrafi ve kültürel uzaklık Çinli turist akışını azaltmaktadır (Deng ve Hu, 2019). Bu açıklamaya göre düşük akış, ilişkinin niteliğinden bağımsız ve değişmeyen bir koşulun sonucudur. Ne var ki Türkiye'nin dış politikası Avrupa ve NATO'dan Rusya ve Çin ile güçlenen ilişkilere doğru kaydığı dönemde bile (Cihangir vd., 2022) Çin uyruklu girişlerin payı düşük kalmıştır; bu da uzaklığın tek başına yeterli bir açıklama olmadığını düşündürür. İkinci açıklama yönlendirmedir. Çin'de yurt dışı turizm siyasetle iç içedir ve hükümetin dış turizmi siyasi gündemiyle uyumlu biçimde şekillendirdiği görülmektedir (Tse, 2013). Böyle bir yönlendirmenin ev sahibi ülkede nasıl algılandığını Kazakistan örneği gösterir: yerel paydaşlar Kuşak ve Yol'un ekonomik değerini desteklerken yerel özerkliği ve ülkenin özgün destinasyon markasını zayıflatabileceğinden kaygı duymaktadır (Daye vd., 2020). Türkiye'de de benzer bir yapının izleri vardır. Türkiye'ye gelen Çinli turistlerin büyük çoğunluğunun seyahatini acenteler aracılığıyla düzenlemesi (İbiş ve Batman, 2018) ve Çinli acentelerin tur içeriğine dair belirgin talepleri (Akyılmaz, 2021), değerin bir kısmının aracılarda kaldığına işaret eder; ne var ki bu payı ölçen bir çalışma bulunmamaktadır. Bu çalışma ikinci açıklamayı, yani rekabetin ve yönlendirmenin rolünü öne çıkarmakta, uzaklığı ise rakip açıklama olarak korumaktadır.</w:t>
       </w:r>
     </w:p>
     <w:p>
@@ -1220,7 +1220,7 @@
       </w:pPr>
       <w:r>
         <w:rPr/>
-        <w:t xml:space="preserve">Bu dört alt bölümün kesiştiği yerde bu çalışmanın konumu belirmektedir. Türkiye–Çin turizm yazını ilişkiyi kazan-kazan bir iş birliği olarak okurken, miras siyaseti yazını paylaşılan İpek Yolu'nun aynı zamanda bir sahiplik çekişmesi olduğunu göstermektedir; ortaklaşa rekabet kuramı ise bu iki okumayı faaliyet düzeyinde birleştirebilecek bir mekanizma sunmakta, fakat bu mekanizma devletlerarası miras turizminde sınanmamış bulunmaktadır. Bu çalışma, ayrıştırma ilkesini Türkiye–Çin İpek Yolu turizmine taşıyarak İpek Yolu mirasının nötr bir ortak varlık değil, ortaklaşa rekabetin nesnesi olduğunu ileri sürmekte ve kazan-kazan okumasının hangi arenalarda geçerli olduğunu, hangilerinde geçersizleştiğini sınamaktadır. Önermeler arasındaki ilişkiler Şekil 1'de gösterilmektedir.</w:t>
+        <w:t xml:space="preserve">Bu dört alt bölüm birlikte okunduğunda çalışmanın konumu netleşir. Türkiye–Çin turizm literatürü ilişkiyi kazan-kazan bir iş birliği olarak okurken, miras siyaseti literatürü paylaşılan İpek Yolu'nun aynı zamanda bir sahiplik çekişmesi olduğunu göstermektedir. Ortaklaşa rekabet kuramı bu iki okumayı faaliyet düzeyinde birleştirebilecek bir mekanizma sunar, ancak bu mekanizma iki devlet arasındaki miras turizminde henüz sınanmamıştır. Bu çalışma, ayrıştırma ilkesini Türkiye–Çin İpek Yolu turizmine taşıyarak İpek Yolu mirasının nötr bir ortak varlık değil, ortaklaşa rekabetin nesnesi olduğunu ileri sürmekte ve kazan-kazan okumasının hangi alanlarda geçerli olduğunu, hangilerinde geçerliliğini yitirdiğini sınamaktadır. Önermeler arasındaki ilişkiler Şekil 1'de gösterilmektedir.</w:t>
       </w:r>
     </w:p>
     <w:p>
@@ -1299,7 +1299,7 @@
       </w:pPr>
       <w:r>
         <w:rPr/>
-        <w:t xml:space="preserve">Çalışma, nitel araştırma geleneği içinde tek durumlu, iç içe birimli bir örnek olay olarak tasarlanmıştır. Durum Türkiye–Çin ikilisidir; analiz birimleri ise İpek Yolu turizmi etrafında tanımlanan dört alandır: bağlantısallık, turist akışı, anlatı ve değer yakalama. Veri, sistematik doküman analizi ile çözümlenmiştir (Bowen, 2009). Doküman analizi, resmî belgelerin hem iş birliği hem de rekabet konumlanmasını görünür kılan söylem kaynakları olduğu varsayımına dayanır; bu nedenle analiz, belgelerin ne söylediğini olduğu kadar neyi söylemediğini de izler.</w:t>
+        <w:t xml:space="preserve">Araştırma soruları, iş birliği ile rekabetin hangi alanda ve neden ayrıştığını açıklayan bir mekanizma aramaktadır. Bu nedenle çalışmada kritik realist bir tutum benimsenmiştir: belgelerdeki söylemsel izler mekanizmanın kendisi olarak değil, onun gözlemlenebilir göstergeleri olarak ele alınmıştır. Sınanan mekanizma, Bengtsson ve Kock'un (2000) önerdiği ve bu çalışmada ayrıştırma ilkesi olarak adlandırılan ilkedir; buna göre iş birliği müşteriden uzak, rekabet ise müşteriye yakın faaliyetlerde yoğunlaşır. Mekanizmayı tek bir ilişkinin farklı alanlarında karşılaştırabilmek için tek durumlu, iç içe birimli bir örnek olay deseni seçilmiştir. Durum Türkiye–Çin ikilisi, iç içe birimler ise İpek Yolu turizmi etrafında tanımlanan dört alandır: bağlantısallık, turist akışı, anlatı ve değer yakalama.</w:t>
       </w:r>
     </w:p>
     <w:p>
@@ -1308,7 +1308,7 @@
       </w:pPr>
       <w:r>
         <w:rPr/>
-        <w:t xml:space="preserve">Epistemolojik olarak kritik realist bir tutum benimsenmiştir. Bu tutum, iş birliği ile rekabetin hangi alanda ve neden ayrıştığını açıklayan bir mekanizma arar; belgelerdeki söylemsel izler bu mekanizmanın kendisi değil, gözlemlenebilir göstergeleri olarak ele alınır. Mekanizma olarak Bengtsson ve Kock'un (2000) ayrıştırma ilkesi sınanmıştır: iş birliğinin müşteriden uzak, rekabetin müşteriye yakın faaliyetlerde yoğunlaşması.</w:t>
+        <w:t xml:space="preserve">Bu alanlardaki iş birliği ve rekabet izlerini taşıyan başlıca kaynak, iki devletin resmî belgeleridir. Bu yüzden veri sistematik doküman analiziyle çözümlenmiştir (Bowen, 2009). Doküman analizi, resmî belgelerin iki ülkenin birbirine karşı nasıl konumlandığını görünür kıldığı varsayımına dayanır; analiz de bu nedenle belgelerin ne söylediğini olduğu kadar neyi söylemediğini, örneğin hangi ortağı saymadığını da izler.</w:t>
       </w:r>
     </w:p>
     <w:p>
@@ -1328,7 +1328,7 @@
       </w:pPr>
       <w:r>
         <w:rPr/>
-        <w:t xml:space="preserve">Korpus iki alt kümeden oluşur. Birinci küme (Korpus A), iki ülke arasındaki ikili ve ortak resmî belgeleri içerir: ortak bildiriler, mutabakat zaptları, devlet ve hükümet düzeyindeki görüşme özetleri, büyükelçilik konuşmaları ve ortak turizm ya da kültür yılı metinleri. İkinci küme (Korpus B), iki ülkenin birbirinden bağımsız olarak ürettiği İpek Yolu tanıtım ve politika anlatılarını içerir. Bu ayrım bilinçli bir tasarım kararıdır: ortak belgeler doğaları gereği iş birliği diliyle yazıldığından rekabetin izleri büyük ölçüde tek taraflı anlatılarda aranmalıdır.</w:t>
+        <w:t xml:space="preserve">Belgelerin hepsi aynı türden iz taşımaz. İki ülkenin birlikte imzaladığı ya da birbirine hitap ettiği belgeler doğası gereği iş birliği diliyle yazılır; rekabetin izleri ise daha çok her ülkenin kendi kamuoyuna ve turistine yönelik tek taraflı anlatılarında görünür. Bu nedenle korpus iki alt kümeye ayrılmıştır. Korpus A, iki ülke arasındaki ikili ve ortak resmî belgeleri içerir: ortak bildiriler, mutabakat zaptları, devlet ve hükümet düzeyindeki görüşme özetleri, büyükelçilik konuşmaları ve turizm ya da kültür yılı metinleri. Korpus B ise iki ülkenin birbirinden bağımsız olarak ürettiği İpek Yolu tanıtım ve politika anlatılarından oluşur.</w:t>
       </w:r>
     </w:p>
     <w:p>
@@ -1337,7 +1337,7 @@
       </w:pPr>
       <w:r>
         <w:rPr/>
-        <w:t xml:space="preserve">Belgeler ölçüt örneklemesiyle seçilmiştir. Dahil etme ölçütleri şunlardır: (i) 1 Ocak 2010 ile 30 Eylül 2026 arasında yayımlanmış olmak; (ii) resmî bir kurum ya da resmî yayın organı tarafından yayımlanmış olmak; (iii) turizm, İpek Yolu mirası, halklar arası değişim ya da bağlantısallıktan söz etmek; (iv) tam metnine erişilebilmek. Köşe yazıları ve düşünce kuruluşu yorumları bağlam bilgisi için okunmuş, ancak kodlanmamıştır. Sincan Uygur Özerk Bölgesi'ne ilişkin siyasi tartışmaya odaklanan metinler kapsam dışı bırakılmıştır.</w:t>
+        <w:t xml:space="preserve">Her iki kümedeki belgeler ölçüt örneklemesiyle seçilmiştir. Bir belgenin korpusa girmesi için (i) 1 Ocak 2010 ile 30 Eylül 2026 arasında yayımlanmış olması, (ii) resmî bir kurum ya da resmî yayın organı tarafından yayımlanmış olması, (iii) turizm, İpek Yolu mirası, halklar arası değişim ya da bağlantısallıktan söz etmesi ve (iv) tam metnine erişilebilmesi gerekmiştir. Bu ölçütler, kişisel görüş taşıyan metinleri dışarıda bırakmak içindir; bu yüzden köşe yazıları ve düşünce kuruluşu yorumları yalnızca bağlam bilgisi için okunmuş, kodlanmamıştır. Sincan Uygur Özerk Bölgesi'ne ilişkin siyasi tartışmaya odaklanan metinler de çalışmanın turizm ve miras odağının dışında kaldığı için kapsam dışı bırakılmıştır.</w:t>
       </w:r>
     </w:p>
     <w:p>
@@ -1346,7 +1346,7 @@
       </w:pPr>
       <w:r>
         <w:rPr/>
-        <w:t xml:space="preserve">Belgeler 7 Ekim 2026'da kurumların çevrimiçi kaynaklarından toplanmıştır. Türk tarafında Dışişleri Bakanlığı ve Pekin Büyükelçiliği, Kültür ve Turizm Bakanlığı ve il müdürlükleri, Cumhurbaşkanlığı İletişim Başkanlığı, Ticaret Bakanlığı ve GoTürkiye; Çin tarafında ÇHC Dışişleri Bakanlığı, Kültür ve Turizm Bakanlığı, Devlet Konseyi Bilişim Ofisi, Kuşak ve Yol resmî portalı ile il kültür-turizm daireleri başlıca kaynaklardır. Antalya Mutabakat Zaptı'nın (2015) Türkçe metni Resmî Gazete'den (7 Haziran 2017, Sayı 30089) alınmıştır. Resmî metni bulunamayan iki olay için ajans haberleri kullanılmış ve bu durum envanterde işaretlenmiştir. Erişilemeyen 12 belge ayrı bir listede raporlanmış, yerlerine benzer belge konmamıştır.</w:t>
+        <w:t xml:space="preserve">Belgeler 7 Ekim 2026'da kurumların çevrimiçi kaynaklarından toplanmıştır. Türk tarafında başlıca kaynaklar Dışişleri Bakanlığı ve Pekin Büyükelçiliği, Kültür ve Turizm Bakanlığı ve il müdürlükleri, Cumhurbaşkanlığı İletişim Başkanlığı, Ticaret Bakanlığı ve GoTürkiye; Çin tarafında ise ÇHC Dışişleri Bakanlığı, Kültür ve Turizm Bakanlığı, Devlet Konseyi Bilişim Ofisi, Kuşak ve Yol resmî portalı ile il kültür ve turizm daireleridir. Antalya Mutabakat Zaptı'nın (2015) Türkçe metni Resmî Gazete'den (7 Haziran 2017, Sayı 30089) alınmıştır. Resmî metni bulunamayan iki olay için ajans haberleri kullanılmış ve bu durum envanterde işaretlenmiştir. Erişilemeyen 12 belge ise ayrı bir listede raporlanmış, seçim yanlılığını artırmamak için yerlerine benzer belgeler konmamıştır.</w:t>
       </w:r>
     </w:p>
     <w:p>
@@ -1355,7 +1355,7 @@
       </w:pPr>
       <w:r>
         <w:rPr/>
-        <w:t xml:space="preserve">Nihai korpus 49 belgeden oluşmaktadır: Korpus A'da 25 (11 Türk, 12 Çin, 2 ortak), Korpus B'de 24 (12 Türk, 12 Çin) belge. Korpus A'daki belgelerin 5'i 2010–2014, 9'u 2015–2019, 11'i 2020–2026 dönemine aittir. Korpus B'deki Türk kaynaklarının sekizi tarih göstermeyen tanıtım sayfalarıdır; bunlar erişim tarihiyle birlikte raporlanmıştır. Çince yayımlanmış on sekiz belgenin ilgili bölümleri Türkçeye çevrilmiştir.</w:t>
+        <w:t xml:space="preserve">Bu süreç sonunda korpus 49 belgeden oluşmuştur: Korpus A'da 25 (11 Türk, 12 Çin, 2 ortak), Korpus B'de 24 (12 Türk, 12 Çin) belge. Korpus A'daki belgelerin 5'i 2010–2014, 9'u 2015–2019, 11'i 2020–2026 dönemine aittir. Korpus B'deki Türk kaynaklarının sekizi tarih göstermeyen tanıtım sayfaları olduğu için erişim tarihiyle raporlanmıştır. Çince yayımlanmış on sekiz belgenin ilgili bölümleri Türkçeye çevrilmiştir.</w:t>
       </w:r>
     </w:p>
     <w:p>
@@ -1375,7 +1375,7 @@
       </w:pPr>
       <w:r>
         <w:rPr/>
-        <w:t xml:space="preserve">Analiz birimi, tek bir iddia taşıyan cümle ya da kısa paragraftır (anlam birimi). Belgeler toplam 368 anlam birimine ayrılmıştır. Her birim için önce alan belirlenmiştir. Alanlar, turiste yakınlık sırasına göre önceden sabitlenmiştir: bağlantısallık (ulaşım, koridor, altyapı), turist akışı (vize, turist sayısı, tanıtım, kültür yılı), anlatı (İpek Yolu'nun tarihi, güzergâhı, başlangıcı ve merkezi; ortak medeniyet söylemi; miras adaylıkları) ve değer yakalama (gelir, yatırım, finansman, aracı payı).</w:t>
+        <w:t xml:space="preserve">Ayrıştırma ilkesini sınamak, iş birliği ve rekabet izlerini belge düzeyinde değil, iddia düzeyinde saymayı gerektirir; çünkü tek bir belge hem ortak bir hedef hem de tek taraflı bir talep içerebilir. Bu nedenle analiz birimi, tek bir iddia taşıyan cümle ya da kısa paragraf (anlam birimi) olarak belirlenmiş ve belgeler toplam 368 anlam birimine ayrılmıştır. Her birime önce bir alan atanmıştır. Alanlar, ilkenin öngörüsünü sınayabilmek için turiste yakınlık sırasına göre analizden önce sabitlenmiştir: bağlantısallık (ulaşım, koridor, altyapı), turist akışı (vize, turist sayısı, tanıtım, kültür yılı), anlatı (İpek Yolu'nun tarihi, güzergâhı, başlangıcı ve merkezi; ortak medeniyet söylemi; miras adaylıkları) ve değer yakalama (gelir, yatırım, finansman, aracı payı).</w:t>
       </w:r>
     </w:p>
     <w:p>
@@ -1384,7 +1384,7 @@
       </w:pPr>
       <w:r>
         <w:rPr/>
-        <w:t xml:space="preserve">Yönelim, yorumlayıcı bir yargıya değil, metinde açıkça görülen üç işarete dayandırılmıştır: (1) ortak özne: iki ülkenin birlikte özne ya da fayda sahibi olarak anılması; (2) kendini öne çıkarma: konuşan tarafın kendini İpek Yolu'nun başlangıcı, merkezi, kapısı ya da köprüsü olarak tanımlaması, kendi koridor ya da marka adını tek başına öne sürmesi veya üstünlük karşılaştırması yapması; (3) dışlama ya da tek taraflılık: ortaklar sayılırken karşı ülkenin atlanması ya da yalnızca bir tarafa yarayan hedef, taviz veya talep. Yönelim bu üç işaretten mekanik olarak türetilmiştir: yalnızca ortak özne varsa iş birliği; ortak özne yokken öne çıkarma ya da dışlama varsa rekabet; ikisi birlikte varsa karma; hiçbiri yoksa nötr.</w:t>
+        <w:t xml:space="preserve">Alanı belirlenen her birime ardından bir yönelim atanmıştır. Yönelim, kodlayıcının yorumuna değil, metinde açıkça görülen üç işarete dayandırılmıştır: (1) ortak özne, yani iki ülkenin birlikte özne ya da fayda sahibi olarak anılması; (2) kendini öne çıkarma, yani konuşan tarafın kendini İpek Yolu'nun başlangıcı, merkezi, kapısı ya da köprüsü olarak tanımlaması, kendi koridor ya da marka adını tek başına öne sürmesi veya üstünlük karşılaştırması yapması; (3) dışlama ya da tek taraflılık, yani ortaklar sayılırken karşı ülkenin atlanması ya da yalnızca bir tarafa yarayan bir hedef, taviz veya talep. Yönelim bu üç işaretten mekanik olarak türetilmiştir: yalnızca ortak özne varsa iş birliği, ortak özne yokken öne çıkarma ya da dışlama varsa rekabet, ikisi birlikte varsa karma, hiçbiri yoksa nötr.</w:t>
       </w:r>
     </w:p>
     <w:p>
@@ -1404,7 +1404,7 @@
       </w:pPr>
       <w:r>
         <w:rPr/>
-        <w:t xml:space="preserve">Kodlama şeması iki aşamada geliştirilmiştir. Pilot aşamada şemanın ilk sürümü yorumlayıcı yargıya dayanıyordu; bu sürümle yazar ile yapay zekâ destekli bir ön kodlama arasındaki yönelim uyumu çok düşük çıkmıştır (κ = 0,05). Uyuşmazlığın kaynağı, iş birliği dili taşıyan diplomatik cümlelerde örtük rekabetin okunup okunmaması olmuştur. Bu bulgu üzerine şema, yalnızca açık işaretlere dayanan ikinci sürüme dönüştürülmüştür. Pilot aşamadaki kodlar analizde kullanılmamıştır.</w:t>
+        <w:t xml:space="preserve">Yönelimin yoruma değil açık işaretlere dayandırılması, pilot aşamada karşılaşılan bir sorunun sonucudur. Şemanın ilk sürümü yorumlayıcı yargıya dayanıyordu ve bu sürümle yazar ile yapay zekâ destekli bir ön kodlama arasındaki yönelim uyumu çok düşük çıktı (κ = 0,05). Uyuşmazlık, iş birliği dili taşıyan diplomatik cümlelerde örtük bir rekabetin okunup okunmamasından kaynaklanıyordu. Aynı cümlenin farklı kodlayıcılarca farklı okunması güvenilir bir sayım yapmayı imkânsız kıldığından şema, yalnızca açık işaretlere dayanan ikinci sürüme dönüştürülmüştür. Pilot aşamadaki kodlar analizde kullanılmamıştır.</w:t>
       </w:r>
     </w:p>
     <w:p>
@@ -1413,7 +1413,7 @@
       </w:pPr>
       <w:r>
         <w:rPr/>
-        <w:t xml:space="preserve">Nihai kodlama, birbirinden bağımsız çalışan iki kodlayıcı tarafından yapılmıştır [kodlayıcıların alan ve unvan bilgisi]. Kodlayıcılara kodlama kılavuzu ve uydurma bir örnek verilmiş, birbirleriyle görüşmeden kodlama yapmaları istenmiştir. Kodlayıcılar arası uyum alan için Cohen κ = [ ], yönelim için κ = [ ] olarak hesaplanmıştır. Uyuşmazlıklar [uzlaşma toplantısı / yazar kararı] ile çözülmüş ve kodlama günlüğüne kaydedilmiştir.</w:t>
+        <w:t xml:space="preserve">Nihai kodlama, ikinci sürümle ve birbirinden bağımsız çalışan iki kodlayıcı tarafından yapılmıştır [kodlayıcıların alan ve unvan bilgisi]. Kodlayıcılara kodlama kılavuzu ve uydurma bir örnek verilmiş, birbirleriyle görüşmeden kodlamaları istenmiştir. Kodlayıcılar arası uyum alan için Cohen κ = [ ], yönelim için κ = [ ] olarak hesaplanmıştır. Uyuşmazlıklar [uzlaşma toplantısı / yazar kararı] ile çözülmüş ve kodlama günlüğüne kaydedilmiştir.</w:t>
       </w:r>
     </w:p>
     <w:p>
@@ -1422,7 +1422,7 @@
       </w:pPr>
       <w:r>
         <w:rPr/>
-        <w:t xml:space="preserve">Analiz betimsel niteliktedir: her alanda rekabet kodlarının payı hesaplanmış, Türk ve Çin kaynakları ayrı ayrı karşılaştırılmıştır. Ayrıştırma ilkesinin desteklenip desteklenmediğine ilişkin karar kuralı veri analizinden önce yazılmıştır: rekabet payının bağlantısallıktan değer yakalamaya doğru düzenli artması ya da iki uç arasındaki farkın en az 20 yüzde puan olması destek olarak kabul edilmiştir. Nötr birimlerin paydaya dahil edilip edilmemesi sonucu etkileyebildiğinden iki hesaplama birlikte raporlanmıştır. Önermeye ters düşen birimler (bağlantısallıkta rekabet, anlatı ve değer yakalamada iş birliği) olumsuz vaka olarak ayrıca incelenmiştir.</w:t>
+        <w:t xml:space="preserve">Kodlanan birimler betimsel olarak çözümlenmiştir: her alanda rekabet kodlarının payı hesaplanmış, Türk ve Çin kaynakları ayrı ayrı karşılaştırılmıştır. Sonucun veriye bakıldıktan sonra yorumlanmasını önlemek için ayrıştırma ilkesinin desteklenip desteklenmediğine ilişkin karar kuralı analizden önce yazılmıştır. Buna göre rekabet payının bağlantısallıktan değer yakalamaya doğru düzenli artması ya da iki uç arasındaki farkın en az 20 yüzde puan olması destek sayılmıştır. Nötr birimlerin paydaya katılıp katılmaması sonucu değiştirebildiği için iki hesaplama birlikte raporlanmıştır. Önermeye ters düşen birimler, yani bağlantısallıktaki rekabet kodları ile anlatı ve değer yakalamadaki iş birliği kodları, olumsuz vaka olarak ayrıca incelenmiştir; bu inceleme, Kuramsal Çerçeve'de belirtilen pazar ya da coğrafya temelli ayrışma açıklamasını da sınamaktadır.</w:t>
       </w:r>
     </w:p>
     <w:p>
@@ -1442,7 +1442,7 @@
       </w:pPr>
       <w:r>
         <w:rPr/>
-        <w:t xml:space="preserve">Söylem ile gerçekleşen akış arasındaki ilişkiyi değerlendirmek için TÜİK'in Emniyet Genel Müdürlüğü kayıtlarına dayanan "Giriş yapan yabancılar" serisinden 2010–2025 dönemi Çin uyruklu giriş sayıları ve bu sayıların toplam yabancı girişleri içindeki payı kullanılmıştır. Bu seri sınır giriş kaydıdır; turizm dışı ve transit girişleri de içerir, bu nedenle "turist sayısı" olarak değil "Çin uyruklu giriş" olarak adlandırılmıştır. Seri yalnızca betimsel olarak kullanılmış, nedensel bir test yapılmamıştır.</w:t>
+        <w:t xml:space="preserve">Belgelerdeki iş birliği söyleminin akışa yansıyıp yansımadığını görmek için ikinci bir veri kaynağına ihtiyaç vardır. Bu amaçla TÜİK'in Emniyet Genel Müdürlüğü kayıtlarına dayanan giriş yapan yabancılar serisinden 2010–2025 dönemine ait Çin uyruklu giriş sayıları ve bu sayıların toplam yabancı girişler içindeki payı kullanılmıştır. Seri bir sınır giriş kaydı olduğu ve turizm dışı ya da transit girişleri de içerdiği için "turist sayısı" olarak değil "Çin uyruklu giriş" olarak adlandırılmıştır. Tek bir seri nedensel bir sınamaya izin vermediğinden seri yalnızca betimsel olarak kullanılmıştır.</w:t>
       </w:r>
     </w:p>
     <w:p>
@@ -1462,7 +1462,7 @@
       </w:pPr>
       <w:r>
         <w:rPr/>
-        <w:t xml:space="preserve">Çalışma yalnızca kamuya açık resmî belgelere ve toplulaştırılmış istatistiklere dayandığı, katılımcı ve kişisel veri içermediği için etik kurul izni gerektirmemektedir; dergiye etik kurul iznine gerek olmadığına dair beyan formu sunulmuştur. Yapay zekâ araçlarının kullanımı, dergi politikası uyarınca makale sonundaki beyanda ayrıntılı olarak belirtilmiştir.</w:t>
+        <w:t xml:space="preserve">Çalışma yalnızca kamuya açık resmî belgelere ve toplulaştırılmış istatistiklere dayanmakta, katılımcı ya da kişisel veri içermemektedir; bu nedenle etik kurul izni gerektirmemektedir. Yapay zekâ araçlarının hangi aşamalarda ve ne amaçla kullanıldığı, dergi politikası uyarınca makale sonundaki beyanda belirtilmiştir.</w:t>
       </w:r>
     </w:p>
     <w:p>
@@ -1854,7 +1854,7 @@
         <w:rPr>
           <w:highlight w:val="yellow"/>
         </w:rPr>
-        <w:t xml:space="preserve">YAZAR YAZACAK – yönerge: Gelecek araştırma: değer yakalama verisi; Çince birincil yazın; Orta Asya üçüncü taraf perspektifi; boylamsal izleme (2026 vize muafiyeti sonrası).</w:t>
+        <w:t xml:space="preserve">YAZAR YAZACAK – yönerge: Gelecek araştırma: değer yakalama verisi; Çince birincil literatür; Orta Asya üçüncü taraf perspektifi; boylamsal izleme (2026 vize muafiyeti sonrası).</w:t>
       </w:r>
     </w:p>
     <w:p>
@@ -2971,37 +2971,6 @@
           <w:szCs w:val="22"/>
           <w:lang w:val="en-US"/>
         </w:rPr>
-        <w:t xml:space="preserve">Tuna, M., Özyurt, B., Dülger, A. S., Türkmen, F., &amp; Uyanık, N. (2022). Türk dünyasında turizmin ülkeler arası iş birliği temelli geliştirilmesine yönelik nitel bir araştırma. </w:t>
-      </w:r>
-      <w:r>
-        <w:rPr>
-          <w:szCs w:val="22"/>
-          <w:lang w:val="en-US"/>
-          <w:i/>
-        </w:rPr>
-        <w:t xml:space="preserve">Bilig</w:t>
-      </w:r>
-      <w:r>
-        <w:rPr>
-          <w:szCs w:val="22"/>
-          <w:lang w:val="en-US"/>
-        </w:rPr>
-        <w:t xml:space="preserve">, 137–176. https://doi.org/10.12995/bilig.10007</w:t>
-      </w:r>
-    </w:p>
-    <w:p>
-      <w:pPr>
-        <w:ind w:left="709" w:hanging="709"/>
-        <w:rPr>
-          <w:szCs w:val="22"/>
-          <w:lang w:val="en-US"/>
-        </w:rPr>
-      </w:pPr>
-      <w:r>
-        <w:rPr>
-          <w:szCs w:val="22"/>
-          <w:lang w:val="en-US"/>
-        </w:rPr>
         <w:t xml:space="preserve">Türkiye İstatistik Kurumu. (2026). </w:t>
       </w:r>
       <w:r>
@@ -3341,7 +3310,7 @@
       </w:pPr>
       <w:r>
         <w:rPr/>
-        <w:t xml:space="preserve">Official discourse between Türkiye and China presents the Silk Road as a shared heritage and tourism as a natural field of cooperation. Türkiye aligned its Middle Corridor with the Belt and Road Initiative through a memorandum signed in Antalya in 2015 (Resmî Gazete, 2017), 2018 was celebrated as the Year of Turkish Tourism in China (Niu &amp; Li, 2019), the two culture and tourism ministries signed a tourism cooperation memorandum in 2024, and from 2 January 2026 Türkiye granted Chinese citizens unilateral visa-free entry (Türkiye Turizm Tanıtım ve Geliştirme Ajansı [TGA], 2026). The Turkish tourism literature reads this relationship largely as a win-win partnership and treats its problems, such as security perceptions, language and distance, as technical obstacles (İbiş, 2019; Kılıç, 2021; Palidan, 2024). Heritage politics research, however, shows that "shared" heritage also generates competing claims of ownership and centrality (Brown &amp; O'Brien, 2025; Debarbieux et al., 2023), and China's historicisation of the Silk Road has been described as Sinocentric (Sciorati, 2023). The study asks two questions. First, in which domains do Türkiye and China cooperate and in which do they compete over Silk Road tourism heritage between 2010 and 2026, and does this distribution follow the activity's proximity to the tourist? Second, to what extent have the two countries' cooperation discourse and agreements been reflected in arrivals of Chinese nationals to Türkiye?</w:t>
+        <w:t xml:space="preserve">Official discourse between Türkiye and China presents the Silk Road as a shared heritage and tourism as a natural field of cooperation. Recent steps follow this narrative: Türkiye aligned its Middle Corridor with the Belt and Road Initiative through a memorandum signed in Antalya in 2015 (Resmî Gazete, 2017), 2018 was celebrated as the Year of Turkish Tourism in China (Niu &amp; Li, 2019), the two culture and tourism ministries signed a tourism cooperation memorandum in 2024, and from 2 January 2026 Türkiye granted Chinese citizens unilateral visa-free entry (Türkiye Turizm Tanıtım ve Geliştirme Ajansı [TGA], 2026). These steps create a clear expectation that Chinese tourists will follow, but the data meet this expectation only in part. Arrivals of Chinese nationals tripled after 2013, yet they never exceeded one per cent of all foreign arrivals (Türkiye İstatistik Kurumu [TÜİK], 2026). The Turkish tourism literature explains this gap by technical obstacles such as security perceptions, language and distance, because it treats the relationship as a win-win partnership from the outset (İbiş, 2019; Kılıç, 2021; Palidan, 2024). Heritage politics research suggests a different reading: "shared" heritage also generates competing claims of ownership and centrality (Brown &amp; O'Brien, 2025; Debarbieux et al., 2023), and China's historicisation of the Silk Road has been described as Sinocentric (Sciorati, 2023). If both readings hold, the problem may lie in the relationship itself rather than in its obstacles. The study therefore asks two questions. First, in which domains do Türkiye and China cooperate, and in which do they compete, over Silk Road tourism heritage between 2010 and 2026, and does this distribution follow the activity's proximity to the tourist? Second, to what extent have the two countries' cooperation discourse and agreements been reflected in arrivals of Chinese nationals?</w:t>
       </w:r>
     </w:p>
     <w:p>
@@ -3364,7 +3333,7 @@
       </w:pPr>
       <w:r>
         <w:rPr/>
-        <w:t xml:space="preserve">The study adopts a critical realist stance and a single embedded case design, with the Türkiye–China dyad as the case and four domains, ordered in advance by proximity to the tourist, as embedded units: connectivity, tourist flows, narrative and value capture. The theoretical mechanism tested is the separation principle derived from Bengtsson and Kock (2000, p. 421), according to which competitors cooperate in input activities far from the customer and compete in output activities close to the customer. Systematic document analysis (Bowen, 2009) was applied to two corpora: 25 bilateral or joint official documents (Corpus A) and 24 unilateral Silk Road promotion and policy narratives (Corpus B), collected through criterion sampling from Turkish and Chinese official sources. The documents were segmented into 368 meaning units. Orientation was derived mechanically from three manifest markers (a joint subject, self-promotion, and exclusion or one-sidedness) to produce cooperation, competition, mixed or neutral codes. A pilot round showed that interpretive judgement produced very low agreement, which led to the marker-based scheme; pilot codes were not used in the analysis. Final coding was carried out by two independent human coders, and inter-coder agreement is reported with Cohen's kappa </w:t>
+        <w:t xml:space="preserve">Because these questions look for a mechanism, the study adopts a critical realist stance and treats documentary traces as indicators of that mechanism rather than as the mechanism itself. The mechanism tested is the separation principle derived from Bengtsson and Kock (2000, p. 421), according to which competitors cooperate in input activities far from the customer and compete in output activities close to the customer. To compare this mechanism across the parts of a single relationship, a single embedded case design was chosen, with the Türkiye–China dyad as the case and four domains, ordered in advance by proximity to the tourist, as embedded units: connectivity, tourist flows, narrative and value capture. Since cooperation is expected to appear in joint documents and competition in unilateral ones, systematic document analysis (Bowen, 2009) was applied to two corpora: 25 bilateral or joint official documents (Corpus A) and 24 unilateral Silk Road promotion and policy narratives (Corpus B), selected through criterion sampling. The documents were divided into 368 meaning units. A pilot round showed that interpretive coding of orientation produced very low agreement, so the final scheme derives orientation mechanically from three manifest markers (a joint subject, self-promotion, and exclusion or one-sidedness); pilot codes were not used in the analysis. Two independent human coders carried out the final coding, and agreement is reported with Cohen's kappa </w:t>
       </w:r>
       <w:r>
         <w:rPr>
@@ -3374,7 +3343,7 @@
       </w:r>
       <w:r>
         <w:rPr/>
-        <w:t xml:space="preserve">. The decision rule for the separation principle was written before the analysis: a monotonic increase in the share of competition codes from connectivity to value capture, or a difference of at least 20 percentage points between the two ends, counts as support. Arrivals of Chinese nationals from the Turkish Statistical Institute series for 2010–2025 were used descriptively, without causal testing (Türkiye İstatistik Kurumu [TÜİK], 2026).</w:t>
+        <w:t xml:space="preserve">. To prevent post hoc interpretation, the decision rule was written before the analysis: a monotonic increase in the share of competition codes from connectivity to value capture, or a difference of at least 20 percentage points between the two ends, counts as support. Arrivals of Chinese nationals for 2010–2025 were then read descriptively, without causal testing.</w:t>
       </w:r>
     </w:p>
     <w:p>
@@ -3426,7 +3395,7 @@
       </w:pPr>
       <w:r>
         <w:rPr/>
-        <w:t xml:space="preserve">The descriptive series shows a clear gap between discourse and flows. Arrivals of Chinese nationals rose from 138,876 in 2013 to 426,344 in 2019 and stood at 425,348 in 2025, but their share of all foreign arrivals peaked at 0.998% in 2018 and never exceeded one per cent (TÜİK, 2026). Connectivity cooperation along the Middle Corridor has produced freight capacity rather than passenger services; the corridor carried about 5.2 million tonnes of freight in 2025 without a scheduled international passenger service on its main axis (Farmanov et al., 2026). </w:t>
+        <w:t xml:space="preserve">The descriptive series confirms the gap between discourse and flows. Arrivals of Chinese nationals rose from 138,876 in 2013 to 426,344 in 2019 and stood at 425,348 in 2025, but their share of all foreign arrivals peaked at 0.998% in 2018 (TÜİK, 2026). The connectivity domain helps to explain why. Cooperation along the Middle Corridor has produced freight capacity rather than passenger services: the corridor carried about 5.2 million tonnes of freight in 2025 without a scheduled international passenger service on its main axis (Farmanov et al., 2026). </w:t>
       </w:r>
       <w:r>
         <w:rPr>
@@ -3479,7 +3448,7 @@
       </w:pPr>
       <w:r>
         <w:rPr/>
-        <w:t xml:space="preserve">The study makes three contributions. Theoretically, it carries the separation principle, so far examined among firms and destinations (Chim-Miki &amp; Batista-Canino, 2017a; Wang &amp; Krakover, 2008), to heritage tourism between two states. Existing work on Silk Road coopetition addresses multilateral programme management (Redi &amp; Pulido Fernández, 2018), and international relations studies of the Türkiye–China dyad or of great power coopetition explain the relationship as a whole without asking in which activities cooperation and competition concentrate (Wang &amp; Sun, 2024; Wisniewski, 2025). Conceptually, it shows that the discourse of a "shared Silk Road" can carry partnership and ownership claims at the same time, and proposes that the Silk Road heritage is the object of coopetition rather than a neutral common asset. Practically, it offers a framework for identifying where Türkiye's China tourism policy gains from cooperation and where it needs differentiation.</w:t>
+        <w:t xml:space="preserve">The study contributes at three levels. Theoretically, it carries the separation principle, so far examined among firms and destinations (Chim-Miki &amp; Batista-Canino, 2017a; Wang &amp; Krakover, 2008), to heritage tourism between two states. This extension matters because the closest existing work addresses the multilateral management of the Silk Road Programme (Redi &amp; Pulido Fernández, 2018), while international relations studies of the Türkiye–China dyad and of great power coopetition explain the relationship as a whole without asking in which activities cooperation and competition concentrate (Wang &amp; Sun, 2024; Wisniewski, 2025). Conceptually, the study shows that the discourse of a "shared Silk Road" can carry partnership and ownership claims at the same time; for this reason it treats the Silk Road heritage as the object of coopetition rather than as a neutral common asset. Practically, it offers Türkiye's China tourism policy a way to distinguish the domains in which cooperation pays from those in which differentiation is needed.</w:t>
       </w:r>
       <w:r>
         <w:br w:type="page"/>

</xml_diff>

<commit_message>
Beyan tablosuna üçüncü kodlama eklendi
Co-Authored-By: Claude Opus 5.5 <noreply@anthropic.com>
Claude-Session: https://claude.ai/code/session_015BkByremFh97j9aWiMCq3J
</commit_message>
<xml_diff>
--- a/makaleler/turkiye-cin-ortaklasa-rekabet/teslim/makale-anonim-taslak-v1.docx
+++ b/makaleler/turkiye-cin-ortaklasa-rekabet/teslim/makale-anonim-taslak-v1.docx
@@ -4868,7 +4868,7 @@
                 <w:sz w:val="18"/>
                 <w:szCs w:val="18"/>
               </w:rPr>
-              <w:t xml:space="preserve"> Bu çalışmanın hazırlanması sırasında yazar(lar), literatür taraması ve künye doğrulama, doküman korpusunun hazırlanması ve Çince metinlerin çevirisi, kodlama şemasının pilot sınaması, betimsel hesaplamalar ile Giriş, Kuramsal Çerçeve ve Yöntem bölümlerinde taslak ve dil desteği amacıyla Claude (Anthropic) kullanmıştır. Bu araç/hizmeti kullandıktan sonra, yazar(lar) içeriği gerektiği şekilde gözden geçirip düzenlemiş ve yayınlanan makalenin içeriği konusunda tüm sorumluluğu üstlenmiştir.</w:t>
+              <w:t xml:space="preserve"> Bu çalışmanın hazırlanması sırasında yazar(lar), literatür taraması ve künye doğrulama, doküman korpusunun hazırlanması ve Çince metinlerin çevirisi, kodlama şemasının pilot sınaması, insan kodlayıcılar arasındaki uyuşmazlıkların çözümünde bağımsız üçüncü kodlama, betimsel hesaplamalar ile Giriş, Kuramsal Çerçeve ve Yöntem bölümlerinde taslak ve dil desteği amacıyla Claude (Anthropic) kullanmıştır. Bu araç/hizmeti kullandıktan sonra, yazar(lar) içeriği gerektiği şekilde gözden geçirip düzenlemiş ve yayınlanan makalenin içeriği konusunda tüm sorumluluğu üstlenmiştir.</w:t>
             </w:r>
           </w:p>
         </w:tc>
@@ -5089,7 +5089,7 @@
                 <w:szCs w:val="18"/>
                 <w:lang w:val="en-US"/>
               </w:rPr>
-              <w:t xml:space="preserve"> During the preparation of this study the author(s) used Claude (Anthropic) in order to literature search and reference verification, preparation of the document corpus and translation of Chinese texts, pilot testing of the coding scheme, descriptive calculations, and drafting and language support in the Introduction, Theoretical Framework and Method sections. After using this tool/service, the author(s) reviewed and edited the content as needed and take(s) full responsibility for the content of the published article.</w:t>
+              <w:t xml:space="preserve"> During the preparation of this study the author(s) used Claude (Anthropic) in order to literature search and reference verification, preparation of the document corpus and translation of Chinese texts, pilot testing of the coding scheme, an independent third coding used to resolve disagreements between the human coders, descriptive calculations, and drafting and language support in the Introduction, Theoretical Framework and Method sections. After using this tool/service, the author(s) reviewed and edited the content as needed and take(s) full responsibility for the content of the published article.</w:t>
             </w:r>
           </w:p>
         </w:tc>

</xml_diff>

<commit_message>
'Korpus' yerine 'ikili/tek taraflı belgeler'; kalıcı kural
Co-Authored-By: Claude Opus 5.5 <noreply@anthropic.com>
Claude-Session: https://claude.ai/code/session_015BkByremFh97j9aWiMCq3J
</commit_message>
<xml_diff>
--- a/makaleler/turkiye-cin-ortaklasa-rekabet/teslim/makale-anonim-taslak-v1.docx
+++ b/makaleler/turkiye-cin-ortaklasa-rekabet/teslim/makale-anonim-taslak-v1.docx
@@ -939,7 +939,7 @@
       </w:pPr>
       <w:r>
         <w:rPr/>
-        <w:t xml:space="preserve">Bu olasılık iki soruyu gündeme getirmektedir. Birincisi, 2010–2026 döneminde Türkiye ve Çin'in İpek Yolu turizm mirası üzerinde hangi alanlarda iş birliği, hangi alanlarda rekabet yürüttüğü ve bu dağılımın faaliyetin turiste yakınlığına göre ayrışıp ayrışmadığıdır. İkincisi, iki ülkenin iş birliği söylemi ve anlaşmalarının Türkiye'ye yönelik Çin uyruklu girişlere ne ölçüde yansıdığıdır. Birinci soru, iki ülkenin ikili ve tek taraflı resmî belgelerinden oluşan 49 belgelik bir korpusun sistematik doküman analiziyle; ikinci soru ise TÜİK'in giriş serisinin betimsel okumasıyla yanıtlanmaktadır.</w:t>
+        <w:t xml:space="preserve">Bu olasılık iki soruyu gündeme getirmektedir. Birincisi, 2010–2026 döneminde Türkiye ve Çin'in İpek Yolu turizm mirası üzerinde hangi alanlarda iş birliği, hangi alanlarda rekabet yürüttüğü ve bu dağılımın faaliyetin turiste yakınlığına göre ayrışıp ayrışmadığıdır. İkincisi, iki ülkenin iş birliği söylemi ve anlaşmalarının Türkiye'ye yönelik Çin uyruklu girişlere ne ölçüde yansıdığıdır. Birinci soru, iki ülkenin ikili ve tek taraflı resmî belgelerinden oluşan 49 resmî belgenin sistematik doküman analiziyle; ikinci soru ise TÜİK'in giriş serisinin betimsel okumasıyla yanıtlanmaktadır.</w:t>
       </w:r>
     </w:p>
     <w:p>
@@ -948,7 +948,7 @@
       </w:pPr>
       <w:r>
         <w:rPr/>
-        <w:t xml:space="preserve">Bu yanıtların katkısı üç düzeydedir. Kuramsal düzeyde, firmalar ve destinasyonlar için geliştirilen ayrıştırma ilkesi ilk kez iki devlet arasındaki miras turizmine taşınmaktadır. Kavramsal düzeyde, "paylaşılan İpek Yolu" söyleminin ortaklık ile sahiplik iddiasını aynı anda taşıyabildiği gösterilmekte, bu nedenle İpek Yolu mirası nötr bir ortak varlık olarak değil, ortaklaşa rekabetin nesnesi olarak ele alınmaktadır. Uygulama düzeyinde ise Türkiye'nin Çin pazarına yönelik politikasının hangi alanlarda iş birliğinden, hangi alanlarda farklılaşmadan yarar sağlayabileceği gösterilmektedir. Bu amaçla makale şu sırayı izlemektedir: Kuramsal Çerçeve bölümü literatürdeki iş birliği uzlaşısını, miras siyasetinin bu uzlaşıya itirazını ve iki okumayı birleştiren ortaklaşa rekabet çerçevesini kurarak beş önerme türetmekte; Yöntem bölümü korpusu, kodlama şemasını ve güvenirlik sürecini anlatmakta; Bulgular bölümü önermeleri sırasıyla değerlendirmekte; Tartışma ve Sonuç bölümü ise bulguları kurama ve politikaya bağlamaktadır.</w:t>
+        <w:t xml:space="preserve">Bu yanıtların katkısı üç düzeydedir. Kuramsal düzeyde, firmalar ve destinasyonlar için geliştirilen ayrıştırma ilkesi ilk kez iki devlet arasındaki miras turizmine taşınmaktadır. Kavramsal düzeyde, "paylaşılan İpek Yolu" söyleminin ortaklık ile sahiplik iddiasını aynı anda taşıyabildiği gösterilmekte, bu nedenle İpek Yolu mirası nötr bir ortak varlık olarak değil, ortaklaşa rekabetin nesnesi olarak ele alınmaktadır. Uygulama düzeyinde ise Türkiye'nin Çin pazarına yönelik politikasının hangi alanlarda iş birliğinden, hangi alanlarda farklılaşmadan yarar sağlayabileceği gösterilmektedir. Bu amaçla makale şu sırayı izlemektedir: Kuramsal Çerçeve bölümü literatürdeki iş birliği uzlaşısını, miras siyasetinin bu uzlaşıya itirazını ve iki okumayı birleştiren ortaklaşa rekabet çerçevesini kurarak beş önerme türetmekte; Yöntem bölümü incelenen belgeleri, kodlama şemasını ve güvenirlik sürecini anlatmakta; Bulgular bölümü önermeleri sırasıyla değerlendirmekte; Tartışma ve Sonuç bölümü ise bulguları kurama ve politikaya bağlamaktadır.</w:t>
       </w:r>
     </w:p>
     <w:p>
@@ -1319,7 +1319,7 @@
         <w:rPr>
           <w:szCs w:val="22"/>
         </w:rPr>
-        <w:t xml:space="preserve">3.2. Doküman Korpusu</w:t>
+        <w:t xml:space="preserve">3.2. İncelenen Belgeler</w:t>
       </w:r>
     </w:p>
     <w:p>
@@ -1328,7 +1328,7 @@
       </w:pPr>
       <w:r>
         <w:rPr/>
-        <w:t xml:space="preserve">Belgelerin hepsi aynı türden iz taşımaz. İki ülkenin birlikte imzaladığı ya da birbirine hitap ettiği belgeler doğası gereği iş birliği diliyle yazılır; rekabetin izleri ise daha çok her ülkenin kendi kamuoyuna ve turistine yönelik tek taraflı anlatılarında görünür. Bu nedenle korpus iki alt kümeye ayrılmıştır. Korpus A, iki ülke arasındaki ikili ve ortak resmî belgeleri içerir: ortak bildiriler, mutabakat zaptları, devlet ve hükümet düzeyindeki görüşme özetleri, büyükelçilik konuşmaları ve turizm ya da kültür yılı metinleri. Korpus B ise iki ülkenin birbirinden bağımsız olarak ürettiği İpek Yolu tanıtım ve politika anlatılarından oluşur.</w:t>
+        <w:t xml:space="preserve">Belgelerin hepsi aynı türden iz taşımaz. İki ülkenin birlikte imzaladığı ya da birbirine hitap ettiği belgeler doğası gereği iş birliği diliyle yazılır; rekabetin izleri ise daha çok her ülkenin kendi kamuoyuna ve turistine yönelik tek taraflı anlatılarında görünür. Bu nedenle belgeler iki gruba ayrılmıştır. Birinci grup (ikili belgeler), iki ülke arasındaki ikili ve ortak resmî belgeleri içerir: ortak bildiriler, mutabakat zaptları, devlet ve hükümet düzeyindeki görüşme özetleri, büyükelçilik konuşmaları ve turizm ya da kültür yılı metinleri. İkinci grup (tek taraflı belgeler) ise iki ülkenin birbirinden bağımsız olarak ürettiği İpek Yolu tanıtım ve politika anlatılarından oluşur.</w:t>
       </w:r>
     </w:p>
     <w:p>
@@ -1337,7 +1337,7 @@
       </w:pPr>
       <w:r>
         <w:rPr/>
-        <w:t xml:space="preserve">Her iki kümedeki belgeler ölçüt örneklemesiyle seçilmiştir. Bir belgenin korpusa girmesi için (i) 1 Ocak 2010 ile 30 Eylül 2026 arasında yayımlanmış olması, (ii) resmî bir kurum ya da resmî yayın organı tarafından yayımlanmış olması, (iii) turizm, İpek Yolu mirası, halklar arası değişim ya da bağlantısallıktan söz etmesi ve (iv) tam metnine erişilebilmesi gerekmiştir. Bu ölçütler, kişisel görüş taşıyan metinleri dışarıda bırakmak içindir; bu yüzden köşe yazıları ve düşünce kuruluşu yorumları yalnızca bağlam bilgisi için okunmuş, kodlanmamıştır. Sincan Uygur Özerk Bölgesi'ne ilişkin siyasi tartışmaya odaklanan metinler de çalışmanın turizm ve miras odağının dışında kaldığı için kapsam dışı bırakılmıştır.</w:t>
+        <w:t xml:space="preserve">Her iki gruptaki belgeler ölçüt örneklemesiyle seçilmiştir. Bir belgenin çalışmaya alınması için (i) 1 Ocak 2010 ile 30 Eylül 2026 arasında yayımlanmış olması, (ii) resmî bir kurum ya da resmî yayın organı tarafından yayımlanmış olması, (iii) turizm, İpek Yolu mirası, halklar arası değişim ya da bağlantısallıktan söz etmesi ve (iv) tam metnine erişilebilmesi gerekmiştir. Bu ölçütler, kişisel görüş taşıyan metinleri dışarıda bırakmak içindir; bu yüzden köşe yazıları ve düşünce kuruluşu yorumları yalnızca bağlam bilgisi için okunmuş, kodlanmamıştır. Sincan Uygur Özerk Bölgesi'ne ilişkin siyasi tartışmaya odaklanan metinler de çalışmanın turizm ve miras odağının dışında kaldığı için kapsam dışı bırakılmıştır.</w:t>
       </w:r>
     </w:p>
     <w:p>
@@ -1355,7 +1355,7 @@
       </w:pPr>
       <w:r>
         <w:rPr/>
-        <w:t xml:space="preserve">Bu süreç sonunda korpus 49 belgeden oluşmuştur: Korpus A'da 25 (11 Türk, 12 Çin, 2 ortak), Korpus B'de 24 (12 Türk, 12 Çin) belge. Korpus A'daki belgelerin 5'i 2010–2014, 9'u 2015–2019, 11'i 2020–2026 dönemine aittir. Korpus B'deki Türk kaynaklarının sekizi tarih göstermeyen tanıtım sayfaları olduğu için erişim tarihiyle raporlanmıştır. Çince yayımlanmış on sekiz belgenin ilgili bölümleri Türkçeye çevrilmiştir.</w:t>
+        <w:t xml:space="preserve">Bu süreç sonunda 49 belge incelemeye alınmıştır: ikili belgeler grubunda 25 (11 Türk, 12 Çin, 2 ortak), tek taraflı belgeler grubunda 24 (12 Türk, 12 Çin) belge. İkili belgelerin 5'i 2010–2014, 9'u 2015–2019, 11'i 2020–2026 dönemine aittir. Tek taraflı belgelerdeki Türk kaynaklarının sekizi tarih göstermeyen tanıtım sayfaları olduğu için erişim tarihiyle raporlanmıştır. Çince yayımlanmış on sekiz belgenin ilgili bölümleri Türkçeye çevrilmiştir.</w:t>
       </w:r>
     </w:p>
     <w:p>
@@ -1482,7 +1482,7 @@
         <w:rPr>
           <w:szCs w:val="22"/>
         </w:rPr>
-        <w:t xml:space="preserve">4.1. Korpusun ve kodlamanın genel görünümü</w:t>
+        <w:t xml:space="preserve">4.1. Belgelerin ve kodlamanın genel görünümü</w:t>
       </w:r>
     </w:p>
     <w:p>
@@ -1548,7 +1548,7 @@
         <w:rPr>
           <w:highlight w:val="yellow"/>
         </w:rPr>
-        <w:t xml:space="preserve">YAZAR YAZACAK – yönerge: Korpus A'da İB payı; Korpus B'de RK payı. İki korpusun karşılaştırması (Tablo 3).</w:t>
+        <w:t xml:space="preserve">YAZAR YAZACAK – yönerge: İkili belgelerde İB payı; Tek taraflı belgelerde RK payı. İki belge grubunun karşılaştırması (Tablo 3).</w:t>
       </w:r>
     </w:p>
     <w:p>
@@ -1658,7 +1658,7 @@
         <w:rPr>
           <w:highlight w:val="yellow"/>
         </w:rPr>
-        <w:t xml:space="preserve">YAZAR YAZACAK – yönerge: Korpus B'de Çin'in yurt içi İpek Yolu destinasyonlarını (Xi'an, Dunhuang vb.) pazarlayan birimler → Ö5 için yorumlayıcı kanıt; sayısı ve örneği.</w:t>
+        <w:t xml:space="preserve">YAZAR YAZACAK – yönerge: Tek taraflı belgelerde Çin'in yurt içi İpek Yolu destinasyonlarını (Xi'an, Dunhuang vb.) pazarlayan birimler → Ö5 için yorumlayıcı kanıt; sayısı ve örneği.</w:t>
       </w:r>
     </w:p>
     <w:p>
@@ -3333,7 +3333,7 @@
       </w:pPr>
       <w:r>
         <w:rPr/>
-        <w:t xml:space="preserve">Because these questions look for a mechanism, the study adopts a critical realist stance and treats documentary traces as indicators of that mechanism rather than as the mechanism itself. The mechanism tested is the separation principle derived from Bengtsson and Kock (2000, p. 421), according to which competitors cooperate in input activities far from the customer and compete in output activities close to the customer. To compare this mechanism across the parts of a single relationship, a single embedded case design was chosen, with the Türkiye–China dyad as the case and four domains, ordered in advance by proximity to the tourist, as embedded units: connectivity, tourist flows, narrative and value capture. Since cooperation is expected to appear in joint documents and competition in unilateral ones, systematic document analysis (Bowen, 2009) was applied to two corpora: 25 bilateral or joint official documents (Corpus A) and 24 unilateral Silk Road promotion and policy narratives (Corpus B), selected through criterion sampling. The documents were divided into 368 meaning units. A pilot round showed that interpretive coding of orientation produced very low agreement, so the final scheme derives orientation mechanically from three manifest markers (a joint subject, self-promotion, and exclusion or one-sidedness); pilot codes were not used in the analysis. Two independent human coders carried out the final coding, and agreement is reported with Cohen's kappa </w:t>
+        <w:t xml:space="preserve">Because these questions look for a mechanism, the study adopts a critical realist stance and treats documentary traces as indicators of that mechanism rather than as the mechanism itself. The mechanism tested is the separation principle derived from Bengtsson and Kock (2000, p. 421), according to which competitors cooperate in input activities far from the customer and compete in output activities close to the customer. To compare this mechanism across the parts of a single relationship, a single embedded case design was chosen, with the Türkiye–China dyad as the case and four domains, ordered in advance by proximity to the tourist, as embedded units: connectivity, tourist flows, narrative and value capture. Since cooperation is expected to appear in joint documents and competition in unilateral ones, systematic document analysis (Bowen, 2009) was applied to two groups of documents: 25 bilateral or joint official documents and 24 unilateral Silk Road promotion and policy narratives, selected through criterion sampling. The documents were divided into 368 meaning units. A pilot round showed that interpretive coding of orientation produced very low agreement, so the final scheme derives orientation mechanically from three manifest markers (a joint subject, self-promotion, and exclusion or one-sidedness); pilot codes were not used in the analysis. Two independent human coders carried out the final coding, and agreement is reported with Cohen's kappa </w:t>
       </w:r>
       <w:r>
         <w:rPr>
@@ -3367,7 +3367,7 @@
         <w:rPr>
           <w:highlight w:val="yellow"/>
         </w:rPr>
-        <w:t xml:space="preserve">P1 and P2: shares of cooperation codes in Corpus A and of competition codes in Corpus B, with one short documentary example each; asymmetry between Turkish and Chinese sources in self-promotion and exclusion markers.</w:t>
+        <w:t xml:space="preserve">P1 and P2: shares of cooperation codes in bilateral documents and of competition codes in unilateral documents, with one short documentary example each; asymmetry between Turkish and Chinese sources in self-promotion and exclusion markers.</w:t>
       </w:r>
     </w:p>
     <w:p>
@@ -3425,7 +3425,7 @@
         <w:rPr>
           <w:highlight w:val="yellow"/>
         </w:rPr>
-        <w:t xml:space="preserve">Conclusions (author): whether and how far the separation principle travels to inter-state heritage tourism; how the competing explanations of market-based separation (Bengtsson &amp; Kock, 2000, p. 420), geographic and cultural distance (Deng &amp; Hu, 2019) and status asymmetry (Norheim-Hansen et al., 2026) fare against the findings; one or two policy implications for Türkiye; limitations (corpus selection, Chinese-language sources, the construct–measure gap in value capture, arrivals as border records rather than tourist counts).</w:t>
+        <w:t xml:space="preserve">Conclusions (author): whether and how far the separation principle travels to inter-state heritage tourism; how the competing explanations of market-based separation (Bengtsson &amp; Kock, 2000, p. 420), geographic and cultural distance (Deng &amp; Hu, 2019) and status asymmetry (Norheim-Hansen et al., 2026) fare against the findings; one or two policy implications for Türkiye; limitations (document selection, Chinese-language sources, the construct–measure gap in value capture, arrivals as border records rather than tourist counts).</w:t>
       </w:r>
     </w:p>
     <w:p>
@@ -4868,7 +4868,7 @@
                 <w:sz w:val="18"/>
                 <w:szCs w:val="18"/>
               </w:rPr>
-              <w:t xml:space="preserve"> Bu çalışmanın hazırlanması sırasında yazar(lar), literatür taraması ve künye doğrulama, doküman korpusunun hazırlanması ve Çince metinlerin çevirisi, kodlama şemasının pilot sınaması, insan kodlayıcılar arasındaki uyuşmazlıkların çözümünde bağımsız üçüncü kodlama, betimsel hesaplamalar ile Giriş, Kuramsal Çerçeve ve Yöntem bölümlerinde taslak ve dil desteği amacıyla Claude (Anthropic) kullanmıştır. Bu araç/hizmeti kullandıktan sonra, yazar(lar) içeriği gerektiği şekilde gözden geçirip düzenlemiş ve yayınlanan makalenin içeriği konusunda tüm sorumluluğu üstlenmiştir.</w:t>
+              <w:t xml:space="preserve"> Bu çalışmanın hazırlanması sırasında yazar(lar), literatür taraması ve künye doğrulama, incelenen belgelerin hazırlanması ve Çince metinlerin çevirisi, kodlama şemasının pilot sınaması, insan kodlayıcılar arasındaki uyuşmazlıkların çözümünde bağımsız üçüncü kodlama, betimsel hesaplamalar ile Giriş, Kuramsal Çerçeve ve Yöntem bölümlerinde taslak ve dil desteği amacıyla Claude (Anthropic) kullanmıştır. Bu araç/hizmeti kullandıktan sonra, yazar(lar) içeriği gerektiği şekilde gözden geçirip düzenlemiş ve yayınlanan makalenin içeriği konusunda tüm sorumluluğu üstlenmiştir.</w:t>
             </w:r>
           </w:p>
         </w:tc>
@@ -5089,7 +5089,7 @@
                 <w:szCs w:val="18"/>
                 <w:lang w:val="en-US"/>
               </w:rPr>
-              <w:t xml:space="preserve"> During the preparation of this study the author(s) used Claude (Anthropic) in order to literature search and reference verification, preparation of the document corpus and translation of Chinese texts, pilot testing of the coding scheme, an independent third coding used to resolve disagreements between the human coders, descriptive calculations, and drafting and language support in the Introduction, Theoretical Framework and Method sections. After using this tool/service, the author(s) reviewed and edited the content as needed and take(s) full responsibility for the content of the published article.</w:t>
+              <w:t xml:space="preserve"> During the preparation of this study the author(s) used Claude (Anthropic) in order to literature search and reference verification, preparation of the document set and translation of Chinese texts, pilot testing of the coding scheme, an independent third coding used to resolve disagreements between the human coders, descriptive calculations, and drafting and language support in the Introduction, Theoretical Framework and Method sections. After using this tool/service, the author(s) reviewed and edited the content as needed and take(s) full responsibility for the content of the published article.</w:t>
             </w:r>
           </w:p>
         </w:tc>

</xml_diff>

<commit_message>
Son 'korpus' ifadeleri kaldırıldı
Co-Authored-By: Claude Opus 5.5 <noreply@anthropic.com>
Claude-Session: https://claude.ai/code/session_015BkByremFh97j9aWiMCq3J
</commit_message>
<xml_diff>
--- a/makaleler/turkiye-cin-ortaklasa-rekabet/teslim/makale-anonim-taslak-v1.docx
+++ b/makaleler/turkiye-cin-ortaklasa-rekabet/teslim/makale-anonim-taslak-v1.docx
@@ -1493,7 +1493,7 @@
         <w:rPr>
           <w:highlight w:val="yellow"/>
         </w:rPr>
-        <w:t xml:space="preserve">YAZAR YAZACAK – yönerge: Tablo 1: Korpus özeti (A: 25 belge, B: 24 belge; taraf dağılımı; dönem dağılımı). Kaynak: yazar kiti Tablo 1.</w:t>
+        <w:t xml:space="preserve">YAZAR YAZACAK – yönerge: Tablo 1: İncelenen belgelerin bileşimi (ikili 25, tek taraflı 24 belge; taraf dağılımı; dönem dağılımı). Kaynak: yazar kiti Tablo 1.</w:t>
       </w:r>
     </w:p>
     <w:p>
@@ -1777,7 +1777,7 @@
         <w:rPr>
           <w:highlight w:val="yellow"/>
         </w:rPr>
-        <w:t xml:space="preserve">YAZAR YAZACAK – yönerge: Korpus seçim yanlılığı (Bowen 2009); erişilemeyen 12 belge; Çince metinlerin İngilizce/çeviri sürümleri.</w:t>
+        <w:t xml:space="preserve">YAZAR YAZACAK – yönerge: Belge seçim yanlılığı (Bowen 2009); erişilemeyen 12 belge; Çince metinlerin İngilizce/çeviri sürümleri.</w:t>
       </w:r>
     </w:p>
     <w:p>

</xml_diff>

<commit_message>
Bulgular 4.1 ve 5 tablo docx'e yerleştirildi
Co-Authored-By: Claude Opus 5.5 <noreply@anthropic.com>
Claude-Session: https://claude.ai/code/session_015BkByremFh97j9aWiMCq3J
</commit_message>
<xml_diff>
--- a/makaleler/turkiye-cin-ortaklasa-rekabet/teslim/makale-anonim-taslak-v1.docx
+++ b/makaleler/turkiye-cin-ortaklasa-rekabet/teslim/makale-anonim-taslak-v1.docx
@@ -1482,7 +1482,7 @@
         <w:rPr>
           <w:szCs w:val="22"/>
         </w:rPr>
-        <w:t xml:space="preserve">4.1. Belgelerin ve kodlamanın genel görünümü</w:t>
+        <w:t xml:space="preserve">4.1. Belgelerin ve Kodlamanın Genel Görünümü</w:t>
       </w:r>
     </w:p>
     <w:p>
@@ -1490,10 +1490,550 @@
         <w:pStyle w:val="Gvdemetin"/>
       </w:pPr>
       <w:r>
-        <w:rPr>
-          <w:highlight w:val="yellow"/>
-        </w:rPr>
-        <w:t xml:space="preserve">YAZAR YAZACAK – yönerge: Tablo 1: İncelenen belgelerin bileşimi (ikili 25, tek taraflı 24 belge; taraf dağılımı; dönem dağılımı). Kaynak: yazar kiti Tablo 1.</w:t>
+        <w:rPr/>
+        <w:t xml:space="preserve">İncelenen 49 belgenin 25'i ikili, 24'ü tek taraflı belgedir ve iki ülkenin kaynakları her iki grupta da dengeli biçimde temsil edilmektedir (Tablo 1). Belgelerden çıkarılan 368 anlam biriminden, üç kodlamanın da farklı alan verdiği 5 birim dışarıda bırakıldığı için analiz 363 birim üzerinden yapılmıştır. Bu birimlerin alanlara dağılımı dengesizdir: bağlantısallık 98, turist akışı 123 ve anlatı 122 birim içerirken değer yakalama alanında yalnızca 20 birim bulunmaktadır. Yönelim bakımından birimlerin 139'u iş birliği, 76'sı rekabet, 6'sı karma kodu almış; 142'si ise açık bir işaret taşımadığı için nötr olarak kodlanmıştır. Başka bir deyişle resmî belgelerdeki ifadelerin yaklaşık %39'u ne iş birliğini ne de rekabeti açıkça dile getirmektedir. Aşağıdaki alt bölümlerde iş birliği ve rekabet payları, bu nötr birimler hem dahil hem hariç tutularak raporlanmaktadır.</w:t>
+      </w:r>
+    </w:p>
+    <w:p>
+      <w:pPr>
+        <w:keepNext/>
+        <w:spacing w:before="120" w:after="120"/>
+        <w:jc w:val="center"/>
+      </w:pPr>
+      <w:r>
+        <w:rPr>
+          <w:b/>
+          <w:sz w:val="20"/>
+          <w:szCs w:val="20"/>
+        </w:rPr>
+        <w:t xml:space="preserve">Tablo 1. </w:t>
+      </w:r>
+      <w:r>
+        <w:rPr>
+          <w:sz w:val="20"/>
+          <w:szCs w:val="20"/>
+        </w:rPr>
+        <w:t xml:space="preserve">İncelenen Belgelerin Bileşimi</w:t>
+      </w:r>
+    </w:p>
+    <w:tbl>
+      <w:tblPr>
+        <w:tblW w:w="5000" w:type="pct"/>
+        <w:jc w:val="center"/>
+        <w:tblBorders>
+          <w:top w:val="single" w:sz="8" w:space="0" w:color="auto"/>
+          <w:left w:val="none" w:sz="0" w:space="0" w:color="auto"/>
+          <w:bottom w:val="single" w:sz="8" w:space="0" w:color="auto"/>
+          <w:right w:val="none" w:sz="0" w:space="0" w:color="auto"/>
+          <w:insideH w:val="none" w:sz="0" w:space="0" w:color="auto"/>
+          <w:insideV w:val="none" w:sz="0" w:space="0" w:color="auto"/>
+        </w:tblBorders>
+      </w:tblPr>
+      <w:tblGrid>
+        <w:gridCol w:w="2600"/>
+        <w:gridCol w:w="1350"/>
+        <w:gridCol w:w="1350"/>
+        <w:gridCol w:w="1350"/>
+        <w:gridCol w:w="1350"/>
+        <w:gridCol w:w="1350"/>
+      </w:tblGrid>
+      <w:tr>
+        <w:trPr>
+          <w:tblHeader/>
+        </w:trPr>
+        <w:tc>
+          <w:tcPr>
+            <w:tcW w:w="2600" w:type="dxa"/>
+            <w:tcBorders>
+              <w:bottom w:val="single" w:sz="6" w:space="0" w:color="auto"/>
+            </w:tcBorders>
+          </w:tcPr>
+          <w:p>
+            <w:pPr>
+              <w:spacing w:before="20" w:after="20"/>
+              <w:jc w:val="left"/>
+            </w:pPr>
+            <w:r>
+              <w:rPr>
+                <w:b/>
+                <w:sz w:val="18"/>
+                <w:szCs w:val="18"/>
+              </w:rPr>
+              <w:t xml:space="preserve">Belge grubu</w:t>
+            </w:r>
+          </w:p>
+        </w:tc>
+        <w:tc>
+          <w:tcPr>
+            <w:tcW w:w="1350" w:type="dxa"/>
+            <w:tcBorders>
+              <w:bottom w:val="single" w:sz="6" w:space="0" w:color="auto"/>
+            </w:tcBorders>
+          </w:tcPr>
+          <w:p>
+            <w:pPr>
+              <w:spacing w:before="20" w:after="20"/>
+              <w:jc w:val="center"/>
+            </w:pPr>
+            <w:r>
+              <w:rPr>
+                <w:b/>
+                <w:sz w:val="18"/>
+                <w:szCs w:val="18"/>
+              </w:rPr>
+              <w:t xml:space="preserve">Türk</w:t>
+            </w:r>
+          </w:p>
+        </w:tc>
+        <w:tc>
+          <w:tcPr>
+            <w:tcW w:w="1350" w:type="dxa"/>
+            <w:tcBorders>
+              <w:bottom w:val="single" w:sz="6" w:space="0" w:color="auto"/>
+            </w:tcBorders>
+          </w:tcPr>
+          <w:p>
+            <w:pPr>
+              <w:spacing w:before="20" w:after="20"/>
+              <w:jc w:val="center"/>
+            </w:pPr>
+            <w:r>
+              <w:rPr>
+                <w:b/>
+                <w:sz w:val="18"/>
+                <w:szCs w:val="18"/>
+              </w:rPr>
+              <w:t xml:space="preserve">Çin</w:t>
+            </w:r>
+          </w:p>
+        </w:tc>
+        <w:tc>
+          <w:tcPr>
+            <w:tcW w:w="1350" w:type="dxa"/>
+            <w:tcBorders>
+              <w:bottom w:val="single" w:sz="6" w:space="0" w:color="auto"/>
+            </w:tcBorders>
+          </w:tcPr>
+          <w:p>
+            <w:pPr>
+              <w:spacing w:before="20" w:after="20"/>
+              <w:jc w:val="center"/>
+            </w:pPr>
+            <w:r>
+              <w:rPr>
+                <w:b/>
+                <w:sz w:val="18"/>
+                <w:szCs w:val="18"/>
+              </w:rPr>
+              <w:t xml:space="preserve">Ortak</w:t>
+            </w:r>
+          </w:p>
+        </w:tc>
+        <w:tc>
+          <w:tcPr>
+            <w:tcW w:w="1350" w:type="dxa"/>
+            <w:tcBorders>
+              <w:bottom w:val="single" w:sz="6" w:space="0" w:color="auto"/>
+            </w:tcBorders>
+          </w:tcPr>
+          <w:p>
+            <w:pPr>
+              <w:spacing w:before="20" w:after="20"/>
+              <w:jc w:val="center"/>
+            </w:pPr>
+            <w:r>
+              <w:rPr>
+                <w:b/>
+                <w:sz w:val="18"/>
+                <w:szCs w:val="18"/>
+              </w:rPr>
+              <w:t xml:space="preserve">Belge</w:t>
+            </w:r>
+          </w:p>
+        </w:tc>
+        <w:tc>
+          <w:tcPr>
+            <w:tcW w:w="1350" w:type="dxa"/>
+            <w:tcBorders>
+              <w:bottom w:val="single" w:sz="6" w:space="0" w:color="auto"/>
+            </w:tcBorders>
+          </w:tcPr>
+          <w:p>
+            <w:pPr>
+              <w:spacing w:before="20" w:after="20"/>
+              <w:jc w:val="center"/>
+            </w:pPr>
+            <w:r>
+              <w:rPr>
+                <w:b/>
+                <w:sz w:val="18"/>
+                <w:szCs w:val="18"/>
+              </w:rPr>
+              <w:t xml:space="preserve">Anlam birimi</w:t>
+            </w:r>
+          </w:p>
+        </w:tc>
+      </w:tr>
+      <w:tr>
+        <w:tc>
+          <w:tcPr>
+            <w:tcW w:w="2600" w:type="dxa"/>
+          </w:tcPr>
+          <w:p>
+            <w:pPr>
+              <w:spacing w:before="20" w:after="20"/>
+              <w:jc w:val="left"/>
+            </w:pPr>
+            <w:r>
+              <w:rPr>
+                <w:sz w:val="18"/>
+                <w:szCs w:val="18"/>
+              </w:rPr>
+              <w:t xml:space="preserve">İkili belgeler</w:t>
+            </w:r>
+          </w:p>
+        </w:tc>
+        <w:tc>
+          <w:tcPr>
+            <w:tcW w:w="1350" w:type="dxa"/>
+          </w:tcPr>
+          <w:p>
+            <w:pPr>
+              <w:spacing w:before="20" w:after="20"/>
+              <w:jc w:val="center"/>
+            </w:pPr>
+            <w:r>
+              <w:rPr>
+                <w:sz w:val="18"/>
+                <w:szCs w:val="18"/>
+              </w:rPr>
+              <w:t xml:space="preserve">11</w:t>
+            </w:r>
+          </w:p>
+        </w:tc>
+        <w:tc>
+          <w:tcPr>
+            <w:tcW w:w="1350" w:type="dxa"/>
+          </w:tcPr>
+          <w:p>
+            <w:pPr>
+              <w:spacing w:before="20" w:after="20"/>
+              <w:jc w:val="center"/>
+            </w:pPr>
+            <w:r>
+              <w:rPr>
+                <w:sz w:val="18"/>
+                <w:szCs w:val="18"/>
+              </w:rPr>
+              <w:t xml:space="preserve">12</w:t>
+            </w:r>
+          </w:p>
+        </w:tc>
+        <w:tc>
+          <w:tcPr>
+            <w:tcW w:w="1350" w:type="dxa"/>
+          </w:tcPr>
+          <w:p>
+            <w:pPr>
+              <w:spacing w:before="20" w:after="20"/>
+              <w:jc w:val="center"/>
+            </w:pPr>
+            <w:r>
+              <w:rPr>
+                <w:sz w:val="18"/>
+                <w:szCs w:val="18"/>
+              </w:rPr>
+              <w:t xml:space="preserve">2</w:t>
+            </w:r>
+          </w:p>
+        </w:tc>
+        <w:tc>
+          <w:tcPr>
+            <w:tcW w:w="1350" w:type="dxa"/>
+          </w:tcPr>
+          <w:p>
+            <w:pPr>
+              <w:spacing w:before="20" w:after="20"/>
+              <w:jc w:val="center"/>
+            </w:pPr>
+            <w:r>
+              <w:rPr>
+                <w:sz w:val="18"/>
+                <w:szCs w:val="18"/>
+              </w:rPr>
+              <w:t xml:space="preserve">25</w:t>
+            </w:r>
+          </w:p>
+        </w:tc>
+        <w:tc>
+          <w:tcPr>
+            <w:tcW w:w="1350" w:type="dxa"/>
+          </w:tcPr>
+          <w:p>
+            <w:pPr>
+              <w:spacing w:before="20" w:after="20"/>
+              <w:jc w:val="center"/>
+            </w:pPr>
+            <w:r>
+              <w:rPr>
+                <w:sz w:val="18"/>
+                <w:szCs w:val="18"/>
+              </w:rPr>
+              <w:t xml:space="preserve">179</w:t>
+            </w:r>
+          </w:p>
+        </w:tc>
+      </w:tr>
+      <w:tr>
+        <w:tc>
+          <w:tcPr>
+            <w:tcW w:w="2600" w:type="dxa"/>
+          </w:tcPr>
+          <w:p>
+            <w:pPr>
+              <w:spacing w:before="20" w:after="20"/>
+              <w:jc w:val="left"/>
+            </w:pPr>
+            <w:r>
+              <w:rPr>
+                <w:sz w:val="18"/>
+                <w:szCs w:val="18"/>
+              </w:rPr>
+              <w:t xml:space="preserve">Tek taraflı belgeler</w:t>
+            </w:r>
+          </w:p>
+        </w:tc>
+        <w:tc>
+          <w:tcPr>
+            <w:tcW w:w="1350" w:type="dxa"/>
+          </w:tcPr>
+          <w:p>
+            <w:pPr>
+              <w:spacing w:before="20" w:after="20"/>
+              <w:jc w:val="center"/>
+            </w:pPr>
+            <w:r>
+              <w:rPr>
+                <w:sz w:val="18"/>
+                <w:szCs w:val="18"/>
+              </w:rPr>
+              <w:t xml:space="preserve">12</w:t>
+            </w:r>
+          </w:p>
+        </w:tc>
+        <w:tc>
+          <w:tcPr>
+            <w:tcW w:w="1350" w:type="dxa"/>
+          </w:tcPr>
+          <w:p>
+            <w:pPr>
+              <w:spacing w:before="20" w:after="20"/>
+              <w:jc w:val="center"/>
+            </w:pPr>
+            <w:r>
+              <w:rPr>
+                <w:sz w:val="18"/>
+                <w:szCs w:val="18"/>
+              </w:rPr>
+              <w:t xml:space="preserve">12</w:t>
+            </w:r>
+          </w:p>
+        </w:tc>
+        <w:tc>
+          <w:tcPr>
+            <w:tcW w:w="1350" w:type="dxa"/>
+          </w:tcPr>
+          <w:p>
+            <w:pPr>
+              <w:spacing w:before="20" w:after="20"/>
+              <w:jc w:val="center"/>
+            </w:pPr>
+            <w:r>
+              <w:rPr>
+                <w:sz w:val="18"/>
+                <w:szCs w:val="18"/>
+              </w:rPr>
+              <w:t xml:space="preserve">0</w:t>
+            </w:r>
+          </w:p>
+        </w:tc>
+        <w:tc>
+          <w:tcPr>
+            <w:tcW w:w="1350" w:type="dxa"/>
+          </w:tcPr>
+          <w:p>
+            <w:pPr>
+              <w:spacing w:before="20" w:after="20"/>
+              <w:jc w:val="center"/>
+            </w:pPr>
+            <w:r>
+              <w:rPr>
+                <w:sz w:val="18"/>
+                <w:szCs w:val="18"/>
+              </w:rPr>
+              <w:t xml:space="preserve">24</w:t>
+            </w:r>
+          </w:p>
+        </w:tc>
+        <w:tc>
+          <w:tcPr>
+            <w:tcW w:w="1350" w:type="dxa"/>
+          </w:tcPr>
+          <w:p>
+            <w:pPr>
+              <w:spacing w:before="20" w:after="20"/>
+              <w:jc w:val="center"/>
+            </w:pPr>
+            <w:r>
+              <w:rPr>
+                <w:sz w:val="18"/>
+                <w:szCs w:val="18"/>
+              </w:rPr>
+              <w:t xml:space="preserve">189</w:t>
+            </w:r>
+          </w:p>
+        </w:tc>
+      </w:tr>
+      <w:tr>
+        <w:tc>
+          <w:tcPr>
+            <w:tcW w:w="2600" w:type="dxa"/>
+          </w:tcPr>
+          <w:p>
+            <w:pPr>
+              <w:spacing w:before="20" w:after="20"/>
+              <w:jc w:val="left"/>
+            </w:pPr>
+            <w:r>
+              <w:rPr>
+                <w:sz w:val="18"/>
+                <w:szCs w:val="18"/>
+              </w:rPr>
+              <w:t xml:space="preserve">Toplam</w:t>
+            </w:r>
+          </w:p>
+        </w:tc>
+        <w:tc>
+          <w:tcPr>
+            <w:tcW w:w="1350" w:type="dxa"/>
+          </w:tcPr>
+          <w:p>
+            <w:pPr>
+              <w:spacing w:before="20" w:after="20"/>
+              <w:jc w:val="center"/>
+            </w:pPr>
+            <w:r>
+              <w:rPr>
+                <w:sz w:val="18"/>
+                <w:szCs w:val="18"/>
+              </w:rPr>
+              <w:t xml:space="preserve">23</w:t>
+            </w:r>
+          </w:p>
+        </w:tc>
+        <w:tc>
+          <w:tcPr>
+            <w:tcW w:w="1350" w:type="dxa"/>
+          </w:tcPr>
+          <w:p>
+            <w:pPr>
+              <w:spacing w:before="20" w:after="20"/>
+              <w:jc w:val="center"/>
+            </w:pPr>
+            <w:r>
+              <w:rPr>
+                <w:sz w:val="18"/>
+                <w:szCs w:val="18"/>
+              </w:rPr>
+              <w:t xml:space="preserve">24</w:t>
+            </w:r>
+          </w:p>
+        </w:tc>
+        <w:tc>
+          <w:tcPr>
+            <w:tcW w:w="1350" w:type="dxa"/>
+          </w:tcPr>
+          <w:p>
+            <w:pPr>
+              <w:spacing w:before="20" w:after="20"/>
+              <w:jc w:val="center"/>
+            </w:pPr>
+            <w:r>
+              <w:rPr>
+                <w:sz w:val="18"/>
+                <w:szCs w:val="18"/>
+              </w:rPr>
+              <w:t xml:space="preserve">2</w:t>
+            </w:r>
+          </w:p>
+        </w:tc>
+        <w:tc>
+          <w:tcPr>
+            <w:tcW w:w="1350" w:type="dxa"/>
+          </w:tcPr>
+          <w:p>
+            <w:pPr>
+              <w:spacing w:before="20" w:after="20"/>
+              <w:jc w:val="center"/>
+            </w:pPr>
+            <w:r>
+              <w:rPr>
+                <w:sz w:val="18"/>
+                <w:szCs w:val="18"/>
+              </w:rPr>
+              <w:t xml:space="preserve">49</w:t>
+            </w:r>
+          </w:p>
+        </w:tc>
+        <w:tc>
+          <w:tcPr>
+            <w:tcW w:w="1350" w:type="dxa"/>
+          </w:tcPr>
+          <w:p>
+            <w:pPr>
+              <w:spacing w:before="20" w:after="20"/>
+              <w:jc w:val="center"/>
+            </w:pPr>
+            <w:r>
+              <w:rPr>
+                <w:sz w:val="18"/>
+                <w:szCs w:val="18"/>
+              </w:rPr>
+              <w:t xml:space="preserve">368</w:t>
+            </w:r>
+          </w:p>
+        </w:tc>
+      </w:tr>
+    </w:tbl>
+    <w:p>
+      <w:pPr>
+        <w:spacing w:before="60" w:after="120"/>
+      </w:pPr>
+      <w:r>
+        <w:rPr>
+          <w:b/>
+          <w:sz w:val="18"/>
+          <w:szCs w:val="18"/>
+        </w:rPr>
+        <w:t xml:space="preserve">Not: </w:t>
+      </w:r>
+      <w:r>
+        <w:rPr>
+          <w:sz w:val="18"/>
+          <w:szCs w:val="18"/>
+        </w:rPr>
+        <w:t xml:space="preserve">Analiz, üç kodlamanın da farklı alan verdiği 5 birim çıkarıldıktan sonra 363 birim üzerinden yapılmıştır.</w:t>
+      </w:r>
+    </w:p>
+    <w:p>
+      <w:pPr>
+        <w:pStyle w:val="ikincidzeybalk"/>
+      </w:pPr>
+      <w:r>
+        <w:rPr>
+          <w:szCs w:val="22"/>
+        </w:rPr>
+        <w:t xml:space="preserve">4.2. İkili ve Tek Taraflı Belgelerde Yönelim</w:t>
       </w:r>
     </w:p>
     <w:p>
@@ -1501,10 +2041,547 @@
         <w:pStyle w:val="Gvdemetin"/>
       </w:pPr>
       <w:r>
-        <w:rPr>
-          <w:highlight w:val="yellow"/>
-        </w:rPr>
-        <w:t xml:space="preserve">YAZAR YAZACAK – yönerge: Tablo 2: 368 birimin arena × yönelim (İB/RK/KR/NÖ) dağılımı, NÖ dahil ve hariç iki sütun. Kaynak: stats.json → `v2.arena_yonelim` (insan kodlarıyla yeniden üretilecek).</w:t>
+        <w:rPr/>
+        <w:t xml:space="preserve">Beklendiği gibi, iki ülkenin birlikte ürettiği ya da birbirine hitap ettiği belgelerde iş birliği dili açıkça baskındır. İkili belgelerdeki 177 birimin %49,7'si iş birliği, %20,3'ü rekabet kodu almıştır; başka bir deyişle ikili belgelerde iş birliği işaretleri rekabet işaretlerinin yaklaşık iki buçuk katıdır (Tablo 2). Bu üstünlük, sonuçlar her kodlayıcı için ayrı ayrı ve yalnızca iki kodlayıcının uyuştuğu birimler için hesaplandığında da korunmaktadır. Dolayısıyla Ö1 desteklenmektedir.</w:t>
+      </w:r>
+    </w:p>
+    <w:p>
+      <w:pPr>
+        <w:keepNext/>
+        <w:spacing w:before="120" w:after="120"/>
+        <w:jc w:val="center"/>
+      </w:pPr>
+      <w:r>
+        <w:rPr>
+          <w:b/>
+          <w:sz w:val="20"/>
+          <w:szCs w:val="20"/>
+        </w:rPr>
+        <w:t xml:space="preserve">Tablo 2. </w:t>
+      </w:r>
+      <w:r>
+        <w:rPr>
+          <w:sz w:val="20"/>
+          <w:szCs w:val="20"/>
+        </w:rPr>
+        <w:t xml:space="preserve">Belge Gruplarına Göre Yönelim</w:t>
+      </w:r>
+    </w:p>
+    <w:tbl>
+      <w:tblPr>
+        <w:tblW w:w="5000" w:type="pct"/>
+        <w:jc w:val="center"/>
+        <w:tblBorders>
+          <w:top w:val="single" w:sz="8" w:space="0" w:color="auto"/>
+          <w:left w:val="none" w:sz="0" w:space="0" w:color="auto"/>
+          <w:bottom w:val="single" w:sz="8" w:space="0" w:color="auto"/>
+          <w:right w:val="none" w:sz="0" w:space="0" w:color="auto"/>
+          <w:insideH w:val="none" w:sz="0" w:space="0" w:color="auto"/>
+          <w:insideV w:val="none" w:sz="0" w:space="0" w:color="auto"/>
+        </w:tblBorders>
+      </w:tblPr>
+      <w:tblGrid>
+        <w:gridCol w:w="2000"/>
+        <w:gridCol w:w="1050"/>
+        <w:gridCol w:w="1050"/>
+        <w:gridCol w:w="1050"/>
+        <w:gridCol w:w="1050"/>
+        <w:gridCol w:w="1050"/>
+        <w:gridCol w:w="1050"/>
+        <w:gridCol w:w="1050"/>
+      </w:tblGrid>
+      <w:tr>
+        <w:trPr>
+          <w:tblHeader/>
+        </w:trPr>
+        <w:tc>
+          <w:tcPr>
+            <w:tcW w:w="2000" w:type="dxa"/>
+            <w:tcBorders>
+              <w:bottom w:val="single" w:sz="6" w:space="0" w:color="auto"/>
+            </w:tcBorders>
+          </w:tcPr>
+          <w:p>
+            <w:pPr>
+              <w:spacing w:before="20" w:after="20"/>
+              <w:jc w:val="left"/>
+            </w:pPr>
+            <w:r>
+              <w:rPr>
+                <w:b/>
+                <w:sz w:val="18"/>
+                <w:szCs w:val="18"/>
+              </w:rPr>
+              <w:t xml:space="preserve">Belge grubu</w:t>
+            </w:r>
+          </w:p>
+        </w:tc>
+        <w:tc>
+          <w:tcPr>
+            <w:tcW w:w="1050" w:type="dxa"/>
+            <w:tcBorders>
+              <w:bottom w:val="single" w:sz="6" w:space="0" w:color="auto"/>
+            </w:tcBorders>
+          </w:tcPr>
+          <w:p>
+            <w:pPr>
+              <w:spacing w:before="20" w:after="20"/>
+              <w:jc w:val="center"/>
+            </w:pPr>
+            <w:r>
+              <w:rPr>
+                <w:b/>
+                <w:sz w:val="18"/>
+                <w:szCs w:val="18"/>
+              </w:rPr>
+              <w:t xml:space="preserve">n</w:t>
+            </w:r>
+          </w:p>
+        </w:tc>
+        <w:tc>
+          <w:tcPr>
+            <w:tcW w:w="1050" w:type="dxa"/>
+            <w:tcBorders>
+              <w:bottom w:val="single" w:sz="6" w:space="0" w:color="auto"/>
+            </w:tcBorders>
+          </w:tcPr>
+          <w:p>
+            <w:pPr>
+              <w:spacing w:before="20" w:after="20"/>
+              <w:jc w:val="center"/>
+            </w:pPr>
+            <w:r>
+              <w:rPr>
+                <w:b/>
+                <w:sz w:val="18"/>
+                <w:szCs w:val="18"/>
+              </w:rPr>
+              <w:t xml:space="preserve">İş birliği</w:t>
+            </w:r>
+          </w:p>
+        </w:tc>
+        <w:tc>
+          <w:tcPr>
+            <w:tcW w:w="1050" w:type="dxa"/>
+            <w:tcBorders>
+              <w:bottom w:val="single" w:sz="6" w:space="0" w:color="auto"/>
+            </w:tcBorders>
+          </w:tcPr>
+          <w:p>
+            <w:pPr>
+              <w:spacing w:before="20" w:after="20"/>
+              <w:jc w:val="center"/>
+            </w:pPr>
+            <w:r>
+              <w:rPr>
+                <w:b/>
+                <w:sz w:val="18"/>
+                <w:szCs w:val="18"/>
+              </w:rPr>
+              <w:t xml:space="preserve">Rekabet</w:t>
+            </w:r>
+          </w:p>
+        </w:tc>
+        <w:tc>
+          <w:tcPr>
+            <w:tcW w:w="1050" w:type="dxa"/>
+            <w:tcBorders>
+              <w:bottom w:val="single" w:sz="6" w:space="0" w:color="auto"/>
+            </w:tcBorders>
+          </w:tcPr>
+          <w:p>
+            <w:pPr>
+              <w:spacing w:before="20" w:after="20"/>
+              <w:jc w:val="center"/>
+            </w:pPr>
+            <w:r>
+              <w:rPr>
+                <w:b/>
+                <w:sz w:val="18"/>
+                <w:szCs w:val="18"/>
+              </w:rPr>
+              <w:t xml:space="preserve">Karma</w:t>
+            </w:r>
+          </w:p>
+        </w:tc>
+        <w:tc>
+          <w:tcPr>
+            <w:tcW w:w="1050" w:type="dxa"/>
+            <w:tcBorders>
+              <w:bottom w:val="single" w:sz="6" w:space="0" w:color="auto"/>
+            </w:tcBorders>
+          </w:tcPr>
+          <w:p>
+            <w:pPr>
+              <w:spacing w:before="20" w:after="20"/>
+              <w:jc w:val="center"/>
+            </w:pPr>
+            <w:r>
+              <w:rPr>
+                <w:b/>
+                <w:sz w:val="18"/>
+                <w:szCs w:val="18"/>
+              </w:rPr>
+              <w:t xml:space="preserve">Nötr</w:t>
+            </w:r>
+          </w:p>
+        </w:tc>
+        <w:tc>
+          <w:tcPr>
+            <w:tcW w:w="1050" w:type="dxa"/>
+            <w:tcBorders>
+              <w:bottom w:val="single" w:sz="6" w:space="0" w:color="auto"/>
+            </w:tcBorders>
+          </w:tcPr>
+          <w:p>
+            <w:pPr>
+              <w:spacing w:before="20" w:after="20"/>
+              <w:jc w:val="center"/>
+            </w:pPr>
+            <w:r>
+              <w:rPr>
+                <w:b/>
+                <w:sz w:val="18"/>
+                <w:szCs w:val="18"/>
+              </w:rPr>
+              <w:t xml:space="preserve">İş birliği %</w:t>
+            </w:r>
+          </w:p>
+        </w:tc>
+        <w:tc>
+          <w:tcPr>
+            <w:tcW w:w="1050" w:type="dxa"/>
+            <w:tcBorders>
+              <w:bottom w:val="single" w:sz="6" w:space="0" w:color="auto"/>
+            </w:tcBorders>
+          </w:tcPr>
+          <w:p>
+            <w:pPr>
+              <w:spacing w:before="20" w:after="20"/>
+              <w:jc w:val="center"/>
+            </w:pPr>
+            <w:r>
+              <w:rPr>
+                <w:b/>
+                <w:sz w:val="18"/>
+                <w:szCs w:val="18"/>
+              </w:rPr>
+              <w:t xml:space="preserve">Rekabet %</w:t>
+            </w:r>
+          </w:p>
+        </w:tc>
+      </w:tr>
+      <w:tr>
+        <w:tc>
+          <w:tcPr>
+            <w:tcW w:w="2000" w:type="dxa"/>
+          </w:tcPr>
+          <w:p>
+            <w:pPr>
+              <w:spacing w:before="20" w:after="20"/>
+              <w:jc w:val="left"/>
+            </w:pPr>
+            <w:r>
+              <w:rPr>
+                <w:sz w:val="18"/>
+                <w:szCs w:val="18"/>
+              </w:rPr>
+              <w:t xml:space="preserve">İkili belgeler</w:t>
+            </w:r>
+          </w:p>
+        </w:tc>
+        <w:tc>
+          <w:tcPr>
+            <w:tcW w:w="1050" w:type="dxa"/>
+          </w:tcPr>
+          <w:p>
+            <w:pPr>
+              <w:spacing w:before="20" w:after="20"/>
+              <w:jc w:val="center"/>
+            </w:pPr>
+            <w:r>
+              <w:rPr>
+                <w:sz w:val="18"/>
+                <w:szCs w:val="18"/>
+              </w:rPr>
+              <w:t xml:space="preserve">177</w:t>
+            </w:r>
+          </w:p>
+        </w:tc>
+        <w:tc>
+          <w:tcPr>
+            <w:tcW w:w="1050" w:type="dxa"/>
+          </w:tcPr>
+          <w:p>
+            <w:pPr>
+              <w:spacing w:before="20" w:after="20"/>
+              <w:jc w:val="center"/>
+            </w:pPr>
+            <w:r>
+              <w:rPr>
+                <w:sz w:val="18"/>
+                <w:szCs w:val="18"/>
+              </w:rPr>
+              <w:t xml:space="preserve">88</w:t>
+            </w:r>
+          </w:p>
+        </w:tc>
+        <w:tc>
+          <w:tcPr>
+            <w:tcW w:w="1050" w:type="dxa"/>
+          </w:tcPr>
+          <w:p>
+            <w:pPr>
+              <w:spacing w:before="20" w:after="20"/>
+              <w:jc w:val="center"/>
+            </w:pPr>
+            <w:r>
+              <w:rPr>
+                <w:sz w:val="18"/>
+                <w:szCs w:val="18"/>
+              </w:rPr>
+              <w:t xml:space="preserve">36</w:t>
+            </w:r>
+          </w:p>
+        </w:tc>
+        <w:tc>
+          <w:tcPr>
+            <w:tcW w:w="1050" w:type="dxa"/>
+          </w:tcPr>
+          <w:p>
+            <w:pPr>
+              <w:spacing w:before="20" w:after="20"/>
+              <w:jc w:val="center"/>
+            </w:pPr>
+            <w:r>
+              <w:rPr>
+                <w:sz w:val="18"/>
+                <w:szCs w:val="18"/>
+              </w:rPr>
+              <w:t xml:space="preserve">3</w:t>
+            </w:r>
+          </w:p>
+        </w:tc>
+        <w:tc>
+          <w:tcPr>
+            <w:tcW w:w="1050" w:type="dxa"/>
+          </w:tcPr>
+          <w:p>
+            <w:pPr>
+              <w:spacing w:before="20" w:after="20"/>
+              <w:jc w:val="center"/>
+            </w:pPr>
+            <w:r>
+              <w:rPr>
+                <w:sz w:val="18"/>
+                <w:szCs w:val="18"/>
+              </w:rPr>
+              <w:t xml:space="preserve">50</w:t>
+            </w:r>
+          </w:p>
+        </w:tc>
+        <w:tc>
+          <w:tcPr>
+            <w:tcW w:w="1050" w:type="dxa"/>
+          </w:tcPr>
+          <w:p>
+            <w:pPr>
+              <w:spacing w:before="20" w:after="20"/>
+              <w:jc w:val="center"/>
+            </w:pPr>
+            <w:r>
+              <w:rPr>
+                <w:sz w:val="18"/>
+                <w:szCs w:val="18"/>
+              </w:rPr>
+              <w:t xml:space="preserve">49,7</w:t>
+            </w:r>
+          </w:p>
+        </w:tc>
+        <w:tc>
+          <w:tcPr>
+            <w:tcW w:w="1050" w:type="dxa"/>
+          </w:tcPr>
+          <w:p>
+            <w:pPr>
+              <w:spacing w:before="20" w:after="20"/>
+              <w:jc w:val="center"/>
+            </w:pPr>
+            <w:r>
+              <w:rPr>
+                <w:sz w:val="18"/>
+                <w:szCs w:val="18"/>
+              </w:rPr>
+              <w:t xml:space="preserve">20,3</w:t>
+            </w:r>
+          </w:p>
+        </w:tc>
+      </w:tr>
+      <w:tr>
+        <w:tc>
+          <w:tcPr>
+            <w:tcW w:w="2000" w:type="dxa"/>
+          </w:tcPr>
+          <w:p>
+            <w:pPr>
+              <w:spacing w:before="20" w:after="20"/>
+              <w:jc w:val="left"/>
+            </w:pPr>
+            <w:r>
+              <w:rPr>
+                <w:sz w:val="18"/>
+                <w:szCs w:val="18"/>
+              </w:rPr>
+              <w:t xml:space="preserve">Tek taraflı belgeler</w:t>
+            </w:r>
+          </w:p>
+        </w:tc>
+        <w:tc>
+          <w:tcPr>
+            <w:tcW w:w="1050" w:type="dxa"/>
+          </w:tcPr>
+          <w:p>
+            <w:pPr>
+              <w:spacing w:before="20" w:after="20"/>
+              <w:jc w:val="center"/>
+            </w:pPr>
+            <w:r>
+              <w:rPr>
+                <w:sz w:val="18"/>
+                <w:szCs w:val="18"/>
+              </w:rPr>
+              <w:t xml:space="preserve">186</w:t>
+            </w:r>
+          </w:p>
+        </w:tc>
+        <w:tc>
+          <w:tcPr>
+            <w:tcW w:w="1050" w:type="dxa"/>
+          </w:tcPr>
+          <w:p>
+            <w:pPr>
+              <w:spacing w:before="20" w:after="20"/>
+              <w:jc w:val="center"/>
+            </w:pPr>
+            <w:r>
+              <w:rPr>
+                <w:sz w:val="18"/>
+                <w:szCs w:val="18"/>
+              </w:rPr>
+              <w:t xml:space="preserve">51</w:t>
+            </w:r>
+          </w:p>
+        </w:tc>
+        <w:tc>
+          <w:tcPr>
+            <w:tcW w:w="1050" w:type="dxa"/>
+          </w:tcPr>
+          <w:p>
+            <w:pPr>
+              <w:spacing w:before="20" w:after="20"/>
+              <w:jc w:val="center"/>
+            </w:pPr>
+            <w:r>
+              <w:rPr>
+                <w:sz w:val="18"/>
+                <w:szCs w:val="18"/>
+              </w:rPr>
+              <w:t xml:space="preserve">40</w:t>
+            </w:r>
+          </w:p>
+        </w:tc>
+        <w:tc>
+          <w:tcPr>
+            <w:tcW w:w="1050" w:type="dxa"/>
+          </w:tcPr>
+          <w:p>
+            <w:pPr>
+              <w:spacing w:before="20" w:after="20"/>
+              <w:jc w:val="center"/>
+            </w:pPr>
+            <w:r>
+              <w:rPr>
+                <w:sz w:val="18"/>
+                <w:szCs w:val="18"/>
+              </w:rPr>
+              <w:t xml:space="preserve">3</w:t>
+            </w:r>
+          </w:p>
+        </w:tc>
+        <w:tc>
+          <w:tcPr>
+            <w:tcW w:w="1050" w:type="dxa"/>
+          </w:tcPr>
+          <w:p>
+            <w:pPr>
+              <w:spacing w:before="20" w:after="20"/>
+              <w:jc w:val="center"/>
+            </w:pPr>
+            <w:r>
+              <w:rPr>
+                <w:sz w:val="18"/>
+                <w:szCs w:val="18"/>
+              </w:rPr>
+              <w:t xml:space="preserve">92</w:t>
+            </w:r>
+          </w:p>
+        </w:tc>
+        <w:tc>
+          <w:tcPr>
+            <w:tcW w:w="1050" w:type="dxa"/>
+          </w:tcPr>
+          <w:p>
+            <w:pPr>
+              <w:spacing w:before="20" w:after="20"/>
+              <w:jc w:val="center"/>
+            </w:pPr>
+            <w:r>
+              <w:rPr>
+                <w:sz w:val="18"/>
+                <w:szCs w:val="18"/>
+              </w:rPr>
+              <w:t xml:space="preserve">27,4</w:t>
+            </w:r>
+          </w:p>
+        </w:tc>
+        <w:tc>
+          <w:tcPr>
+            <w:tcW w:w="1050" w:type="dxa"/>
+          </w:tcPr>
+          <w:p>
+            <w:pPr>
+              <w:spacing w:before="20" w:after="20"/>
+              <w:jc w:val="center"/>
+            </w:pPr>
+            <w:r>
+              <w:rPr>
+                <w:sz w:val="18"/>
+                <w:szCs w:val="18"/>
+              </w:rPr>
+              <w:t xml:space="preserve">21,5</w:t>
+            </w:r>
+          </w:p>
+        </w:tc>
+      </w:tr>
+    </w:tbl>
+    <w:p>
+      <w:pPr>
+        <w:spacing w:before="60" w:after="120"/>
+      </w:pPr>
+      <w:r>
+        <w:rPr>
+          <w:b/>
+          <w:sz w:val="18"/>
+          <w:szCs w:val="18"/>
+        </w:rPr>
+        <w:t xml:space="preserve">Not: </w:t>
+      </w:r>
+      <w:r>
+        <w:rPr>
+          <w:sz w:val="18"/>
+          <w:szCs w:val="18"/>
+        </w:rPr>
+        <w:t xml:space="preserve">Yüzdeler tüm birimler üzerinden hesaplanmıştır. Duyarlılık (iş birliği % / rekabet %): birinci kodlayıcı ikili 46,9/17,9, tek taraflı 17,5/27,0; ikinci kodlayıcı ikili 45,3/21,2, tek taraflı 35,4/16,9; iki kodlayıcının uyuştuğu birimler (n = 195) ikili 54,7/17,9, tek taraflı 29,2/20,2.</w:t>
       </w:r>
     </w:p>
     <w:p>
@@ -1512,10 +2589,8 @@
         <w:pStyle w:val="Gvdemetin"/>
       </w:pPr>
       <w:r>
-        <w:rPr>
-          <w:highlight w:val="yellow"/>
-        </w:rPr>
-        <w:t xml:space="preserve">YAZAR YAZACAK – yönerge: Kodlayıcılar arası uyum: κ(alan), κ(yönelim) + uzlaşı yöntemi tek cümle (Yöntem'de ayrıntı var).</w:t>
+        <w:rPr/>
+        <w:t xml:space="preserve">İş birliği dilinin nasıl kurulduğunu iki örnek göstermektedir. İkili belgelerde iki ülke çoğunlukla aynı hedefin ortak öznesi olarak anılır. 2010'da stratejik iş birliği ilişkisinin kurulmasına ilişkin ortak bildiri, "2012'de Türkiye'de düzenlenecek 'Çin Kültür Yılı' ve 2013'te Çin'de düzenlenecek 'Türkiye Kültür Yılı' etkinliklerini en iyi şekilde gerçekleştirmek için tüm gücün seferber edilmesi" hedefini koymaktadır. Çin kaynakları ise İpek Yolu'nu iki ülkeyi birleştiren bir geçmiş olarak anlatır. 2012'deki bir üst düzey görüşmenin özetinde şu ifade yer almaktadır: "Çin ve Türkiye binlerce dağ ve nehirle birbirinden uzak olsa da, kadim İpek Yolu iki köklü halkımızı birbirine bağlamış; el ele insan medeniyetinin dostane mübadelesi ve ortak ilerlemesinin güzel bir sayfasını yazmıştır." Bu ifadede iki ülke arasındaki büyük coğrafi uzaklık bir engel olarak değil, İpek Yolu'nun aştığı bir mesafe olarak sunulmaktadır.</w:t>
       </w:r>
     </w:p>
     <w:p>
@@ -1523,10 +2598,17 @@
         <w:pStyle w:val="Gvdemetin"/>
       </w:pPr>
       <w:r>
-        <w:rPr>
-          <w:highlight w:val="yellow"/>
-        </w:rPr>
-        <w:t xml:space="preserve">YAZAR YAZACAK – yönerge: Burada yorum yok; yalnız betim.</w:t>
+        <w:rPr/>
+        <w:t xml:space="preserve">Tek taraflı belgelere geçildiğinde tablo değişir, ancak Ö2'nin öngördüğü yönde değil. Tek taraflı belgelerde iş birliği payı %27,4'e düşerken rekabet payı %21,5 ile ikili belgelerdeki düzeyinde kalmaktadır. Azalan iş birliği dilinin yerini rekabet değil, nötr ifadeler almıştır: ikili belgelerde 50 olan nötr birim sayısı tek taraflı belgelerde 92'ye çıkmaktadır. Bu da iki ülkenin kendi kamuoyuna ve turistine seslendiğinde karşı tarafı daha az andığını, ama onu açıkça bir rakip olarak da konumlamadığını göstermektedir. Bu nedenle Ö2 yalnızca kısmen desteklenmektedir. Sonuç kodlayıcıya da duyarlıdır: tek taraflı belgelerdeki rekabet payı birinci kodlayıcının kodlarında %27,0 iken ikinci kodlayıcının kodlarında %16,9'dur.</w:t>
+      </w:r>
+    </w:p>
+    <w:p>
+      <w:pPr>
+        <w:pStyle w:val="Gvdemetin"/>
+      </w:pPr>
+      <w:r>
+        <w:rPr/>
+        <w:t xml:space="preserve">Bu bulgular, turizm açısından iki ülke arasında henüz güçlü bir rekabet zemini oluşmadığını düşündürmektedir. Türkiye ile Çin birbirine çok uzaktır ve aynı turist için doğrudan yarışan iki komşu destinasyon konumunda değildir. Konu İpek Yolu olduğunda ise ortak geçmiş vurgusu öne çıkmakta ve iş birliği dili ağır basmaktadır.</w:t>
       </w:r>
     </w:p>
     <w:p>
@@ -1537,7 +2619,7 @@
         <w:rPr>
           <w:szCs w:val="22"/>
         </w:rPr>
-        <w:t xml:space="preserve">4.2. Ö1 ve Ö2: aynı mirasın iki yüzü</w:t>
+        <w:t xml:space="preserve">4.3. Alanlara Göre Rekabet Payı</w:t>
       </w:r>
     </w:p>
     <w:p>
@@ -1545,10 +2627,1703 @@
         <w:pStyle w:val="Gvdemetin"/>
       </w:pPr>
       <w:r>
-        <w:rPr>
-          <w:highlight w:val="yellow"/>
-        </w:rPr>
-        <w:t xml:space="preserve">YAZAR YAZACAK – yönerge: İkili belgelerde İB payı; Tek taraflı belgelerde RK payı. İki belge grubunun karşılaştırması (Tablo 3).</w:t>
+        <w:rPr/>
+        <w:t xml:space="preserve">Ö3, faaliyet turiste yaklaştıkça rekabet payının artacağını öngörüyordu. Analizden önce belirlenen karar kuralına göre bu öngörü desteklenmemiştir. Nötr birimler paydadan çıkarıldığında rekabet payı bağlantısallıkta %31,8, turist akışında %36,6, anlatıda %32,8 ve değer yakalamada %44,4'tür (Tablo 3). Bu dizi düzenli bir artış göstermediği gibi iki uç arasındaki fark da (12,6 yüzde puan) destek eşiği olan 20 yüzde puanın altında kalmaktadır; sonuç bu nedenle "kısmi" olarak değerlendirilmiştir. Nötr birimler paydaya dahil edildiğinde ise fark ortadan kalkmakta ve sonuç "destek yok"a dönmektedir. Aynı hesap her kodlayıcı için ayrı ayrı ve yalnızca iki kodlayıcının uyuştuğu birimler için yapıldığında da hiçbir sette destek eşiğine ulaşılmamaktadır (Tablo 4). Dolayısıyla bu sonuç, uyuşmazlıkların nasıl çözüldüğünden bağımsızdır.</w:t>
+      </w:r>
+    </w:p>
+    <w:p>
+      <w:pPr>
+        <w:keepNext/>
+        <w:spacing w:before="120" w:after="120"/>
+        <w:jc w:val="center"/>
+      </w:pPr>
+      <w:r>
+        <w:rPr>
+          <w:b/>
+          <w:sz w:val="20"/>
+          <w:szCs w:val="20"/>
+        </w:rPr>
+        <w:t xml:space="preserve">Tablo 3. </w:t>
+      </w:r>
+      <w:r>
+        <w:rPr>
+          <w:sz w:val="20"/>
+          <w:szCs w:val="20"/>
+        </w:rPr>
+        <w:t xml:space="preserve">Alanlara Göre Yönelim ve Rekabet Payı</w:t>
+      </w:r>
+    </w:p>
+    <w:tbl>
+      <w:tblPr>
+        <w:tblW w:w="5000" w:type="pct"/>
+        <w:jc w:val="center"/>
+        <w:tblBorders>
+          <w:top w:val="single" w:sz="8" w:space="0" w:color="auto"/>
+          <w:left w:val="none" w:sz="0" w:space="0" w:color="auto"/>
+          <w:bottom w:val="single" w:sz="8" w:space="0" w:color="auto"/>
+          <w:right w:val="none" w:sz="0" w:space="0" w:color="auto"/>
+          <w:insideH w:val="none" w:sz="0" w:space="0" w:color="auto"/>
+          <w:insideV w:val="none" w:sz="0" w:space="0" w:color="auto"/>
+        </w:tblBorders>
+      </w:tblPr>
+      <w:tblGrid>
+        <w:gridCol w:w="2000"/>
+        <w:gridCol w:w="1050"/>
+        <w:gridCol w:w="1050"/>
+        <w:gridCol w:w="1050"/>
+        <w:gridCol w:w="1050"/>
+        <w:gridCol w:w="1050"/>
+        <w:gridCol w:w="1050"/>
+        <w:gridCol w:w="1050"/>
+      </w:tblGrid>
+      <w:tr>
+        <w:trPr>
+          <w:tblHeader/>
+        </w:trPr>
+        <w:tc>
+          <w:tcPr>
+            <w:tcW w:w="2000" w:type="dxa"/>
+            <w:tcBorders>
+              <w:bottom w:val="single" w:sz="6" w:space="0" w:color="auto"/>
+            </w:tcBorders>
+          </w:tcPr>
+          <w:p>
+            <w:pPr>
+              <w:spacing w:before="20" w:after="20"/>
+              <w:jc w:val="left"/>
+            </w:pPr>
+            <w:r>
+              <w:rPr>
+                <w:b/>
+                <w:sz w:val="18"/>
+                <w:szCs w:val="18"/>
+              </w:rPr>
+              <w:t xml:space="preserve">Alan</w:t>
+            </w:r>
+          </w:p>
+        </w:tc>
+        <w:tc>
+          <w:tcPr>
+            <w:tcW w:w="1050" w:type="dxa"/>
+            <w:tcBorders>
+              <w:bottom w:val="single" w:sz="6" w:space="0" w:color="auto"/>
+            </w:tcBorders>
+          </w:tcPr>
+          <w:p>
+            <w:pPr>
+              <w:spacing w:before="20" w:after="20"/>
+              <w:jc w:val="center"/>
+            </w:pPr>
+            <w:r>
+              <w:rPr>
+                <w:b/>
+                <w:sz w:val="18"/>
+                <w:szCs w:val="18"/>
+              </w:rPr>
+              <w:t xml:space="preserve">n</w:t>
+            </w:r>
+          </w:p>
+        </w:tc>
+        <w:tc>
+          <w:tcPr>
+            <w:tcW w:w="1050" w:type="dxa"/>
+            <w:tcBorders>
+              <w:bottom w:val="single" w:sz="6" w:space="0" w:color="auto"/>
+            </w:tcBorders>
+          </w:tcPr>
+          <w:p>
+            <w:pPr>
+              <w:spacing w:before="20" w:after="20"/>
+              <w:jc w:val="center"/>
+            </w:pPr>
+            <w:r>
+              <w:rPr>
+                <w:b/>
+                <w:sz w:val="18"/>
+                <w:szCs w:val="18"/>
+              </w:rPr>
+              <w:t xml:space="preserve">İş birliği</w:t>
+            </w:r>
+          </w:p>
+        </w:tc>
+        <w:tc>
+          <w:tcPr>
+            <w:tcW w:w="1050" w:type="dxa"/>
+            <w:tcBorders>
+              <w:bottom w:val="single" w:sz="6" w:space="0" w:color="auto"/>
+            </w:tcBorders>
+          </w:tcPr>
+          <w:p>
+            <w:pPr>
+              <w:spacing w:before="20" w:after="20"/>
+              <w:jc w:val="center"/>
+            </w:pPr>
+            <w:r>
+              <w:rPr>
+                <w:b/>
+                <w:sz w:val="18"/>
+                <w:szCs w:val="18"/>
+              </w:rPr>
+              <w:t xml:space="preserve">Rekabet</w:t>
+            </w:r>
+          </w:p>
+        </w:tc>
+        <w:tc>
+          <w:tcPr>
+            <w:tcW w:w="1050" w:type="dxa"/>
+            <w:tcBorders>
+              <w:bottom w:val="single" w:sz="6" w:space="0" w:color="auto"/>
+            </w:tcBorders>
+          </w:tcPr>
+          <w:p>
+            <w:pPr>
+              <w:spacing w:before="20" w:after="20"/>
+              <w:jc w:val="center"/>
+            </w:pPr>
+            <w:r>
+              <w:rPr>
+                <w:b/>
+                <w:sz w:val="18"/>
+                <w:szCs w:val="18"/>
+              </w:rPr>
+              <w:t xml:space="preserve">Karma</w:t>
+            </w:r>
+          </w:p>
+        </w:tc>
+        <w:tc>
+          <w:tcPr>
+            <w:tcW w:w="1050" w:type="dxa"/>
+            <w:tcBorders>
+              <w:bottom w:val="single" w:sz="6" w:space="0" w:color="auto"/>
+            </w:tcBorders>
+          </w:tcPr>
+          <w:p>
+            <w:pPr>
+              <w:spacing w:before="20" w:after="20"/>
+              <w:jc w:val="center"/>
+            </w:pPr>
+            <w:r>
+              <w:rPr>
+                <w:b/>
+                <w:sz w:val="18"/>
+                <w:szCs w:val="18"/>
+              </w:rPr>
+              <w:t xml:space="preserve">Nötr</w:t>
+            </w:r>
+          </w:p>
+        </w:tc>
+        <w:tc>
+          <w:tcPr>
+            <w:tcW w:w="1050" w:type="dxa"/>
+            <w:tcBorders>
+              <w:bottom w:val="single" w:sz="6" w:space="0" w:color="auto"/>
+            </w:tcBorders>
+          </w:tcPr>
+          <w:p>
+            <w:pPr>
+              <w:spacing w:before="20" w:after="20"/>
+              <w:jc w:val="center"/>
+            </w:pPr>
+            <w:r>
+              <w:rPr>
+                <w:b/>
+                <w:sz w:val="18"/>
+                <w:szCs w:val="18"/>
+              </w:rPr>
+              <w:t xml:space="preserve">Rekabet % (nötr hariç)</w:t>
+            </w:r>
+          </w:p>
+        </w:tc>
+        <w:tc>
+          <w:tcPr>
+            <w:tcW w:w="1050" w:type="dxa"/>
+            <w:tcBorders>
+              <w:bottom w:val="single" w:sz="6" w:space="0" w:color="auto"/>
+            </w:tcBorders>
+          </w:tcPr>
+          <w:p>
+            <w:pPr>
+              <w:spacing w:before="20" w:after="20"/>
+              <w:jc w:val="center"/>
+            </w:pPr>
+            <w:r>
+              <w:rPr>
+                <w:b/>
+                <w:sz w:val="18"/>
+                <w:szCs w:val="18"/>
+              </w:rPr>
+              <w:t xml:space="preserve">Rekabet % (nötr dahil)</w:t>
+            </w:r>
+          </w:p>
+        </w:tc>
+      </w:tr>
+      <w:tr>
+        <w:tc>
+          <w:tcPr>
+            <w:tcW w:w="2000" w:type="dxa"/>
+          </w:tcPr>
+          <w:p>
+            <w:pPr>
+              <w:spacing w:before="20" w:after="20"/>
+              <w:jc w:val="left"/>
+            </w:pPr>
+            <w:r>
+              <w:rPr>
+                <w:sz w:val="18"/>
+                <w:szCs w:val="18"/>
+              </w:rPr>
+              <w:t xml:space="preserve">Bağlantısallık</w:t>
+            </w:r>
+          </w:p>
+        </w:tc>
+        <w:tc>
+          <w:tcPr>
+            <w:tcW w:w="1050" w:type="dxa"/>
+          </w:tcPr>
+          <w:p>
+            <w:pPr>
+              <w:spacing w:before="20" w:after="20"/>
+              <w:jc w:val="center"/>
+            </w:pPr>
+            <w:r>
+              <w:rPr>
+                <w:sz w:val="18"/>
+                <w:szCs w:val="18"/>
+              </w:rPr>
+              <w:t xml:space="preserve">98</w:t>
+            </w:r>
+          </w:p>
+        </w:tc>
+        <w:tc>
+          <w:tcPr>
+            <w:tcW w:w="1050" w:type="dxa"/>
+          </w:tcPr>
+          <w:p>
+            <w:pPr>
+              <w:spacing w:before="20" w:after="20"/>
+              <w:jc w:val="center"/>
+            </w:pPr>
+            <w:r>
+              <w:rPr>
+                <w:sz w:val="18"/>
+                <w:szCs w:val="18"/>
+              </w:rPr>
+              <w:t xml:space="preserve">45</w:t>
+            </w:r>
+          </w:p>
+        </w:tc>
+        <w:tc>
+          <w:tcPr>
+            <w:tcW w:w="1050" w:type="dxa"/>
+          </w:tcPr>
+          <w:p>
+            <w:pPr>
+              <w:spacing w:before="20" w:after="20"/>
+              <w:jc w:val="center"/>
+            </w:pPr>
+            <w:r>
+              <w:rPr>
+                <w:sz w:val="18"/>
+                <w:szCs w:val="18"/>
+              </w:rPr>
+              <w:t xml:space="preserve">21</w:t>
+            </w:r>
+          </w:p>
+        </w:tc>
+        <w:tc>
+          <w:tcPr>
+            <w:tcW w:w="1050" w:type="dxa"/>
+          </w:tcPr>
+          <w:p>
+            <w:pPr>
+              <w:spacing w:before="20" w:after="20"/>
+              <w:jc w:val="center"/>
+            </w:pPr>
+            <w:r>
+              <w:rPr>
+                <w:sz w:val="18"/>
+                <w:szCs w:val="18"/>
+              </w:rPr>
+              <w:t xml:space="preserve">0</w:t>
+            </w:r>
+          </w:p>
+        </w:tc>
+        <w:tc>
+          <w:tcPr>
+            <w:tcW w:w="1050" w:type="dxa"/>
+          </w:tcPr>
+          <w:p>
+            <w:pPr>
+              <w:spacing w:before="20" w:after="20"/>
+              <w:jc w:val="center"/>
+            </w:pPr>
+            <w:r>
+              <w:rPr>
+                <w:sz w:val="18"/>
+                <w:szCs w:val="18"/>
+              </w:rPr>
+              <w:t xml:space="preserve">32</w:t>
+            </w:r>
+          </w:p>
+        </w:tc>
+        <w:tc>
+          <w:tcPr>
+            <w:tcW w:w="1050" w:type="dxa"/>
+          </w:tcPr>
+          <w:p>
+            <w:pPr>
+              <w:spacing w:before="20" w:after="20"/>
+              <w:jc w:val="center"/>
+            </w:pPr>
+            <w:r>
+              <w:rPr>
+                <w:sz w:val="18"/>
+                <w:szCs w:val="18"/>
+              </w:rPr>
+              <w:t xml:space="preserve">31,8</w:t>
+            </w:r>
+          </w:p>
+        </w:tc>
+        <w:tc>
+          <w:tcPr>
+            <w:tcW w:w="1050" w:type="dxa"/>
+          </w:tcPr>
+          <w:p>
+            <w:pPr>
+              <w:spacing w:before="20" w:after="20"/>
+              <w:jc w:val="center"/>
+            </w:pPr>
+            <w:r>
+              <w:rPr>
+                <w:sz w:val="18"/>
+                <w:szCs w:val="18"/>
+              </w:rPr>
+              <w:t xml:space="preserve">21,4</w:t>
+            </w:r>
+          </w:p>
+        </w:tc>
+      </w:tr>
+      <w:tr>
+        <w:tc>
+          <w:tcPr>
+            <w:tcW w:w="2000" w:type="dxa"/>
+          </w:tcPr>
+          <w:p>
+            <w:pPr>
+              <w:spacing w:before="20" w:after="20"/>
+              <w:jc w:val="left"/>
+            </w:pPr>
+            <w:r>
+              <w:rPr>
+                <w:sz w:val="18"/>
+                <w:szCs w:val="18"/>
+              </w:rPr>
+              <w:t xml:space="preserve">Turist akışı</w:t>
+            </w:r>
+          </w:p>
+        </w:tc>
+        <w:tc>
+          <w:tcPr>
+            <w:tcW w:w="1050" w:type="dxa"/>
+          </w:tcPr>
+          <w:p>
+            <w:pPr>
+              <w:spacing w:before="20" w:after="20"/>
+              <w:jc w:val="center"/>
+            </w:pPr>
+            <w:r>
+              <w:rPr>
+                <w:sz w:val="18"/>
+                <w:szCs w:val="18"/>
+              </w:rPr>
+              <w:t xml:space="preserve">123</w:t>
+            </w:r>
+          </w:p>
+        </w:tc>
+        <w:tc>
+          <w:tcPr>
+            <w:tcW w:w="1050" w:type="dxa"/>
+          </w:tcPr>
+          <w:p>
+            <w:pPr>
+              <w:spacing w:before="20" w:after="20"/>
+              <w:jc w:val="center"/>
+            </w:pPr>
+            <w:r>
+              <w:rPr>
+                <w:sz w:val="18"/>
+                <w:szCs w:val="18"/>
+              </w:rPr>
+              <w:t xml:space="preserve">49</w:t>
+            </w:r>
+          </w:p>
+        </w:tc>
+        <w:tc>
+          <w:tcPr>
+            <w:tcW w:w="1050" w:type="dxa"/>
+          </w:tcPr>
+          <w:p>
+            <w:pPr>
+              <w:spacing w:before="20" w:after="20"/>
+              <w:jc w:val="center"/>
+            </w:pPr>
+            <w:r>
+              <w:rPr>
+                <w:sz w:val="18"/>
+                <w:szCs w:val="18"/>
+              </w:rPr>
+              <w:t xml:space="preserve">30</w:t>
+            </w:r>
+          </w:p>
+        </w:tc>
+        <w:tc>
+          <w:tcPr>
+            <w:tcW w:w="1050" w:type="dxa"/>
+          </w:tcPr>
+          <w:p>
+            <w:pPr>
+              <w:spacing w:before="20" w:after="20"/>
+              <w:jc w:val="center"/>
+            </w:pPr>
+            <w:r>
+              <w:rPr>
+                <w:sz w:val="18"/>
+                <w:szCs w:val="18"/>
+              </w:rPr>
+              <w:t xml:space="preserve">3</w:t>
+            </w:r>
+          </w:p>
+        </w:tc>
+        <w:tc>
+          <w:tcPr>
+            <w:tcW w:w="1050" w:type="dxa"/>
+          </w:tcPr>
+          <w:p>
+            <w:pPr>
+              <w:spacing w:before="20" w:after="20"/>
+              <w:jc w:val="center"/>
+            </w:pPr>
+            <w:r>
+              <w:rPr>
+                <w:sz w:val="18"/>
+                <w:szCs w:val="18"/>
+              </w:rPr>
+              <w:t xml:space="preserve">41</w:t>
+            </w:r>
+          </w:p>
+        </w:tc>
+        <w:tc>
+          <w:tcPr>
+            <w:tcW w:w="1050" w:type="dxa"/>
+          </w:tcPr>
+          <w:p>
+            <w:pPr>
+              <w:spacing w:before="20" w:after="20"/>
+              <w:jc w:val="center"/>
+            </w:pPr>
+            <w:r>
+              <w:rPr>
+                <w:sz w:val="18"/>
+                <w:szCs w:val="18"/>
+              </w:rPr>
+              <w:t xml:space="preserve">36,6</w:t>
+            </w:r>
+          </w:p>
+        </w:tc>
+        <w:tc>
+          <w:tcPr>
+            <w:tcW w:w="1050" w:type="dxa"/>
+          </w:tcPr>
+          <w:p>
+            <w:pPr>
+              <w:spacing w:before="20" w:after="20"/>
+              <w:jc w:val="center"/>
+            </w:pPr>
+            <w:r>
+              <w:rPr>
+                <w:sz w:val="18"/>
+                <w:szCs w:val="18"/>
+              </w:rPr>
+              <w:t xml:space="preserve">24,4</w:t>
+            </w:r>
+          </w:p>
+        </w:tc>
+      </w:tr>
+      <w:tr>
+        <w:tc>
+          <w:tcPr>
+            <w:tcW w:w="2000" w:type="dxa"/>
+          </w:tcPr>
+          <w:p>
+            <w:pPr>
+              <w:spacing w:before="20" w:after="20"/>
+              <w:jc w:val="left"/>
+            </w:pPr>
+            <w:r>
+              <w:rPr>
+                <w:sz w:val="18"/>
+                <w:szCs w:val="18"/>
+              </w:rPr>
+              <w:t xml:space="preserve">Anlatı</w:t>
+            </w:r>
+          </w:p>
+        </w:tc>
+        <w:tc>
+          <w:tcPr>
+            <w:tcW w:w="1050" w:type="dxa"/>
+          </w:tcPr>
+          <w:p>
+            <w:pPr>
+              <w:spacing w:before="20" w:after="20"/>
+              <w:jc w:val="center"/>
+            </w:pPr>
+            <w:r>
+              <w:rPr>
+                <w:sz w:val="18"/>
+                <w:szCs w:val="18"/>
+              </w:rPr>
+              <w:t xml:space="preserve">122</w:t>
+            </w:r>
+          </w:p>
+        </w:tc>
+        <w:tc>
+          <w:tcPr>
+            <w:tcW w:w="1050" w:type="dxa"/>
+          </w:tcPr>
+          <w:p>
+            <w:pPr>
+              <w:spacing w:before="20" w:after="20"/>
+              <w:jc w:val="center"/>
+            </w:pPr>
+            <w:r>
+              <w:rPr>
+                <w:sz w:val="18"/>
+                <w:szCs w:val="18"/>
+              </w:rPr>
+              <w:t xml:space="preserve">40</w:t>
+            </w:r>
+          </w:p>
+        </w:tc>
+        <w:tc>
+          <w:tcPr>
+            <w:tcW w:w="1050" w:type="dxa"/>
+          </w:tcPr>
+          <w:p>
+            <w:pPr>
+              <w:spacing w:before="20" w:after="20"/>
+              <w:jc w:val="center"/>
+            </w:pPr>
+            <w:r>
+              <w:rPr>
+                <w:sz w:val="18"/>
+                <w:szCs w:val="18"/>
+              </w:rPr>
+              <w:t xml:space="preserve">21</w:t>
+            </w:r>
+          </w:p>
+        </w:tc>
+        <w:tc>
+          <w:tcPr>
+            <w:tcW w:w="1050" w:type="dxa"/>
+          </w:tcPr>
+          <w:p>
+            <w:pPr>
+              <w:spacing w:before="20" w:after="20"/>
+              <w:jc w:val="center"/>
+            </w:pPr>
+            <w:r>
+              <w:rPr>
+                <w:sz w:val="18"/>
+                <w:szCs w:val="18"/>
+              </w:rPr>
+              <w:t xml:space="preserve">3</w:t>
+            </w:r>
+          </w:p>
+        </w:tc>
+        <w:tc>
+          <w:tcPr>
+            <w:tcW w:w="1050" w:type="dxa"/>
+          </w:tcPr>
+          <w:p>
+            <w:pPr>
+              <w:spacing w:before="20" w:after="20"/>
+              <w:jc w:val="center"/>
+            </w:pPr>
+            <w:r>
+              <w:rPr>
+                <w:sz w:val="18"/>
+                <w:szCs w:val="18"/>
+              </w:rPr>
+              <w:t xml:space="preserve">58</w:t>
+            </w:r>
+          </w:p>
+        </w:tc>
+        <w:tc>
+          <w:tcPr>
+            <w:tcW w:w="1050" w:type="dxa"/>
+          </w:tcPr>
+          <w:p>
+            <w:pPr>
+              <w:spacing w:before="20" w:after="20"/>
+              <w:jc w:val="center"/>
+            </w:pPr>
+            <w:r>
+              <w:rPr>
+                <w:sz w:val="18"/>
+                <w:szCs w:val="18"/>
+              </w:rPr>
+              <w:t xml:space="preserve">32,8</w:t>
+            </w:r>
+          </w:p>
+        </w:tc>
+        <w:tc>
+          <w:tcPr>
+            <w:tcW w:w="1050" w:type="dxa"/>
+          </w:tcPr>
+          <w:p>
+            <w:pPr>
+              <w:spacing w:before="20" w:after="20"/>
+              <w:jc w:val="center"/>
+            </w:pPr>
+            <w:r>
+              <w:rPr>
+                <w:sz w:val="18"/>
+                <w:szCs w:val="18"/>
+              </w:rPr>
+              <w:t xml:space="preserve">17,2</w:t>
+            </w:r>
+          </w:p>
+        </w:tc>
+      </w:tr>
+      <w:tr>
+        <w:tc>
+          <w:tcPr>
+            <w:tcW w:w="2000" w:type="dxa"/>
+          </w:tcPr>
+          <w:p>
+            <w:pPr>
+              <w:spacing w:before="20" w:after="20"/>
+              <w:jc w:val="left"/>
+            </w:pPr>
+            <w:r>
+              <w:rPr>
+                <w:sz w:val="18"/>
+                <w:szCs w:val="18"/>
+              </w:rPr>
+              <w:t xml:space="preserve">Değer yakalama</w:t>
+            </w:r>
+          </w:p>
+        </w:tc>
+        <w:tc>
+          <w:tcPr>
+            <w:tcW w:w="1050" w:type="dxa"/>
+          </w:tcPr>
+          <w:p>
+            <w:pPr>
+              <w:spacing w:before="20" w:after="20"/>
+              <w:jc w:val="center"/>
+            </w:pPr>
+            <w:r>
+              <w:rPr>
+                <w:sz w:val="18"/>
+                <w:szCs w:val="18"/>
+              </w:rPr>
+              <w:t xml:space="preserve">20</w:t>
+            </w:r>
+          </w:p>
+        </w:tc>
+        <w:tc>
+          <w:tcPr>
+            <w:tcW w:w="1050" w:type="dxa"/>
+          </w:tcPr>
+          <w:p>
+            <w:pPr>
+              <w:spacing w:before="20" w:after="20"/>
+              <w:jc w:val="center"/>
+            </w:pPr>
+            <w:r>
+              <w:rPr>
+                <w:sz w:val="18"/>
+                <w:szCs w:val="18"/>
+              </w:rPr>
+              <w:t xml:space="preserve">5</w:t>
+            </w:r>
+          </w:p>
+        </w:tc>
+        <w:tc>
+          <w:tcPr>
+            <w:tcW w:w="1050" w:type="dxa"/>
+          </w:tcPr>
+          <w:p>
+            <w:pPr>
+              <w:spacing w:before="20" w:after="20"/>
+              <w:jc w:val="center"/>
+            </w:pPr>
+            <w:r>
+              <w:rPr>
+                <w:sz w:val="18"/>
+                <w:szCs w:val="18"/>
+              </w:rPr>
+              <w:t xml:space="preserve">4</w:t>
+            </w:r>
+          </w:p>
+        </w:tc>
+        <w:tc>
+          <w:tcPr>
+            <w:tcW w:w="1050" w:type="dxa"/>
+          </w:tcPr>
+          <w:p>
+            <w:pPr>
+              <w:spacing w:before="20" w:after="20"/>
+              <w:jc w:val="center"/>
+            </w:pPr>
+            <w:r>
+              <w:rPr>
+                <w:sz w:val="18"/>
+                <w:szCs w:val="18"/>
+              </w:rPr>
+              <w:t xml:space="preserve">0</w:t>
+            </w:r>
+          </w:p>
+        </w:tc>
+        <w:tc>
+          <w:tcPr>
+            <w:tcW w:w="1050" w:type="dxa"/>
+          </w:tcPr>
+          <w:p>
+            <w:pPr>
+              <w:spacing w:before="20" w:after="20"/>
+              <w:jc w:val="center"/>
+            </w:pPr>
+            <w:r>
+              <w:rPr>
+                <w:sz w:val="18"/>
+                <w:szCs w:val="18"/>
+              </w:rPr>
+              <w:t xml:space="preserve">11</w:t>
+            </w:r>
+          </w:p>
+        </w:tc>
+        <w:tc>
+          <w:tcPr>
+            <w:tcW w:w="1050" w:type="dxa"/>
+          </w:tcPr>
+          <w:p>
+            <w:pPr>
+              <w:spacing w:before="20" w:after="20"/>
+              <w:jc w:val="center"/>
+            </w:pPr>
+            <w:r>
+              <w:rPr>
+                <w:sz w:val="18"/>
+                <w:szCs w:val="18"/>
+              </w:rPr>
+              <w:t xml:space="preserve">44,4</w:t>
+            </w:r>
+          </w:p>
+        </w:tc>
+        <w:tc>
+          <w:tcPr>
+            <w:tcW w:w="1050" w:type="dxa"/>
+          </w:tcPr>
+          <w:p>
+            <w:pPr>
+              <w:spacing w:before="20" w:after="20"/>
+              <w:jc w:val="center"/>
+            </w:pPr>
+            <w:r>
+              <w:rPr>
+                <w:sz w:val="18"/>
+                <w:szCs w:val="18"/>
+              </w:rPr>
+              <w:t xml:space="preserve">20,0</w:t>
+            </w:r>
+          </w:p>
+        </w:tc>
+      </w:tr>
+    </w:tbl>
+    <w:p>
+      <w:pPr>
+        <w:spacing w:before="60" w:after="120"/>
+      </w:pPr>
+      <w:r>
+        <w:rPr>
+          <w:b/>
+          <w:sz w:val="18"/>
+          <w:szCs w:val="18"/>
+        </w:rPr>
+        <w:t xml:space="preserve">Not: </w:t>
+      </w:r>
+      <w:r>
+        <w:rPr>
+          <w:sz w:val="18"/>
+          <w:szCs w:val="18"/>
+        </w:rPr>
+        <w:t xml:space="preserve">Alanlar turiste yakınlık sırasına göre (üstten alta artan) analizden önce sıralanmıştır.</w:t>
+      </w:r>
+    </w:p>
+    <w:p>
+      <w:pPr>
+        <w:keepNext/>
+        <w:spacing w:before="120" w:after="120"/>
+        <w:jc w:val="center"/>
+      </w:pPr>
+      <w:r>
+        <w:rPr>
+          <w:b/>
+          <w:sz w:val="20"/>
+          <w:szCs w:val="20"/>
+        </w:rPr>
+        <w:t xml:space="preserve">Tablo 4. </w:t>
+      </w:r>
+      <w:r>
+        <w:rPr>
+          <w:sz w:val="20"/>
+          <w:szCs w:val="20"/>
+        </w:rPr>
+        <w:t xml:space="preserve">Ö3 Karar Kuralının Farklı Kodlama Setlerindeki Sonucu (Rekabet %, Nötr Hariç)</w:t>
+      </w:r>
+    </w:p>
+    <w:tbl>
+      <w:tblPr>
+        <w:tblW w:w="5000" w:type="pct"/>
+        <w:jc w:val="center"/>
+        <w:tblBorders>
+          <w:top w:val="single" w:sz="8" w:space="0" w:color="auto"/>
+          <w:left w:val="none" w:sz="0" w:space="0" w:color="auto"/>
+          <w:bottom w:val="single" w:sz="8" w:space="0" w:color="auto"/>
+          <w:right w:val="none" w:sz="0" w:space="0" w:color="auto"/>
+          <w:insideH w:val="none" w:sz="0" w:space="0" w:color="auto"/>
+          <w:insideV w:val="none" w:sz="0" w:space="0" w:color="auto"/>
+        </w:tblBorders>
+      </w:tblPr>
+      <w:tblGrid>
+        <w:gridCol w:w="2000"/>
+        <w:gridCol w:w="1225"/>
+        <w:gridCol w:w="1225"/>
+        <w:gridCol w:w="1225"/>
+        <w:gridCol w:w="1225"/>
+        <w:gridCol w:w="1225"/>
+        <w:gridCol w:w="1225"/>
+      </w:tblGrid>
+      <w:tr>
+        <w:trPr>
+          <w:tblHeader/>
+        </w:trPr>
+        <w:tc>
+          <w:tcPr>
+            <w:tcW w:w="2000" w:type="dxa"/>
+            <w:tcBorders>
+              <w:bottom w:val="single" w:sz="6" w:space="0" w:color="auto"/>
+            </w:tcBorders>
+          </w:tcPr>
+          <w:p>
+            <w:pPr>
+              <w:spacing w:before="20" w:after="20"/>
+              <w:jc w:val="left"/>
+            </w:pPr>
+            <w:r>
+              <w:rPr>
+                <w:b/>
+                <w:sz w:val="18"/>
+                <w:szCs w:val="18"/>
+              </w:rPr>
+              <w:t xml:space="preserve">Kodlama seti</w:t>
+            </w:r>
+          </w:p>
+        </w:tc>
+        <w:tc>
+          <w:tcPr>
+            <w:tcW w:w="1225" w:type="dxa"/>
+            <w:tcBorders>
+              <w:bottom w:val="single" w:sz="6" w:space="0" w:color="auto"/>
+            </w:tcBorders>
+          </w:tcPr>
+          <w:p>
+            <w:pPr>
+              <w:spacing w:before="20" w:after="20"/>
+              <w:jc w:val="center"/>
+            </w:pPr>
+            <w:r>
+              <w:rPr>
+                <w:b/>
+                <w:sz w:val="18"/>
+                <w:szCs w:val="18"/>
+              </w:rPr>
+              <w:t xml:space="preserve">Bağlantısallık</w:t>
+            </w:r>
+          </w:p>
+        </w:tc>
+        <w:tc>
+          <w:tcPr>
+            <w:tcW w:w="1225" w:type="dxa"/>
+            <w:tcBorders>
+              <w:bottom w:val="single" w:sz="6" w:space="0" w:color="auto"/>
+            </w:tcBorders>
+          </w:tcPr>
+          <w:p>
+            <w:pPr>
+              <w:spacing w:before="20" w:after="20"/>
+              <w:jc w:val="center"/>
+            </w:pPr>
+            <w:r>
+              <w:rPr>
+                <w:b/>
+                <w:sz w:val="18"/>
+                <w:szCs w:val="18"/>
+              </w:rPr>
+              <w:t xml:space="preserve">Turist akışı</w:t>
+            </w:r>
+          </w:p>
+        </w:tc>
+        <w:tc>
+          <w:tcPr>
+            <w:tcW w:w="1225" w:type="dxa"/>
+            <w:tcBorders>
+              <w:bottom w:val="single" w:sz="6" w:space="0" w:color="auto"/>
+            </w:tcBorders>
+          </w:tcPr>
+          <w:p>
+            <w:pPr>
+              <w:spacing w:before="20" w:after="20"/>
+              <w:jc w:val="center"/>
+            </w:pPr>
+            <w:r>
+              <w:rPr>
+                <w:b/>
+                <w:sz w:val="18"/>
+                <w:szCs w:val="18"/>
+              </w:rPr>
+              <w:t xml:space="preserve">Anlatı</w:t>
+            </w:r>
+          </w:p>
+        </w:tc>
+        <w:tc>
+          <w:tcPr>
+            <w:tcW w:w="1225" w:type="dxa"/>
+            <w:tcBorders>
+              <w:bottom w:val="single" w:sz="6" w:space="0" w:color="auto"/>
+            </w:tcBorders>
+          </w:tcPr>
+          <w:p>
+            <w:pPr>
+              <w:spacing w:before="20" w:after="20"/>
+              <w:jc w:val="center"/>
+            </w:pPr>
+            <w:r>
+              <w:rPr>
+                <w:b/>
+                <w:sz w:val="18"/>
+                <w:szCs w:val="18"/>
+              </w:rPr>
+              <w:t xml:space="preserve">Değer yakalama</w:t>
+            </w:r>
+          </w:p>
+        </w:tc>
+        <w:tc>
+          <w:tcPr>
+            <w:tcW w:w="1225" w:type="dxa"/>
+            <w:tcBorders>
+              <w:bottom w:val="single" w:sz="6" w:space="0" w:color="auto"/>
+            </w:tcBorders>
+          </w:tcPr>
+          <w:p>
+            <w:pPr>
+              <w:spacing w:before="20" w:after="20"/>
+              <w:jc w:val="center"/>
+            </w:pPr>
+            <w:r>
+              <w:rPr>
+                <w:b/>
+                <w:sz w:val="18"/>
+                <w:szCs w:val="18"/>
+              </w:rPr>
+              <w:t xml:space="preserve">Fark</w:t>
+            </w:r>
+          </w:p>
+        </w:tc>
+        <w:tc>
+          <w:tcPr>
+            <w:tcW w:w="1225" w:type="dxa"/>
+            <w:tcBorders>
+              <w:bottom w:val="single" w:sz="6" w:space="0" w:color="auto"/>
+            </w:tcBorders>
+          </w:tcPr>
+          <w:p>
+            <w:pPr>
+              <w:spacing w:before="20" w:after="20"/>
+              <w:jc w:val="center"/>
+            </w:pPr>
+            <w:r>
+              <w:rPr>
+                <w:b/>
+                <w:sz w:val="18"/>
+                <w:szCs w:val="18"/>
+              </w:rPr>
+              <w:t xml:space="preserve">Karar</w:t>
+            </w:r>
+          </w:p>
+        </w:tc>
+      </w:tr>
+      <w:tr>
+        <w:tc>
+          <w:tcPr>
+            <w:tcW w:w="2000" w:type="dxa"/>
+          </w:tcPr>
+          <w:p>
+            <w:pPr>
+              <w:spacing w:before="20" w:after="20"/>
+              <w:jc w:val="left"/>
+            </w:pPr>
+            <w:r>
+              <w:rPr>
+                <w:sz w:val="18"/>
+                <w:szCs w:val="18"/>
+              </w:rPr>
+              <w:t xml:space="preserve">Çoğunluk (n = 363)</w:t>
+            </w:r>
+          </w:p>
+        </w:tc>
+        <w:tc>
+          <w:tcPr>
+            <w:tcW w:w="1225" w:type="dxa"/>
+          </w:tcPr>
+          <w:p>
+            <w:pPr>
+              <w:spacing w:before="20" w:after="20"/>
+              <w:jc w:val="center"/>
+            </w:pPr>
+            <w:r>
+              <w:rPr>
+                <w:sz w:val="18"/>
+                <w:szCs w:val="18"/>
+              </w:rPr>
+              <w:t xml:space="preserve">31,8</w:t>
+            </w:r>
+          </w:p>
+        </w:tc>
+        <w:tc>
+          <w:tcPr>
+            <w:tcW w:w="1225" w:type="dxa"/>
+          </w:tcPr>
+          <w:p>
+            <w:pPr>
+              <w:spacing w:before="20" w:after="20"/>
+              <w:jc w:val="center"/>
+            </w:pPr>
+            <w:r>
+              <w:rPr>
+                <w:sz w:val="18"/>
+                <w:szCs w:val="18"/>
+              </w:rPr>
+              <w:t xml:space="preserve">36,6</w:t>
+            </w:r>
+          </w:p>
+        </w:tc>
+        <w:tc>
+          <w:tcPr>
+            <w:tcW w:w="1225" w:type="dxa"/>
+          </w:tcPr>
+          <w:p>
+            <w:pPr>
+              <w:spacing w:before="20" w:after="20"/>
+              <w:jc w:val="center"/>
+            </w:pPr>
+            <w:r>
+              <w:rPr>
+                <w:sz w:val="18"/>
+                <w:szCs w:val="18"/>
+              </w:rPr>
+              <w:t xml:space="preserve">32,8</w:t>
+            </w:r>
+          </w:p>
+        </w:tc>
+        <w:tc>
+          <w:tcPr>
+            <w:tcW w:w="1225" w:type="dxa"/>
+          </w:tcPr>
+          <w:p>
+            <w:pPr>
+              <w:spacing w:before="20" w:after="20"/>
+              <w:jc w:val="center"/>
+            </w:pPr>
+            <w:r>
+              <w:rPr>
+                <w:sz w:val="18"/>
+                <w:szCs w:val="18"/>
+              </w:rPr>
+              <w:t xml:space="preserve">44,4</w:t>
+            </w:r>
+          </w:p>
+        </w:tc>
+        <w:tc>
+          <w:tcPr>
+            <w:tcW w:w="1225" w:type="dxa"/>
+          </w:tcPr>
+          <w:p>
+            <w:pPr>
+              <w:spacing w:before="20" w:after="20"/>
+              <w:jc w:val="center"/>
+            </w:pPr>
+            <w:r>
+              <w:rPr>
+                <w:sz w:val="18"/>
+                <w:szCs w:val="18"/>
+              </w:rPr>
+              <w:t xml:space="preserve">+12,6</w:t>
+            </w:r>
+          </w:p>
+        </w:tc>
+        <w:tc>
+          <w:tcPr>
+            <w:tcW w:w="1225" w:type="dxa"/>
+          </w:tcPr>
+          <w:p>
+            <w:pPr>
+              <w:spacing w:before="20" w:after="20"/>
+              <w:jc w:val="center"/>
+            </w:pPr>
+            <w:r>
+              <w:rPr>
+                <w:sz w:val="18"/>
+                <w:szCs w:val="18"/>
+              </w:rPr>
+              <w:t xml:space="preserve">Kısmi</w:t>
+            </w:r>
+          </w:p>
+        </w:tc>
+      </w:tr>
+      <w:tr>
+        <w:tc>
+          <w:tcPr>
+            <w:tcW w:w="2000" w:type="dxa"/>
+          </w:tcPr>
+          <w:p>
+            <w:pPr>
+              <w:spacing w:before="20" w:after="20"/>
+              <w:jc w:val="left"/>
+            </w:pPr>
+            <w:r>
+              <w:rPr>
+                <w:sz w:val="18"/>
+                <w:szCs w:val="18"/>
+              </w:rPr>
+              <w:t xml:space="preserve">Çoğunluk, nötr dahil</w:t>
+            </w:r>
+          </w:p>
+        </w:tc>
+        <w:tc>
+          <w:tcPr>
+            <w:tcW w:w="1225" w:type="dxa"/>
+          </w:tcPr>
+          <w:p>
+            <w:pPr>
+              <w:spacing w:before="20" w:after="20"/>
+              <w:jc w:val="center"/>
+            </w:pPr>
+            <w:r>
+              <w:rPr>
+                <w:sz w:val="18"/>
+                <w:szCs w:val="18"/>
+              </w:rPr>
+              <w:t xml:space="preserve">21,4</w:t>
+            </w:r>
+          </w:p>
+        </w:tc>
+        <w:tc>
+          <w:tcPr>
+            <w:tcW w:w="1225" w:type="dxa"/>
+          </w:tcPr>
+          <w:p>
+            <w:pPr>
+              <w:spacing w:before="20" w:after="20"/>
+              <w:jc w:val="center"/>
+            </w:pPr>
+            <w:r>
+              <w:rPr>
+                <w:sz w:val="18"/>
+                <w:szCs w:val="18"/>
+              </w:rPr>
+              <w:t xml:space="preserve">24,4</w:t>
+            </w:r>
+          </w:p>
+        </w:tc>
+        <w:tc>
+          <w:tcPr>
+            <w:tcW w:w="1225" w:type="dxa"/>
+          </w:tcPr>
+          <w:p>
+            <w:pPr>
+              <w:spacing w:before="20" w:after="20"/>
+              <w:jc w:val="center"/>
+            </w:pPr>
+            <w:r>
+              <w:rPr>
+                <w:sz w:val="18"/>
+                <w:szCs w:val="18"/>
+              </w:rPr>
+              <w:t xml:space="preserve">17,2</w:t>
+            </w:r>
+          </w:p>
+        </w:tc>
+        <w:tc>
+          <w:tcPr>
+            <w:tcW w:w="1225" w:type="dxa"/>
+          </w:tcPr>
+          <w:p>
+            <w:pPr>
+              <w:spacing w:before="20" w:after="20"/>
+              <w:jc w:val="center"/>
+            </w:pPr>
+            <w:r>
+              <w:rPr>
+                <w:sz w:val="18"/>
+                <w:szCs w:val="18"/>
+              </w:rPr>
+              <w:t xml:space="preserve">20,0</w:t>
+            </w:r>
+          </w:p>
+        </w:tc>
+        <w:tc>
+          <w:tcPr>
+            <w:tcW w:w="1225" w:type="dxa"/>
+          </w:tcPr>
+          <w:p>
+            <w:pPr>
+              <w:spacing w:before="20" w:after="20"/>
+              <w:jc w:val="center"/>
+            </w:pPr>
+            <w:r>
+              <w:rPr>
+                <w:sz w:val="18"/>
+                <w:szCs w:val="18"/>
+              </w:rPr>
+              <w:t xml:space="preserve">−1,4</w:t>
+            </w:r>
+          </w:p>
+        </w:tc>
+        <w:tc>
+          <w:tcPr>
+            <w:tcW w:w="1225" w:type="dxa"/>
+          </w:tcPr>
+          <w:p>
+            <w:pPr>
+              <w:spacing w:before="20" w:after="20"/>
+              <w:jc w:val="center"/>
+            </w:pPr>
+            <w:r>
+              <w:rPr>
+                <w:sz w:val="18"/>
+                <w:szCs w:val="18"/>
+              </w:rPr>
+              <w:t xml:space="preserve">Destek yok</w:t>
+            </w:r>
+          </w:p>
+        </w:tc>
+      </w:tr>
+      <w:tr>
+        <w:tc>
+          <w:tcPr>
+            <w:tcW w:w="2000" w:type="dxa"/>
+          </w:tcPr>
+          <w:p>
+            <w:pPr>
+              <w:spacing w:before="20" w:after="20"/>
+              <w:jc w:val="left"/>
+            </w:pPr>
+            <w:r>
+              <w:rPr>
+                <w:sz w:val="18"/>
+                <w:szCs w:val="18"/>
+              </w:rPr>
+              <w:t xml:space="preserve">Birinci kodlayıcı</w:t>
+            </w:r>
+          </w:p>
+        </w:tc>
+        <w:tc>
+          <w:tcPr>
+            <w:tcW w:w="1225" w:type="dxa"/>
+          </w:tcPr>
+          <w:p>
+            <w:pPr>
+              <w:spacing w:before="20" w:after="20"/>
+              <w:jc w:val="center"/>
+            </w:pPr>
+            <w:r>
+              <w:rPr>
+                <w:sz w:val="18"/>
+                <w:szCs w:val="18"/>
+              </w:rPr>
+              <w:t xml:space="preserve">41,9</w:t>
+            </w:r>
+          </w:p>
+        </w:tc>
+        <w:tc>
+          <w:tcPr>
+            <w:tcW w:w="1225" w:type="dxa"/>
+          </w:tcPr>
+          <w:p>
+            <w:pPr>
+              <w:spacing w:before="20" w:after="20"/>
+              <w:jc w:val="center"/>
+            </w:pPr>
+            <w:r>
+              <w:rPr>
+                <w:sz w:val="18"/>
+                <w:szCs w:val="18"/>
+              </w:rPr>
+              <w:t xml:space="preserve">35,6</w:t>
+            </w:r>
+          </w:p>
+        </w:tc>
+        <w:tc>
+          <w:tcPr>
+            <w:tcW w:w="1225" w:type="dxa"/>
+          </w:tcPr>
+          <w:p>
+            <w:pPr>
+              <w:spacing w:before="20" w:after="20"/>
+              <w:jc w:val="center"/>
+            </w:pPr>
+            <w:r>
+              <w:rPr>
+                <w:sz w:val="18"/>
+                <w:szCs w:val="18"/>
+              </w:rPr>
+              <w:t xml:space="preserve">40,3</w:t>
+            </w:r>
+          </w:p>
+        </w:tc>
+        <w:tc>
+          <w:tcPr>
+            <w:tcW w:w="1225" w:type="dxa"/>
+          </w:tcPr>
+          <w:p>
+            <w:pPr>
+              <w:spacing w:before="20" w:after="20"/>
+              <w:jc w:val="center"/>
+            </w:pPr>
+            <w:r>
+              <w:rPr>
+                <w:sz w:val="18"/>
+                <w:szCs w:val="18"/>
+              </w:rPr>
+              <w:t xml:space="preserve">33,3</w:t>
+            </w:r>
+          </w:p>
+        </w:tc>
+        <w:tc>
+          <w:tcPr>
+            <w:tcW w:w="1225" w:type="dxa"/>
+          </w:tcPr>
+          <w:p>
+            <w:pPr>
+              <w:spacing w:before="20" w:after="20"/>
+              <w:jc w:val="center"/>
+            </w:pPr>
+            <w:r>
+              <w:rPr>
+                <w:sz w:val="18"/>
+                <w:szCs w:val="18"/>
+              </w:rPr>
+              <w:t xml:space="preserve">−8,6</w:t>
+            </w:r>
+          </w:p>
+        </w:tc>
+        <w:tc>
+          <w:tcPr>
+            <w:tcW w:w="1225" w:type="dxa"/>
+          </w:tcPr>
+          <w:p>
+            <w:pPr>
+              <w:spacing w:before="20" w:after="20"/>
+              <w:jc w:val="center"/>
+            </w:pPr>
+            <w:r>
+              <w:rPr>
+                <w:sz w:val="18"/>
+                <w:szCs w:val="18"/>
+              </w:rPr>
+              <w:t xml:space="preserve">Destek yok</w:t>
+            </w:r>
+          </w:p>
+        </w:tc>
+      </w:tr>
+      <w:tr>
+        <w:tc>
+          <w:tcPr>
+            <w:tcW w:w="2000" w:type="dxa"/>
+          </w:tcPr>
+          <w:p>
+            <w:pPr>
+              <w:spacing w:before="20" w:after="20"/>
+              <w:jc w:val="left"/>
+            </w:pPr>
+            <w:r>
+              <w:rPr>
+                <w:sz w:val="18"/>
+                <w:szCs w:val="18"/>
+              </w:rPr>
+              <w:t xml:space="preserve">İkinci kodlayıcı</w:t>
+            </w:r>
+          </w:p>
+        </w:tc>
+        <w:tc>
+          <w:tcPr>
+            <w:tcW w:w="1225" w:type="dxa"/>
+          </w:tcPr>
+          <w:p>
+            <w:pPr>
+              <w:spacing w:before="20" w:after="20"/>
+              <w:jc w:val="center"/>
+            </w:pPr>
+            <w:r>
+              <w:rPr>
+                <w:sz w:val="18"/>
+                <w:szCs w:val="18"/>
+              </w:rPr>
+              <w:t xml:space="preserve">22,0</w:t>
+            </w:r>
+          </w:p>
+        </w:tc>
+        <w:tc>
+          <w:tcPr>
+            <w:tcW w:w="1225" w:type="dxa"/>
+          </w:tcPr>
+          <w:p>
+            <w:pPr>
+              <w:spacing w:before="20" w:after="20"/>
+              <w:jc w:val="center"/>
+            </w:pPr>
+            <w:r>
+              <w:rPr>
+                <w:sz w:val="18"/>
+                <w:szCs w:val="18"/>
+              </w:rPr>
+              <w:t xml:space="preserve">37,6</w:t>
+            </w:r>
+          </w:p>
+        </w:tc>
+        <w:tc>
+          <w:tcPr>
+            <w:tcW w:w="1225" w:type="dxa"/>
+          </w:tcPr>
+          <w:p>
+            <w:pPr>
+              <w:spacing w:before="20" w:after="20"/>
+              <w:jc w:val="center"/>
+            </w:pPr>
+            <w:r>
+              <w:rPr>
+                <w:sz w:val="18"/>
+                <w:szCs w:val="18"/>
+              </w:rPr>
+              <w:t xml:space="preserve">31,8</w:t>
+            </w:r>
+          </w:p>
+        </w:tc>
+        <w:tc>
+          <w:tcPr>
+            <w:tcW w:w="1225" w:type="dxa"/>
+          </w:tcPr>
+          <w:p>
+            <w:pPr>
+              <w:spacing w:before="20" w:after="20"/>
+              <w:jc w:val="center"/>
+            </w:pPr>
+            <w:r>
+              <w:rPr>
+                <w:sz w:val="18"/>
+                <w:szCs w:val="18"/>
+              </w:rPr>
+              <w:t xml:space="preserve">33,3</w:t>
+            </w:r>
+          </w:p>
+        </w:tc>
+        <w:tc>
+          <w:tcPr>
+            <w:tcW w:w="1225" w:type="dxa"/>
+          </w:tcPr>
+          <w:p>
+            <w:pPr>
+              <w:spacing w:before="20" w:after="20"/>
+              <w:jc w:val="center"/>
+            </w:pPr>
+            <w:r>
+              <w:rPr>
+                <w:sz w:val="18"/>
+                <w:szCs w:val="18"/>
+              </w:rPr>
+              <w:t xml:space="preserve">+11,3</w:t>
+            </w:r>
+          </w:p>
+        </w:tc>
+        <w:tc>
+          <w:tcPr>
+            <w:tcW w:w="1225" w:type="dxa"/>
+          </w:tcPr>
+          <w:p>
+            <w:pPr>
+              <w:spacing w:before="20" w:after="20"/>
+              <w:jc w:val="center"/>
+            </w:pPr>
+            <w:r>
+              <w:rPr>
+                <w:sz w:val="18"/>
+                <w:szCs w:val="18"/>
+              </w:rPr>
+              <w:t xml:space="preserve">Kısmi</w:t>
+            </w:r>
+          </w:p>
+        </w:tc>
+      </w:tr>
+      <w:tr>
+        <w:tc>
+          <w:tcPr>
+            <w:tcW w:w="2000" w:type="dxa"/>
+          </w:tcPr>
+          <w:p>
+            <w:pPr>
+              <w:spacing w:before="20" w:after="20"/>
+              <w:jc w:val="left"/>
+            </w:pPr>
+            <w:r>
+              <w:rPr>
+                <w:sz w:val="18"/>
+                <w:szCs w:val="18"/>
+              </w:rPr>
+              <w:t xml:space="preserve">Uyuşulan birimler (n = 195)</w:t>
+            </w:r>
+          </w:p>
+        </w:tc>
+        <w:tc>
+          <w:tcPr>
+            <w:tcW w:w="1225" w:type="dxa"/>
+          </w:tcPr>
+          <w:p>
+            <w:pPr>
+              <w:spacing w:before="20" w:after="20"/>
+              <w:jc w:val="center"/>
+            </w:pPr>
+            <w:r>
+              <w:rPr>
+                <w:sz w:val="18"/>
+                <w:szCs w:val="18"/>
+              </w:rPr>
+              <w:t xml:space="preserve">16,7</w:t>
+            </w:r>
+          </w:p>
+        </w:tc>
+        <w:tc>
+          <w:tcPr>
+            <w:tcW w:w="1225" w:type="dxa"/>
+          </w:tcPr>
+          <w:p>
+            <w:pPr>
+              <w:spacing w:before="20" w:after="20"/>
+              <w:jc w:val="center"/>
+            </w:pPr>
+            <w:r>
+              <w:rPr>
+                <w:sz w:val="18"/>
+                <w:szCs w:val="18"/>
+              </w:rPr>
+              <w:t xml:space="preserve">36,7</w:t>
+            </w:r>
+          </w:p>
+        </w:tc>
+        <w:tc>
+          <w:tcPr>
+            <w:tcW w:w="1225" w:type="dxa"/>
+          </w:tcPr>
+          <w:p>
+            <w:pPr>
+              <w:spacing w:before="20" w:after="20"/>
+              <w:jc w:val="center"/>
+            </w:pPr>
+            <w:r>
+              <w:rPr>
+                <w:sz w:val="18"/>
+                <w:szCs w:val="18"/>
+              </w:rPr>
+              <w:t xml:space="preserve">33,3</w:t>
+            </w:r>
+          </w:p>
+        </w:tc>
+        <w:tc>
+          <w:tcPr>
+            <w:tcW w:w="1225" w:type="dxa"/>
+          </w:tcPr>
+          <w:p>
+            <w:pPr>
+              <w:spacing w:before="20" w:after="20"/>
+              <w:jc w:val="center"/>
+            </w:pPr>
+            <w:r>
+              <w:rPr>
+                <w:sz w:val="18"/>
+                <w:szCs w:val="18"/>
+              </w:rPr>
+              <w:t xml:space="preserve">25,0</w:t>
+            </w:r>
+          </w:p>
+        </w:tc>
+        <w:tc>
+          <w:tcPr>
+            <w:tcW w:w="1225" w:type="dxa"/>
+          </w:tcPr>
+          <w:p>
+            <w:pPr>
+              <w:spacing w:before="20" w:after="20"/>
+              <w:jc w:val="center"/>
+            </w:pPr>
+            <w:r>
+              <w:rPr>
+                <w:sz w:val="18"/>
+                <w:szCs w:val="18"/>
+              </w:rPr>
+              <w:t xml:space="preserve">+8,3</w:t>
+            </w:r>
+          </w:p>
+        </w:tc>
+        <w:tc>
+          <w:tcPr>
+            <w:tcW w:w="1225" w:type="dxa"/>
+          </w:tcPr>
+          <w:p>
+            <w:pPr>
+              <w:spacing w:before="20" w:after="20"/>
+              <w:jc w:val="center"/>
+            </w:pPr>
+            <w:r>
+              <w:rPr>
+                <w:sz w:val="18"/>
+                <w:szCs w:val="18"/>
+              </w:rPr>
+              <w:t xml:space="preserve">Kısmi</w:t>
+            </w:r>
+          </w:p>
+        </w:tc>
+      </w:tr>
+    </w:tbl>
+    <w:p>
+      <w:pPr>
+        <w:spacing w:before="60" w:after="120"/>
+      </w:pPr>
+      <w:r>
+        <w:rPr>
+          <w:b/>
+          <w:sz w:val="18"/>
+          <w:szCs w:val="18"/>
+        </w:rPr>
+        <w:t xml:space="preserve">Not: </w:t>
+      </w:r>
+      <w:r>
+        <w:rPr>
+          <w:sz w:val="18"/>
+          <w:szCs w:val="18"/>
+        </w:rPr>
+        <w:t xml:space="preserve">Karar kuralı (analizden önce yazıldı): düzenli artış ya da bağlantısallık ile değer yakalama arasındaki farkın en az 20 yüzde puan olması destek; farkın sıfır ya da negatif olması destek yok; arası kısmi destek.</w:t>
       </w:r>
     </w:p>
     <w:p>
@@ -1556,10 +4331,8 @@
         <w:pStyle w:val="Gvdemetin"/>
       </w:pPr>
       <w:r>
-        <w:rPr>
-          <w:highlight w:val="yellow"/>
-        </w:rPr>
-        <w:t xml:space="preserve">YAZAR YAZACAK – yönerge: Her yönelim için 2–3 kısa belge alıntısı (ifade no ile: A07-03 gibi). Çin kaynakları için Türkçe çeviri + dipnotta özgün dil notu.</w:t>
+        <w:rPr/>
+        <w:t xml:space="preserve">Desenin kendisi yine de bilgi vermektedir. Rekabet payı bağlantısallıktan turist akışına geçerken artmakta, ancak anlatıda bu artış sürmemektedir. Değer yakalamadaki yüksek pay ise yanıltıcıdır, çünkü bu alan 363 birimin yalnızca 20'sini oluşturmakta ve bunların da yalnızca 9'u bir yön işareti taşımaktadır. Başka bir deyişle iki ülkenin resmî belgeleri, turist harcamasının hangi tarafta kalacağı sorusunu neredeyse hiç konuşmamaktadır. Bu durum, ülkelerin resmî metinlerde para konuşmamasıyla açıklanabilir: gelirin ve aracı payının paylaşımı, diplomatik metinlerin değil ticari pazarlıkların konusudur. Bu nedenle değer yakalama alanındaki sonuçlar sınırlı kanıt olarak okunmalıdır.</w:t>
       </w:r>
     </w:p>
     <w:p>
@@ -1567,10 +4340,8 @@
         <w:pStyle w:val="Gvdemetin"/>
       </w:pPr>
       <w:r>
-        <w:rPr>
-          <w:highlight w:val="yellow"/>
-        </w:rPr>
-        <w:t xml:space="preserve">YAZAR YAZACAK – yönerge: Tanınma asimetrisi: karşı ülkeyi atlama ve "başlangıç iddiası" sayıları TR/CN ayrı (M3 işareti). Pilot v1 alt kodları (tanınma-yok TR 4 / CN 20) analizde KULLANILMAZ; insan kodlarında M3 "dışlama" sütunundan yeniden sayılır.</w:t>
+        <w:rPr/>
+        <w:t xml:space="preserve">Bağlantısallık alanı da Ö3'ün öngördüğü kadar iş birlikçi değildir. Bu alandaki birimlerin önemli bir kısmı iş birliği taşısa da (nötr birimler hariç %68,2), 21 birim rekabet kodu almıştır. Bu birimlerin 18'i Türk kaynaklarından gelmektedir ve ortak özellikleri Türkiye'nin kendini bir merkez, köprü ya da kavşak olarak sunmasıdır; Çin kaynaklı üç birim de kendi kentlerini lojistik merkez olarak öne çıkarmaktadır. Türk kaynaklarındaki bu merkez iddiasının en açık örneği, Türkiye'nin Pekin Büyükelçisi'nin 2018'de Çin'de yayımlanan bir dergiye verdiği mülakattır: "When completed, the new Istanbul Airport will be the world's largest in terms of annual passenger capacity" (Tamamlandığında yeni İstanbul Havalimanı yıllık yolcu kapasitesi bakımından dünyanın en büyüğü olacaktır). Cümlede iki ülkeyi birleştiren ortak bir koridordan değil, Türkiye'nin kendi ulaşım merkezinden söz edilmektedir. Üstelik bu cümle ikili bir belgede, doğrudan Çin kamuoyuna hitap eden bir metinde yer almaktadır. Bu örnek, Türkiye'nin bağlantısallığı yalnızca ortak bir altyapı meselesi olarak değil, bölgesel bir merkez olma hedefinin aracı olarak da gördüğünü göstermektedir.</w:t>
       </w:r>
     </w:p>
     <w:p>
@@ -1581,7 +4352,7 @@
         <w:rPr>
           <w:szCs w:val="22"/>
         </w:rPr>
-        <w:t xml:space="preserve">4.3. Ö3: rekabet payı turiste yakınlıkla artıyor mu?</w:t>
+        <w:t xml:space="preserve">4.4. Türk ve Çin Kaynaklarının Farkı</w:t>
       </w:r>
     </w:p>
     <w:p>
@@ -1589,10 +4360,488 @@
         <w:pStyle w:val="Gvdemetin"/>
       </w:pPr>
       <w:r>
-        <w:rPr>
-          <w:highlight w:val="yellow"/>
-        </w:rPr>
-        <w:t xml:space="preserve">YAZAR YAZACAK – yönerge: Tablo 4 / Şekil 3: A1→A4 RK payı; üç satır: NÖ hariç, NÖ dahil, Türk/Çin kaynakları ayrı.</w:t>
+        <w:rPr/>
+        <w:t xml:space="preserve">Bağlantısallıktaki merkez iddiasının büyük ölçüde Türk kaynaklarından gelmesi, iki ülkenin belgeleri arasında genel bir farka işaret etmektedir. Belgeler kaynak tarafına göre ayrıldığında bu fark her alanda görülmektedir (Tablo 5). Türk kaynaklarında nötr birimler hariç rekabet payı bağlantısallıkta %45,0, turist akışında %56,2, anlatıda %55,6 ve değer yakalamada %75,0'tir. Çin kaynaklarında ise aynı pay %13,0 ile %25,0 arasında kalmakta ve alanlar arasında belirgin bir artış göstermemektedir. Başka bir deyişle ayrıştırma ilkesinin öngördüğü desen Türk kaynaklarında ortaya çıkmaktadır: rekabet payı turiste yaklaştıkça artmakta ve iki uç arasındaki fark (30 yüzde puan) destek eşiğini aşmaktadır. Çin kaynaklarında ise rekabet her alanda düşük düzeydedir ve aynı desen görülmemektedir.</w:t>
+      </w:r>
+    </w:p>
+    <w:p>
+      <w:pPr>
+        <w:keepNext/>
+        <w:spacing w:before="120" w:after="120"/>
+        <w:jc w:val="center"/>
+      </w:pPr>
+      <w:r>
+        <w:rPr>
+          <w:b/>
+          <w:sz w:val="20"/>
+          <w:szCs w:val="20"/>
+        </w:rPr>
+        <w:t xml:space="preserve">Tablo 5. </w:t>
+      </w:r>
+      <w:r>
+        <w:rPr>
+          <w:sz w:val="20"/>
+          <w:szCs w:val="20"/>
+        </w:rPr>
+        <w:t xml:space="preserve">Kaynak Tarafına Göre Rekabet Payı (%, Nötr Hariç)</w:t>
+      </w:r>
+    </w:p>
+    <w:tbl>
+      <w:tblPr>
+        <w:tblW w:w="5000" w:type="pct"/>
+        <w:jc w:val="center"/>
+        <w:tblBorders>
+          <w:top w:val="single" w:sz="8" w:space="0" w:color="auto"/>
+          <w:left w:val="none" w:sz="0" w:space="0" w:color="auto"/>
+          <w:bottom w:val="single" w:sz="8" w:space="0" w:color="auto"/>
+          <w:right w:val="none" w:sz="0" w:space="0" w:color="auto"/>
+          <w:insideH w:val="none" w:sz="0" w:space="0" w:color="auto"/>
+          <w:insideV w:val="none" w:sz="0" w:space="0" w:color="auto"/>
+        </w:tblBorders>
+      </w:tblPr>
+      <w:tblGrid>
+        <w:gridCol w:w="2000"/>
+        <w:gridCol w:w="1225"/>
+        <w:gridCol w:w="1225"/>
+        <w:gridCol w:w="1225"/>
+        <w:gridCol w:w="1225"/>
+        <w:gridCol w:w="1225"/>
+        <w:gridCol w:w="1225"/>
+      </w:tblGrid>
+      <w:tr>
+        <w:trPr>
+          <w:tblHeader/>
+        </w:trPr>
+        <w:tc>
+          <w:tcPr>
+            <w:tcW w:w="2000" w:type="dxa"/>
+            <w:tcBorders>
+              <w:bottom w:val="single" w:sz="6" w:space="0" w:color="auto"/>
+            </w:tcBorders>
+          </w:tcPr>
+          <w:p>
+            <w:pPr>
+              <w:spacing w:before="20" w:after="20"/>
+              <w:jc w:val="left"/>
+            </w:pPr>
+            <w:r>
+              <w:rPr>
+                <w:b/>
+                <w:sz w:val="18"/>
+                <w:szCs w:val="18"/>
+              </w:rPr>
+              <w:t xml:space="preserve">Kaynak</w:t>
+            </w:r>
+          </w:p>
+        </w:tc>
+        <w:tc>
+          <w:tcPr>
+            <w:tcW w:w="1225" w:type="dxa"/>
+            <w:tcBorders>
+              <w:bottom w:val="single" w:sz="6" w:space="0" w:color="auto"/>
+            </w:tcBorders>
+          </w:tcPr>
+          <w:p>
+            <w:pPr>
+              <w:spacing w:before="20" w:after="20"/>
+              <w:jc w:val="center"/>
+            </w:pPr>
+            <w:r>
+              <w:rPr>
+                <w:b/>
+                <w:sz w:val="18"/>
+                <w:szCs w:val="18"/>
+              </w:rPr>
+              <w:t xml:space="preserve">Bağlantısallık</w:t>
+            </w:r>
+          </w:p>
+        </w:tc>
+        <w:tc>
+          <w:tcPr>
+            <w:tcW w:w="1225" w:type="dxa"/>
+            <w:tcBorders>
+              <w:bottom w:val="single" w:sz="6" w:space="0" w:color="auto"/>
+            </w:tcBorders>
+          </w:tcPr>
+          <w:p>
+            <w:pPr>
+              <w:spacing w:before="20" w:after="20"/>
+              <w:jc w:val="center"/>
+            </w:pPr>
+            <w:r>
+              <w:rPr>
+                <w:b/>
+                <w:sz w:val="18"/>
+                <w:szCs w:val="18"/>
+              </w:rPr>
+              <w:t xml:space="preserve">Turist akışı</w:t>
+            </w:r>
+          </w:p>
+        </w:tc>
+        <w:tc>
+          <w:tcPr>
+            <w:tcW w:w="1225" w:type="dxa"/>
+            <w:tcBorders>
+              <w:bottom w:val="single" w:sz="6" w:space="0" w:color="auto"/>
+            </w:tcBorders>
+          </w:tcPr>
+          <w:p>
+            <w:pPr>
+              <w:spacing w:before="20" w:after="20"/>
+              <w:jc w:val="center"/>
+            </w:pPr>
+            <w:r>
+              <w:rPr>
+                <w:b/>
+                <w:sz w:val="18"/>
+                <w:szCs w:val="18"/>
+              </w:rPr>
+              <w:t xml:space="preserve">Anlatı</w:t>
+            </w:r>
+          </w:p>
+        </w:tc>
+        <w:tc>
+          <w:tcPr>
+            <w:tcW w:w="1225" w:type="dxa"/>
+            <w:tcBorders>
+              <w:bottom w:val="single" w:sz="6" w:space="0" w:color="auto"/>
+            </w:tcBorders>
+          </w:tcPr>
+          <w:p>
+            <w:pPr>
+              <w:spacing w:before="20" w:after="20"/>
+              <w:jc w:val="center"/>
+            </w:pPr>
+            <w:r>
+              <w:rPr>
+                <w:b/>
+                <w:sz w:val="18"/>
+                <w:szCs w:val="18"/>
+              </w:rPr>
+              <w:t xml:space="preserve">Değer yakalama</w:t>
+            </w:r>
+          </w:p>
+        </w:tc>
+        <w:tc>
+          <w:tcPr>
+            <w:tcW w:w="1225" w:type="dxa"/>
+            <w:tcBorders>
+              <w:bottom w:val="single" w:sz="6" w:space="0" w:color="auto"/>
+            </w:tcBorders>
+          </w:tcPr>
+          <w:p>
+            <w:pPr>
+              <w:spacing w:before="20" w:after="20"/>
+              <w:jc w:val="center"/>
+            </w:pPr>
+            <w:r>
+              <w:rPr>
+                <w:b/>
+                <w:sz w:val="18"/>
+                <w:szCs w:val="18"/>
+              </w:rPr>
+              <w:t xml:space="preserve">Kendini öne çıkarma %</w:t>
+            </w:r>
+          </w:p>
+        </w:tc>
+        <w:tc>
+          <w:tcPr>
+            <w:tcW w:w="1225" w:type="dxa"/>
+            <w:tcBorders>
+              <w:bottom w:val="single" w:sz="6" w:space="0" w:color="auto"/>
+            </w:tcBorders>
+          </w:tcPr>
+          <w:p>
+            <w:pPr>
+              <w:spacing w:before="20" w:after="20"/>
+              <w:jc w:val="center"/>
+            </w:pPr>
+            <w:r>
+              <w:rPr>
+                <w:b/>
+                <w:sz w:val="18"/>
+                <w:szCs w:val="18"/>
+              </w:rPr>
+              <w:t xml:space="preserve">Dışlama %</w:t>
+            </w:r>
+          </w:p>
+        </w:tc>
+      </w:tr>
+      <w:tr>
+        <w:tc>
+          <w:tcPr>
+            <w:tcW w:w="2000" w:type="dxa"/>
+          </w:tcPr>
+          <w:p>
+            <w:pPr>
+              <w:spacing w:before="20" w:after="20"/>
+              <w:jc w:val="left"/>
+            </w:pPr>
+            <w:r>
+              <w:rPr>
+                <w:sz w:val="18"/>
+                <w:szCs w:val="18"/>
+              </w:rPr>
+              <w:t xml:space="preserve">Türk kaynakları (n = 154)</w:t>
+            </w:r>
+          </w:p>
+        </w:tc>
+        <w:tc>
+          <w:tcPr>
+            <w:tcW w:w="1225" w:type="dxa"/>
+          </w:tcPr>
+          <w:p>
+            <w:pPr>
+              <w:spacing w:before="20" w:after="20"/>
+              <w:jc w:val="center"/>
+            </w:pPr>
+            <w:r>
+              <w:rPr>
+                <w:sz w:val="18"/>
+                <w:szCs w:val="18"/>
+              </w:rPr>
+              <w:t xml:space="preserve">45,0</w:t>
+            </w:r>
+          </w:p>
+        </w:tc>
+        <w:tc>
+          <w:tcPr>
+            <w:tcW w:w="1225" w:type="dxa"/>
+          </w:tcPr>
+          <w:p>
+            <w:pPr>
+              <w:spacing w:before="20" w:after="20"/>
+              <w:jc w:val="center"/>
+            </w:pPr>
+            <w:r>
+              <w:rPr>
+                <w:sz w:val="18"/>
+                <w:szCs w:val="18"/>
+              </w:rPr>
+              <w:t xml:space="preserve">56,2</w:t>
+            </w:r>
+          </w:p>
+        </w:tc>
+        <w:tc>
+          <w:tcPr>
+            <w:tcW w:w="1225" w:type="dxa"/>
+          </w:tcPr>
+          <w:p>
+            <w:pPr>
+              <w:spacing w:before="20" w:after="20"/>
+              <w:jc w:val="center"/>
+            </w:pPr>
+            <w:r>
+              <w:rPr>
+                <w:sz w:val="18"/>
+                <w:szCs w:val="18"/>
+              </w:rPr>
+              <w:t xml:space="preserve">55,6</w:t>
+            </w:r>
+          </w:p>
+        </w:tc>
+        <w:tc>
+          <w:tcPr>
+            <w:tcW w:w="1225" w:type="dxa"/>
+          </w:tcPr>
+          <w:p>
+            <w:pPr>
+              <w:spacing w:before="20" w:after="20"/>
+              <w:jc w:val="center"/>
+            </w:pPr>
+            <w:r>
+              <w:rPr>
+                <w:sz w:val="18"/>
+                <w:szCs w:val="18"/>
+              </w:rPr>
+              <w:t xml:space="preserve">75,0</w:t>
+            </w:r>
+          </w:p>
+        </w:tc>
+        <w:tc>
+          <w:tcPr>
+            <w:tcW w:w="1225" w:type="dxa"/>
+          </w:tcPr>
+          <w:p>
+            <w:pPr>
+              <w:spacing w:before="20" w:after="20"/>
+              <w:jc w:val="center"/>
+            </w:pPr>
+            <w:r>
+              <w:rPr>
+                <w:sz w:val="18"/>
+                <w:szCs w:val="18"/>
+              </w:rPr>
+              <w:t xml:space="preserve">20,8</w:t>
+            </w:r>
+          </w:p>
+        </w:tc>
+        <w:tc>
+          <w:tcPr>
+            <w:tcW w:w="1225" w:type="dxa"/>
+          </w:tcPr>
+          <w:p>
+            <w:pPr>
+              <w:spacing w:before="20" w:after="20"/>
+              <w:jc w:val="center"/>
+            </w:pPr>
+            <w:r>
+              <w:rPr>
+                <w:sz w:val="18"/>
+                <w:szCs w:val="18"/>
+              </w:rPr>
+              <w:t xml:space="preserve">13,6</w:t>
+            </w:r>
+          </w:p>
+        </w:tc>
+      </w:tr>
+      <w:tr>
+        <w:tc>
+          <w:tcPr>
+            <w:tcW w:w="2000" w:type="dxa"/>
+          </w:tcPr>
+          <w:p>
+            <w:pPr>
+              <w:spacing w:before="20" w:after="20"/>
+              <w:jc w:val="left"/>
+            </w:pPr>
+            <w:r>
+              <w:rPr>
+                <w:sz w:val="18"/>
+                <w:szCs w:val="18"/>
+              </w:rPr>
+              <w:t xml:space="preserve">Çin kaynakları (n = 195)</w:t>
+            </w:r>
+          </w:p>
+        </w:tc>
+        <w:tc>
+          <w:tcPr>
+            <w:tcW w:w="1225" w:type="dxa"/>
+          </w:tcPr>
+          <w:p>
+            <w:pPr>
+              <w:spacing w:before="20" w:after="20"/>
+              <w:jc w:val="center"/>
+            </w:pPr>
+            <w:r>
+              <w:rPr>
+                <w:sz w:val="18"/>
+                <w:szCs w:val="18"/>
+              </w:rPr>
+              <w:t xml:space="preserve">13,0</w:t>
+            </w:r>
+          </w:p>
+        </w:tc>
+        <w:tc>
+          <w:tcPr>
+            <w:tcW w:w="1225" w:type="dxa"/>
+          </w:tcPr>
+          <w:p>
+            <w:pPr>
+              <w:spacing w:before="20" w:after="20"/>
+              <w:jc w:val="center"/>
+            </w:pPr>
+            <w:r>
+              <w:rPr>
+                <w:sz w:val="18"/>
+                <w:szCs w:val="18"/>
+              </w:rPr>
+              <w:t xml:space="preserve">25,0</w:t>
+            </w:r>
+          </w:p>
+        </w:tc>
+        <w:tc>
+          <w:tcPr>
+            <w:tcW w:w="1225" w:type="dxa"/>
+          </w:tcPr>
+          <w:p>
+            <w:pPr>
+              <w:spacing w:before="20" w:after="20"/>
+              <w:jc w:val="center"/>
+            </w:pPr>
+            <w:r>
+              <w:rPr>
+                <w:sz w:val="18"/>
+                <w:szCs w:val="18"/>
+              </w:rPr>
+              <w:t xml:space="preserve">24,4</w:t>
+            </w:r>
+          </w:p>
+        </w:tc>
+        <w:tc>
+          <w:tcPr>
+            <w:tcW w:w="1225" w:type="dxa"/>
+          </w:tcPr>
+          <w:p>
+            <w:pPr>
+              <w:spacing w:before="20" w:after="20"/>
+              <w:jc w:val="center"/>
+            </w:pPr>
+            <w:r>
+              <w:rPr>
+                <w:sz w:val="18"/>
+                <w:szCs w:val="18"/>
+              </w:rPr>
+              <w:t xml:space="preserve">25,0</w:t>
+            </w:r>
+          </w:p>
+        </w:tc>
+        <w:tc>
+          <w:tcPr>
+            <w:tcW w:w="1225" w:type="dxa"/>
+          </w:tcPr>
+          <w:p>
+            <w:pPr>
+              <w:spacing w:before="20" w:after="20"/>
+              <w:jc w:val="center"/>
+            </w:pPr>
+            <w:r>
+              <w:rPr>
+                <w:sz w:val="18"/>
+                <w:szCs w:val="18"/>
+              </w:rPr>
+              <w:t xml:space="preserve">9,2</w:t>
+            </w:r>
+          </w:p>
+        </w:tc>
+        <w:tc>
+          <w:tcPr>
+            <w:tcW w:w="1225" w:type="dxa"/>
+          </w:tcPr>
+          <w:p>
+            <w:pPr>
+              <w:spacing w:before="20" w:after="20"/>
+              <w:jc w:val="center"/>
+            </w:pPr>
+            <w:r>
+              <w:rPr>
+                <w:sz w:val="18"/>
+                <w:szCs w:val="18"/>
+              </w:rPr>
+              <w:t xml:space="preserve">6,2</w:t>
+            </w:r>
+          </w:p>
+        </w:tc>
+      </w:tr>
+    </w:tbl>
+    <w:p>
+      <w:pPr>
+        <w:spacing w:before="60" w:after="120"/>
+      </w:pPr>
+      <w:r>
+        <w:rPr>
+          <w:b/>
+          <w:sz w:val="18"/>
+          <w:szCs w:val="18"/>
+        </w:rPr>
+        <w:t xml:space="preserve">Not: </w:t>
+      </w:r>
+      <w:r>
+        <w:rPr>
+          <w:sz w:val="18"/>
+          <w:szCs w:val="18"/>
+        </w:rPr>
+        <w:t xml:space="preserve">Ortak belgelerden gelen 14 birim bu tabloya dahil edilmemiştir. Türk kaynaklarında değer yakalama alanındaki değer yalnızca dört birime dayanmaktadır.</w:t>
       </w:r>
     </w:p>
     <w:p>
@@ -1600,10 +4849,8 @@
         <w:pStyle w:val="Gvdemetin"/>
       </w:pPr>
       <w:r>
-        <w:rPr>
-          <w:highlight w:val="yellow"/>
-        </w:rPr>
-        <w:t xml:space="preserve">YAZAR YAZACAK – yönerge: Ön-kayıtlı karar kuralı (blueprint §6): monoton YA DA A1→A4 farkı ≥ 20 yp → destek / kısmi / destek yok. Kuralı uygulayıp sonucu tek cümleyle yaz; payda duyarlılığını (NÖ) açıkça söyle.</w:t>
+        <w:rPr/>
+        <w:t xml:space="preserve">Bu farkın kaynağı, Türk belgelerinin rekabet işaretlerini daha sık taşımasıdır. Türk kaynaklı birimlerin %20,8'i kendini öne çıkarma, %13,6'sı dışlama işareti taşırken bu oranlar Çin kaynaklarında sırasıyla %9,2 ve %6,2'dir. Fark yalnızca çoğunluk kodlamasına özgü değildir; iki insan kodlayıcının kodlarında da Türk kaynaklarındaki kendini öne çıkarma oranı Çin kaynaklarındakinin yaklaşık iki katıdır. Türk kaynaklarındaki bu işaretlerin tipik biçimi, Türkiye'nin kendini İpek Yolu'nun ve onun bugünkü karşılığı olan ulaşım ağlarının merkezine yerleştirmesidir. Ticaret Bakanı'nın 2023'te Orta Koridor üzerine yaptığı açıklama bunu açıkça göstermektedir: "Buradaki en önemli rolümüz Türkiye bir kavşak ülke. Tedarik ve üretim ülkesi Türkiye, aynı zamanda transit ve kavşak ülke konumunda. Her yol Türkiye'den geçiyor." Bu ifadede İpek Yolu iki ülkenin ortak mirası olarak değil, yolların Türkiye'de kesiştiği bir ağ olarak anlatılmaktadır.</w:t>
       </w:r>
     </w:p>
     <w:p>
@@ -1611,10 +4858,8 @@
         <w:pStyle w:val="Gvdemetin"/>
       </w:pPr>
       <w:r>
-        <w:rPr>
-          <w:highlight w:val="yellow"/>
-        </w:rPr>
-        <w:t xml:space="preserve">YAZAR YAZACAK – yönerge: Olumsuz vakalar: A1'de RK, A3–A4'te İB kodlu birimler; sayı + 1–2 örnek. Bengtsson &amp; Kock s. 420 pazar temelli ayrışma burada anılır (Tartışma'ya köprü).</w:t>
+        <w:rPr/>
+        <w:t xml:space="preserve">Bu bulgular Türkiye'nin İpek Yolu söyleminde merkez olmak istediğini göstermektedir. Türkiye, Çin ile iş birliği yaptığı belgelerde bile kendini köprü, kavşak ya da merkez olarak tanımlamakta; Çin ise aynı alanlarda ağırlıklı olarak ortaklık dilini kullanmaktadır: nötr birimler hariç iş birliği payı Çin kaynaklarında %71,1 ile %87,0 arasında, Türk kaynaklarında ise %25,0 ile %55,0 arasındadır. Yine de taraf ve alan birlikte ele alındığında bazı hücrelerdeki birim sayısı küçüktür; örneğin Türk kaynaklarında değer yakalama alanındaki %75,0'lik rekabet payı yalnızca dört birime dayanmaktadır. Bu nedenle alan düzeyindeki taraf farkları temkinli okunmalıdır.</w:t>
       </w:r>
     </w:p>
     <w:p>
@@ -1625,7 +4870,7 @@
         <w:rPr>
           <w:szCs w:val="22"/>
         </w:rPr>
-        <w:t xml:space="preserve">4.4. Ö4 ve Ö5: söylem–akış açığı</w:t>
+        <w:t xml:space="preserve">4.5. Söylem ve Akış</w:t>
       </w:r>
     </w:p>
     <w:p>
@@ -1633,10 +4878,8 @@
         <w:pStyle w:val="Gvdemetin"/>
       </w:pPr>
       <w:r>
-        <w:rPr>
-          <w:highlight w:val="yellow"/>
-        </w:rPr>
-        <w:t xml:space="preserve">YAZAR YAZACAK – yönerge: Şekil 2: Çin uyruklu giriş 2010–2025 + pay (%); olaylar: 2015 e-vize, 2018 Turizm Yılı, 2020 COVID, 2024 MoU. Veri: `ham-veri/cinli-ziyaretci-tuik.csv`. Yazar şekli Excel'de yeniden çizer (YZ görseli yasak).</w:t>
+        <w:rPr/>
+        <w:t xml:space="preserve">Belgelerde iş birliği dilinin baskın olması, bu dilin turist akışına ne ölçüde yansıdığı sorusunu gündeme getirmektedir. Türkiye'ye giriş yapan Çin uyruklu kişi sayısı 2010'da 77.142 iken 2019'da 426.344'e yükselmiştir (Şekil 2). Bu artış düzenli olmamıştır: sayı 2016'da bir önceki yılın neredeyse yarısına düşmüş, COVID-19 salgınıyla birlikte 2021'de 33.641'e gerilemiş ve 2025'te 425.348 ile salgın öncesi düzeyine dönmüştür. Mutlak sayıdaki bu genel artış, aynı dönemde imzalanan anlaşmalar ve düzenlenen tanıtım etkinlikleriyle birlikte okunduğunda Ö4 ile betimsel düzeyde tutarlıdır. Nitekim serinin en yüksek payı, Çin'de Türkiye Turizm Yılı'nın kutlandığı 2018'e denk gelmektedir. Ancak tek bir zaman serisi bu iki gelişme arasında nedensel bir bağ kurmaya izin vermediği için Ö4 yalnızca betimsel olarak değerlendirilebilir.</w:t>
       </w:r>
     </w:p>
     <w:p>
@@ -1644,21 +4887,8 @@
         <w:pStyle w:val="Gvdemetin"/>
       </w:pPr>
       <w:r>
-        <w:rPr>
-          <w:highlight w:val="yellow"/>
-        </w:rPr>
-        <w:t xml:space="preserve">YAZAR YAZACAK – yönerge: Betimsel: 2013 138.876 → 2019 426.344 → 2025 425.348; pay en yüksek 2018 %0,998. Nedensel iddia YOK.</w:t>
-      </w:r>
-    </w:p>
-    <w:p>
-      <w:pPr>
-        <w:pStyle w:val="Gvdemetin"/>
-      </w:pPr>
-      <w:r>
-        <w:rPr>
-          <w:highlight w:val="yellow"/>
-        </w:rPr>
-        <w:t xml:space="preserve">YAZAR YAZACAK – yönerge: Tek taraflı belgelerde Çin'in yurt içi İpek Yolu destinasyonlarını (Xi'an, Dunhuang vb.) pazarlayan birimler → Ö5 için yorumlayıcı kanıt; sayısı ve örneği.</w:t>
+        <w:rPr/>
+        <w:t xml:space="preserve">Mutlak artışa karşın Çin uyruklu girişlerin Türkiye'nin yabancı ziyaretçileri içindeki payı küçük kalmıştır. Bu pay hiçbir yıl yüzde biri aşmamış, en yüksek değerine 2018'de %0,998 ile ulaşmış ve 2025'te %0,806 olmuştur. Başka bir deyişle on beş yılı aşan iş birliği söylemi, Çin'den gelen akışı Türkiye'nin ziyaretçi profilinde marjinal bir paydan öteye taşıyamamıştır. Ö5, bu sınırlılığın iki ülke arasındaki rekabetten kaynaklanacağını öngörüyordu. Oysa 4.2 ve 4.4'te görüldüğü gibi belgelerdeki rekabet sınırlıdır ve büyük ölçüde Türk tarafından gelmektedir; bu nedenle akıştaki sınırlılığı rekabetle açıklamak bu veriyle mümkün görünmemektedir. Akışın sınırlı kalmasının daha olası açıklaması iki ülke arasındaki uzaklıktır: iş birliği söylemi ne kadar güçlü olursa olsun, coğrafi uzaklık Çinli turistin Türkiye'ye gelmesini sınırlamaktadır. Böylece 4.2'de iş birliğinin baskınlığını açıklayan uzaklık, söylemin akışa dönüşmemesini de açıklamaktadır.</w:t>
       </w:r>
     </w:p>
     <w:p>

</xml_diff>

<commit_message>
Tartışma ve Sonuç taslağı; Öz, Abstract ve Extended Summary bulgularla tamamlandı
Co-Authored-By: Claude Opus 5.5 <noreply@anthropic.com>
Claude-Session: https://claude.ai/code/session_015BkByremFh97j9aWiMCq3J
</commit_message>
<xml_diff>
--- a/makaleler/turkiye-cin-ortaklasa-rekabet/teslim/makale-anonim-taslak-v1.docx
+++ b/makaleler/turkiye-cin-ortaklasa-rekabet/teslim/makale-anonim-taslak-v1.docx
@@ -785,27 +785,7 @@
             </w:pPr>
             <w:r>
               <w:rPr/>
-              <w:t xml:space="preserve">Türkiye ile Çin, İpek Yolu'nu ortak bir miras olarak sunan güçlü bir iş birliği söylemine sahiptir; buna karşın Çin uyruklu girişler 2013–2025 döneminde üç katına çıkmasına rağmen Türkiye'ye yapılan toplam yabancı girişlerin hiçbir yıl yüzde birini aşmamıştır. Literatür bu açığı iş birliğinin önündeki engellerle açıklarken, bu çalışma ilişkinin kendisine bakmakta ve iki ülkenin aynı mirası paylaşırken onun üzerinde rekabet de edip etmediğini ortaklaşa rekabet kuramıyla incelemektedir. Kuramın ayrıştırma ilkesine göre iş birliği müşteriden uzak, rekabet müşteriye yakın faaliyetlerde yoğunlaşır. Bu öngörüyü sınamak için 2010–2026 dönemine ait 49 resmî belge 368 anlam birimine ayrılmış ve bağlantısallık, turist akışı, anlatı ve değer yakalama alanlarında iki bağımsız kodlayıcı tarafından açık işaretlere dayalı bir şemayla kodlanmıştır. </w:t>
-            </w:r>
-            <w:r>
-              <w:rPr>
-                <w:highlight w:val="yellow"/>
-              </w:rPr>
-              <w:t xml:space="preserve">BULGU: Rekabet kodlarının payı bağlantısallıkta %__ iken değer yakalamada %__'dir; dolayısıyla ayrıştırma ilkesi desteklenmektedir / kısmen desteklenmektedir / desteklenmemektedir.</w:t>
-            </w:r>
-            <w:r>
-              <w:rPr/>
-              <w:t xml:space="preserve"> </w:t>
-            </w:r>
-            <w:r>
-              <w:rPr>
-                <w:highlight w:val="yellow"/>
-              </w:rPr>
-              <w:t xml:space="preserve">SONUÇ: tek cümle, Tartışma ve Sonuç bölümündeki ana iddiayla aynı.</w:t>
-            </w:r>
-            <w:r>
-              <w:rPr/>
-              <w:t xml:space="preserve"> Bu sonuç, paylaşılan İpek Yolu mirasının nötr bir ortak varlıktan çok ortaklaşa rekabetin nesnesi olarak işlediğini düşündürmektedir.</w:t>
+              <w:t xml:space="preserve">Türkiye ile Çin, İpek Yolu'nu ortak bir miras olarak sunan güçlü bir iş birliği söylemine sahiptir; buna karşın Çin uyruklu girişler 2013–2025 döneminde üç katına çıkmasına rağmen Türkiye'ye yapılan toplam yabancı girişlerin hiçbir yıl yüzde birini aşmamıştır. Literatür bu açığı iş birliğinin önündeki engellerle açıklarken, bu çalışma ilişkinin kendisine bakmakta ve iki ülkenin aynı mirası paylaşırken onun üzerinde rekabet de edip etmediğini ortaklaşa rekabet kuramıyla incelemektedir. Kuramın ayrıştırma ilkesine göre iş birliği müşteriden uzak, rekabet müşteriye yakın faaliyetlerde yoğunlaşır. Bu öngörüyü sınamak için 2010–2026 dönemine ait 49 resmî belge 368 anlam birimine ayrılmış ve bağlantısallık, turist akışı, anlatı ve değer yakalama alanlarında iki bağımsız kodlayıcı tarafından açık işaretlere dayalı bir şemayla kodlanmıştır. İkili belgelerde iş birliği dili baskındır; ancak rekabet payı turiste yaklaştıkça düzenli olarak artmamakta ve ayrıştırma ilkesi desteklenmemektedir. Var olan rekabet büyük ölçüde Türkiye'nin kendini İpek Yolu'nun merkezi ve kavşağı olarak sunmasından kaynaklanmakta, Çin kaynakları ise ortaklık dilini korumaktadır. Sonuç olarak İpek Yolu mirası ortaklaşa rekabetin nesnesidir, ancak bu rekabet tek taraflıdır; iki ülke arasındaki uzaklık ise hem iş birliğinin baskınlığını hem de söylemin turiste dönüşmemesini açıklamaktadır.</w:t>
             </w:r>
           </w:p>
           <w:sdt>
@@ -864,33 +844,7 @@
               <w:rPr>
                 <w:lang w:val="en-US"/>
               </w:rPr>
-              <w:t xml:space="preserve">Türkiye and China share a strong discourse of cooperation that presents the Silk Road as a common heritage; yet although arrivals of Chinese nationals in Türkiye tripled between 2013 and 2025, they never exceeded one per cent of all foreign arrivals. While the literature explains this gap by obstacles to cooperation, this study looks at the relationship itself and uses coopetition theory to ask whether the two countries also compete over the heritage they share. According to the separation principle of the theory, cooperation concentrates in activities far from the customer and competition in activities close to the customer. To test this prediction, 49 official documents from 2010–2026 were divided into 368 meaning units, which two independent coders coded across the domains of connectivity, tourist flows, narrative and value capture using a scheme based on manifest markers. </w:t>
-            </w:r>
-            <w:r>
-              <w:rPr>
-                <w:lang w:val="en-US"/>
-                <w:highlight w:val="yellow"/>
-              </w:rPr>
-              <w:t xml:space="preserve">FINDING: The share of competition codes is __% in connectivity and __% in value capture; the separation principle is therefore supported / partially supported / not supported.</w:t>
-            </w:r>
-            <w:r>
-              <w:rPr>
-                <w:lang w:val="en-US"/>
-              </w:rPr>
-              <w:t xml:space="preserve"> </w:t>
-            </w:r>
-            <w:r>
-              <w:rPr>
-                <w:lang w:val="en-US"/>
-                <w:highlight w:val="yellow"/>
-              </w:rPr>
-              <w:t xml:space="preserve">CONCLUSION: one sentence, mirroring the Turkish Öz.</w:t>
-            </w:r>
-            <w:r>
-              <w:rPr>
-                <w:lang w:val="en-US"/>
-              </w:rPr>
-              <w:t xml:space="preserve"> This suggests that the shared Silk Road heritage operates less as a neutral common asset than as the object of coopetition.</w:t>
+              <w:t xml:space="preserve">Türkiye and China share a strong discourse of cooperation that presents the Silk Road as a common heritage; yet although arrivals of Chinese nationals in Türkiye tripled between 2013 and 2025, they never exceeded one per cent of all foreign arrivals. Rather than explaining this gap by obstacles to cooperation, this study asks, through coopetition theory, whether the two countries also compete over the heritage they share. The theory's separation principle predicts cooperation in activities far from the customer and competition in activities close to it. To test this, 49 official documents from 2010–2026 were divided into 368 meaning units, which two independent coders coded across connectivity, tourist flows, narrative and value capture. Cooperation dominates bilateral documents, but competition does not rise steadily with proximity to the tourist, so the separation principle is not supported. The competition that does appear stems largely from Türkiye presenting itself as the centre and crossroads of the Silk Road, while Chinese sources keep a language of partnership. The Silk Road heritage is thus the object of a one-sided coopetition, and distance explains both the dominance of cooperation and its failure to generate tourist flows.</w:t>
             </w:r>
           </w:p>
         </w:tc>
@@ -4908,7 +4862,7 @@
         <w:rPr>
           <w:szCs w:val="22"/>
         </w:rPr>
-        <w:t xml:space="preserve">5.1. Bulguların kuramla ilişkisi</w:t>
+        <w:t xml:space="preserve">5.1. Bulguların Kuramla İlişkisi</w:t>
       </w:r>
     </w:p>
     <w:p>
@@ -4916,175 +4870,101 @@
         <w:pStyle w:val="Gvdemetin"/>
       </w:pPr>
       <w:r>
+        <w:rPr/>
+        <w:t xml:space="preserve">Bu çalışma, firmalar ve destinasyonlar için geliştirilen ayrıştırma ilkesinin iki devlet arasındaki miras turizminde geçerli olup olmadığını sınamıştır. Bulgular ilkenin yalnızca bir bölümünün geçerli olduğunu göstermektedir. Ortak İpek Yolu mirası iki ülke arasında iş birliğini beslemekte (Ö1), ancak rekabetin turiste yaklaştıkça düzenli olarak artacağı öngörüsü (Ö3) desteklenmemektedir. Bunun yerine rekabet, ilkenin öngörmediği bir biçimde, tek taraflı olarak ortaya çıkmaktadır: Türk kaynaklarında rekabet payı turiste yaklaştıkça artarken Çin kaynakları her alanda ortaklık dilini korumaktadır. Başka bir deyişle Bengtsson ve Kock'un (2000) iki aktör arasında tanımladığı ayrışma, Türkiye–Çin ilişkisinde iki tarafın ortak davranışı olarak değil, tek bir tarafın söylem tercihi olarak görülmektedir.</w:t>
+      </w:r>
+    </w:p>
+    <w:p>
+      <w:pPr>
+        <w:pStyle w:val="Gvdemetin"/>
+      </w:pPr>
+      <w:r>
+        <w:rPr/>
+        <w:t xml:space="preserve">Bu tek taraflılığın kaynağı, Türkiye'nin İpek Yolu söyleminde merkez olmak istemesidir. Türk belgeleri Türkiye'yi bir köprü, kavşak ya da ulaşım merkezi olarak tanımlamakta; bu tanım İstanbul Havalimanı örneğinde olduğu gibi Çin kamuoyuna hitap eden belgelerde bile sürmektedir. Bu bulgu, paylaşılan mirasın aynı zamanda sahiplik ve merkez iddiası ürettiğini gösteren literatürle örtüşmekte ve Türkiye'nin başka miras alanlarında da rekabetçi bir anlatı kurduğunu gösteren çalışmaları desteklemektedir (Hisarlıoğlu ve Yanık, 2025; Mozaffari ve Akbar, 2024). Çin tarafında ise aynı rekabet görülmemektedir. Statü bakımından baskın aktörlerin ortaklaşa rekabete daha az yöneldiğini gösteren bulgu (Norheim-Hansen vd., 2026) bu asimetriyi anlamak için bir başlangıç noktası sunabilir; ancak bu çalışmanın verisi Çin'in neden rekabet dilinden kaçındığını açıklamaya yetmemektedir.</w:t>
+      </w:r>
+    </w:p>
+    <w:p>
+      <w:pPr>
+        <w:pStyle w:val="Gvdemetin"/>
+      </w:pPr>
+      <w:r>
+        <w:rPr/>
+        <w:t xml:space="preserve">Değer yakalama alanının neredeyse hiç görünmemesi de kuram açısından bir sınıra işaret etmektedir. Ülkeler resmî metinlerde para konuşmadığı için turist harcamasının paylaşımı diplomatik belgelerde iz bırakmamaktadır. Bu da ayrıştırma ilkesinin müşteriye en yakın basamağının, resmî belgelerle değil ancak ticari verilerle sınanabileceği anlamına gelmektedir.</w:t>
+      </w:r>
+    </w:p>
+    <w:p>
+      <w:pPr>
+        <w:pStyle w:val="Gvdemetin"/>
+      </w:pPr>
+      <w:r>
+        <w:rPr/>
+        <w:t xml:space="preserve">Söylem ile akış arasındaki açık için ise en güçlü açıklama uzaklıktır. Türkiye ile Çin birbirine çok uzaktır ve aynı turist için yarışan iki komşu destinasyon değildir. Bu uzaklık iki sonucu birlikte açıklamaktadır: turizmde güçlü bir rekabet zemini oluşmadığı için İpek Yolu konusunda iş birliği dili ağır basmakta, aynı uzaklık nedeniyle bu dil turiste dönüşmemektedir. Bu sonuç, coğrafi ve kültürel uzaklığın Çinli turist akışını azalttığını gösteren bulgularla uyumludur (Deng ve Hu, 2019). Kuramsal Çerçeve'de rakip açıklama olarak tutulan uzaklık, bu nedenle Ö5'in öngördüğü rekabet açıklamasından daha fazla destek bulmaktadır.</w:t>
+      </w:r>
+    </w:p>
+    <w:p>
+      <w:pPr>
+        <w:pStyle w:val="ikincidzeybalk"/>
+      </w:pPr>
+      <w:r>
+        <w:rPr>
+          <w:szCs w:val="22"/>
+        </w:rPr>
+        <w:t xml:space="preserve">5.2. Politika Çıkarımları</w:t>
+      </w:r>
+    </w:p>
+    <w:p>
+      <w:pPr>
+        <w:pStyle w:val="Gvdemetin"/>
+      </w:pPr>
+      <w:r>
+        <w:rPr/>
+        <w:t xml:space="preserve">Bulgular Türkiye'nin Çin pazarına yönelik turizm politikası için iki çıkarım sunmaktadır. Birincisi söylemle ilgilidir. Türk belgelerinde öne çıkan merkez ve kavşak vurgusu, Çin'in ortaklık diline karşılık gelmemekte ve iki ülkenin anlatısını birbirinden uzaklaştırmaktadır. Çinli turiste ulaşmak için ortak miras dili daha işe yarar görünmektedir: İpek Yolu'nu Türkiye'nin merkezde durduğu bir ağ olarak değil, iki ülkeyi birbirine bağlayan ortak bir geçmiş olarak anlatmak, Çin'in kendi anlatısıyla da uyumludur. İkincisi ulaşımla ilgilidir. Uzaklık akışı sınırlayan temel etken olduğuna göre, bu uzaklığı kısaltan en somut araç iki ülke arasındaki aktarmasız uçuşların artırılmasıdır. Demiryolu koridorları yük taşırken yolcu taşımadığı için (Farmanov vd., 2026), bağlantısallık alanındaki iş birliğinin turiste ulaşması havayolu bağlantısına bağlıdır.</w:t>
+      </w:r>
+    </w:p>
+    <w:p>
+      <w:pPr>
+        <w:pStyle w:val="ikincidzeybalk"/>
+      </w:pPr>
+      <w:r>
+        <w:rPr>
+          <w:szCs w:val="22"/>
+        </w:rPr>
+        <w:t xml:space="preserve">5.3. Sınırlılıklar</w:t>
+      </w:r>
+    </w:p>
+    <w:p>
+      <w:pPr>
+        <w:pStyle w:val="Gvdemetin"/>
+      </w:pPr>
+      <w:r>
+        <w:rPr/>
+        <w:t xml:space="preserve">Çalışmanın bulguları birkaç sınırlılıkla birlikte okunmalıdır. İlk olarak, incelenen belgeler ölçüt örneklemesiyle seçilmiş resmî metinlerdir ve erişilemeyen 12 belge analiz dışında kalmıştır; bu durum belge seçiminden kaynaklanan bir yanlılığa yol açabilir (Bowen, 2009). İkinci olarak, Çince belgelerin bir bölümü çeviri üzerinden kodlanmıştır. Üçüncü olarak, değer yakalama alanı kavramsal olarak gelir payını ifade etse de bu payı ölçen bir veri bulunmamakta, alan yalnızca 20 birimle temsil edilmektedir. Dördüncü olarak, TÜİK serisi turist sayısı değil sınır giriş kaydıdır ve yalnızca betimsel olarak kullanılmıştır. Son olarak, Sincan'a ilişkin siyasi tartışmanın kapsam dışı bırakılması analitik olduğu kadar siyasi bir tercihtir ve iki ülke ilişkisinin önemli bir boyutunu dışarıda bırakmaktadır.</w:t>
+      </w:r>
+    </w:p>
+    <w:p>
+      <w:pPr>
+        <w:pStyle w:val="ikincidzeybalk"/>
+      </w:pPr>
+      <w:r>
+        <w:rPr>
+          <w:szCs w:val="22"/>
+        </w:rPr>
+        <w:t xml:space="preserve">5.4. Sonuç</w:t>
+      </w:r>
+    </w:p>
+    <w:p>
+      <w:pPr>
+        <w:pStyle w:val="Gvdemetin"/>
+      </w:pPr>
+      <w:r>
+        <w:rPr/>
+        <w:t xml:space="preserve">Bu çalışma, Türkiye ile Çin'in İpek Yolu turizm mirası üzerinde yalnızca iş birliği değil, aynı zamanda rekabet de yürütüp yürütmediğini sormuştur. Elde edilen yanıt, ilişkinin kazan-kazan okumasını kısmen doğrulamakta, kısmen de düzeltmektedir. İki ülke ortak belgelerde açıkça iş birliği dilini kullanmaktadır; rekabet ise iki tarafın ortak davranışı değil, büyük ölçüde Türkiye'nin merkez olma isteğinden doğan tek taraflı bir söylemdir. Bu nedenle İpek Yolu mirası Türkiye–Çin ilişkisinde ortaklaşa rekabetin nesnesidir, ancak bu ortaklaşa rekabet simetrik değildir. Uzaklık ise hem iş birliğinin baskınlığını hem de bu iş birliğinin turiste dönüşmemesini açıklamaktadır. </w:t>
+      </w:r>
+      <w:r>
         <w:rPr>
           <w:highlight w:val="yellow"/>
         </w:rPr>
-        <w:t xml:space="preserve">YAZAR YAZACAK – yönerge: Ayrıştırma ilkesi devletlerarası miras turizminde ne ölçüde işledi? (Ö3 sonucu) Desteklenmediyse: kuramsal katkı yine var (blueprint §6 cevabı).</w:t>
-      </w:r>
-    </w:p>
-    <w:p>
-      <w:pPr>
-        <w:pStyle w:val="Gvdemetin"/>
-      </w:pPr>
-      <w:r>
-        <w:rPr>
-          <w:highlight w:val="yellow"/>
-        </w:rPr>
-        <w:t xml:space="preserve">YAZAR YAZACAK – yönerge: Rakip açıklamalar: (a) pazar/coğrafya temelli ayrışma (B&amp;K s. 420), (b) coğrafi–kültürel uzaklık (Deng &amp; Hu 2019), (c) güç asimetrisi (Norheim-Hansen vd. 2026; B&amp;K Önerme 3 s. 422). Her biri için bulgunun ne söylediği.</w:t>
-      </w:r>
-    </w:p>
-    <w:p>
-      <w:pPr>
-        <w:pStyle w:val="Gvdemetin"/>
-      </w:pPr>
-      <w:r>
-        <w:rPr>
-          <w:highlight w:val="yellow"/>
-        </w:rPr>
-        <w:t xml:space="preserve">YAZAR YAZACAK – yönerge: "Paylaşılan miras" çatallanması: Türk ve Çin anlatılarında simetrik mi, asimetrik mi? (M2/M3 TR–CN karşılaştırması).</w:t>
-      </w:r>
-    </w:p>
-    <w:p>
-      <w:pPr>
-        <w:pStyle w:val="Gvdemetin"/>
-      </w:pPr>
-      <w:r>
-        <w:rPr>
-          <w:highlight w:val="yellow"/>
-        </w:rPr>
-        <w:t xml:space="preserve">YAZAR YAZACAK – yönerge: Ara aktör olasılığı (B&amp;K Önerme 5 s. 423): UNESCO ortak adaylık, UNWTO İpek Yolu Programı, TDT → politika önerisine zemin.</w:t>
-      </w:r>
-    </w:p>
-    <w:p>
-      <w:pPr>
-        <w:pStyle w:val="ikincidzeybalk"/>
-      </w:pPr>
-      <w:r>
-        <w:rPr>
-          <w:szCs w:val="22"/>
-        </w:rPr>
-        <w:t xml:space="preserve">5.2. Politika çıkarımları</w:t>
-      </w:r>
-    </w:p>
-    <w:p>
-      <w:pPr>
-        <w:pStyle w:val="Gvdemetin"/>
-      </w:pPr>
-      <w:r>
-        <w:rPr>
-          <w:highlight w:val="yellow"/>
-        </w:rPr>
-        <w:t xml:space="preserve">YAZAR YAZACAK – yönerge: Türkiye için: iş birliğinin verimli olduğu arena(lar) ile farklılaşmanın gerektiği arena(lar). Kazan-kazan dilinin hangi arenada yanıltıcı olduğu.</w:t>
-      </w:r>
-    </w:p>
-    <w:p>
-      <w:pPr>
-        <w:pStyle w:val="Gvdemetin"/>
-      </w:pPr>
-      <w:r>
-        <w:rPr>
-          <w:highlight w:val="yellow"/>
-        </w:rPr>
-        <w:t xml:space="preserve">YAZAR YAZACAK – yönerge: Kısa, somut; en fazla 3 öneri.</w:t>
-      </w:r>
-    </w:p>
-    <w:p>
-      <w:pPr>
-        <w:pStyle w:val="ikincidzeybalk"/>
-      </w:pPr>
-      <w:r>
-        <w:rPr>
-          <w:szCs w:val="22"/>
-        </w:rPr>
-        <w:t xml:space="preserve">5.3. Sınırlılıklar</w:t>
-      </w:r>
-    </w:p>
-    <w:p>
-      <w:pPr>
-        <w:pStyle w:val="Gvdemetin"/>
-      </w:pPr>
-      <w:r>
-        <w:rPr>
-          <w:highlight w:val="yellow"/>
-        </w:rPr>
-        <w:t xml:space="preserve">YAZAR YAZACAK – yönerge: Belge seçim yanlılığı (Bowen 2009); erişilemeyen 12 belge; Çince metinlerin İngilizce/çeviri sürümleri.</w:t>
-      </w:r>
-    </w:p>
-    <w:p>
-      <w:pPr>
-        <w:pStyle w:val="Gvdemetin"/>
-      </w:pPr>
-      <w:r>
-        <w:rPr>
-          <w:highlight w:val="yellow"/>
-        </w:rPr>
-        <w:t xml:space="preserve">YAZAR YAZACAK – yönerge: Değer yakalama arenasında construct–measure gap (gelir payı verisi yok; &lt;5 birimse "kanıt yetersiz").</w:t>
-      </w:r>
-    </w:p>
-    <w:p>
-      <w:pPr>
-        <w:pStyle w:val="Gvdemetin"/>
-      </w:pPr>
-      <w:r>
-        <w:rPr>
-          <w:highlight w:val="yellow"/>
-        </w:rPr>
-        <w:t xml:space="preserve">YAZAR YAZACAK – yönerge: TÜİK serisi sınır girişi, turist değil; nedensel test yok.</w:t>
-      </w:r>
-    </w:p>
-    <w:p>
-      <w:pPr>
-        <w:pStyle w:val="Gvdemetin"/>
-      </w:pPr>
-      <w:r>
-        <w:rPr>
-          <w:highlight w:val="yellow"/>
-        </w:rPr>
-        <w:t xml:space="preserve">YAZAR YAZACAK – yönerge: Sincan tartışmasının kapsam dışı bırakılması analitik olduğu kadar siyasi bir tercihtir (blueprint §10).</w:t>
-      </w:r>
-    </w:p>
-    <w:p>
-      <w:pPr>
-        <w:pStyle w:val="Gvdemetin"/>
-      </w:pPr>
-      <w:r>
-        <w:rPr>
-          <w:highlight w:val="yellow"/>
-        </w:rPr>
-        <w:t xml:space="preserve">YAZAR YAZACAK – yönerge: Yazar konumu: Türk, turizm pazarlaması; simetrik kodlama ile dengelendi.</w:t>
-      </w:r>
-    </w:p>
-    <w:p>
-      <w:pPr>
-        <w:pStyle w:val="ikincidzeybalk"/>
-      </w:pPr>
-      <w:r>
-        <w:rPr>
-          <w:szCs w:val="22"/>
-        </w:rPr>
-        <w:t xml:space="preserve">5.4. Sonuç</w:t>
-      </w:r>
-    </w:p>
-    <w:p>
-      <w:pPr>
-        <w:pStyle w:val="Gvdemetin"/>
-      </w:pPr>
-      <w:r>
-        <w:rPr>
-          <w:highlight w:val="yellow"/>
-        </w:rPr>
-        <w:t xml:space="preserve">YAZAR YAZACAK – yönerge: Katkı cümlesi (Giriş'tekiyle aynı iddia, bulguyla doldurulmuş).</w:t>
-      </w:r>
-    </w:p>
-    <w:p>
-      <w:pPr>
-        <w:pStyle w:val="Gvdemetin"/>
-      </w:pPr>
-      <w:r>
-        <w:rPr>
-          <w:highlight w:val="yellow"/>
-        </w:rPr>
-        <w:t xml:space="preserve">YAZAR YAZACAK – yönerge: Gelecek araştırma: değer yakalama verisi; Çince birincil literatür; Orta Asya üçüncü taraf perspektifi; boylamsal izleme (2026 vize muafiyeti sonrası).</w:t>
+        <w:t xml:space="preserve">GELECEK ARAŞTIRMA (yazar): bir sonraki çalışma için önerinizi bir cümleyle yazın; örneğin Çinli turistlerle anket, 2026 vize muafiyetinin etkisi ya da aktarmasız uçuşların akışa etkisi.</w:t>
       </w:r>
     </w:p>
     <w:p>
@@ -6540,7 +6420,7 @@
       </w:pPr>
       <w:r>
         <w:rPr/>
-        <w:t xml:space="preserve">Official discourse between Türkiye and China presents the Silk Road as a shared heritage and tourism as a natural field of cooperation. Recent steps follow this narrative: Türkiye aligned its Middle Corridor with the Belt and Road Initiative through a memorandum signed in Antalya in 2015 (Resmî Gazete, 2017), 2018 was celebrated as the Year of Turkish Tourism in China (Niu &amp; Li, 2019), the two culture and tourism ministries signed a tourism cooperation memorandum in 2024, and from 2 January 2026 Türkiye granted Chinese citizens unilateral visa-free entry (Türkiye Turizm Tanıtım ve Geliştirme Ajansı [TGA], 2026). These steps create a clear expectation that Chinese tourists will follow, but the data meet this expectation only in part. Arrivals of Chinese nationals tripled after 2013, yet they never exceeded one per cent of all foreign arrivals (Türkiye İstatistik Kurumu [TÜİK], 2026). The Turkish tourism literature explains this gap by technical obstacles such as security perceptions, language and distance, because it treats the relationship as a win-win partnership from the outset (İbiş, 2019; Kılıç, 2021; Palidan, 2024). Heritage politics research suggests a different reading: "shared" heritage also generates competing claims of ownership and centrality (Brown &amp; O'Brien, 2025; Debarbieux et al., 2023), and China's historicisation of the Silk Road has been described as Sinocentric (Sciorati, 2023). If both readings hold, the problem may lie in the relationship itself rather than in its obstacles. The study therefore asks two questions. First, in which domains do Türkiye and China cooperate, and in which do they compete, over Silk Road tourism heritage between 2010 and 2026, and does this distribution follow the activity's proximity to the tourist? Second, to what extent have the two countries' cooperation discourse and agreements been reflected in arrivals of Chinese nationals?</w:t>
+        <w:t xml:space="preserve">Official discourse between Türkiye and China presents the Silk Road as a shared heritage and tourism as a natural field of cooperation: the Middle Corridor was aligned with the Belt and Road Initiative in 2015 (Resmî Gazete, 2017), 2018 was the Year of Turkish Tourism in China (Niu &amp; Li, 2019), and from 2 January 2026 Türkiye granted Chinese citizens unilateral visa-free entry (Türkiye Turizm Tanıtım ve Geliştirme Ajansı [TGA], 2026). Yet arrivals of Chinese nationals never exceeded one per cent of all foreign arrivals (Türkiye İstatistik Kurumu [TÜİK], 2026). The Turkish literature explains this gap by technical obstacles because it treats the relationship as a win-win partnership (İbiş, 2019; Kılıç, 2021; Palidan, 2024), whereas heritage politics research shows that "shared" heritage also produces competing claims of ownership (Brown &amp; O'Brien, 2025; Debarbieux et al., 2023). The study therefore asks in which domains the two countries cooperate and compete over Silk Road tourism heritage, whether this follows proximity to the tourist, and how far the cooperation discourse is reflected in arrivals.</w:t>
       </w:r>
     </w:p>
     <w:p>
@@ -6563,17 +6443,7 @@
       </w:pPr>
       <w:r>
         <w:rPr/>
-        <w:t xml:space="preserve">Because these questions look for a mechanism, the study adopts a critical realist stance and treats documentary traces as indicators of that mechanism rather than as the mechanism itself. The mechanism tested is the separation principle derived from Bengtsson and Kock (2000, p. 421), according to which competitors cooperate in input activities far from the customer and compete in output activities close to the customer. To compare this mechanism across the parts of a single relationship, a single embedded case design was chosen, with the Türkiye–China dyad as the case and four domains, ordered in advance by proximity to the tourist, as embedded units: connectivity, tourist flows, narrative and value capture. Since cooperation is expected to appear in joint documents and competition in unilateral ones, systematic document analysis (Bowen, 2009) was applied to two groups of documents: 25 bilateral or joint official documents and 24 unilateral Silk Road promotion and policy narratives, selected through criterion sampling. The documents were divided into 368 meaning units. A pilot round showed that interpretive coding of orientation produced very low agreement, so the final scheme derives orientation mechanically from three manifest markers (a joint subject, self-promotion, and exclusion or one-sidedness); pilot codes were not used in the analysis. Two independent human coders carried out the final coding, and agreement is reported with Cohen's kappa </w:t>
-      </w:r>
-      <w:r>
-        <w:rPr>
-          <w:highlight w:val="yellow"/>
-        </w:rPr>
-        <w:t xml:space="preserve">κ domain = __; κ orientation = __</w:t>
-      </w:r>
-      <w:r>
-        <w:rPr/>
-        <w:t xml:space="preserve">. To prevent post hoc interpretation, the decision rule was written before the analysis: a monotonic increase in the share of competition codes from connectivity to value capture, or a difference of at least 20 percentage points between the two ends, counts as support. Arrivals of Chinese nationals for 2010–2025 were then read descriptively, without causal testing.</w:t>
+        <w:t xml:space="preserve">The study adopts a critical realist stance and a single embedded case design. It tests the separation principle of Bengtsson and Kock (2000, p. 421), according to which competitors cooperate far from the customer and compete close to it, across four domains ordered in advance by proximity to the tourist: connectivity, tourist flows, narrative and value capture. Systematic document analysis (Bowen, 2009) was applied to 25 bilateral and 24 unilateral official documents, divided into 368 meaning units. Orientation was derived mechanically from three manifest markers: a joint subject, self-promotion, and exclusion. Two independent human coders coded all units (κ = 0.73 for domain, 0.47 for orientation); disagreements were resolved by majority with an independent AI-assisted coding produced before the human coding, and results are also reported for each coder and for agreed units. The decision rule was written before the analysis: a monotonic rise in competition, or a gap of at least 20 percentage points between the two ends, counts as support. Arrivals for 2010–2025 were read descriptively.</w:t>
       </w:r>
     </w:p>
     <w:p>
@@ -6594,10 +6464,17 @@
         </w:rPr>
       </w:pPr>
       <w:r>
-        <w:rPr>
-          <w:highlight w:val="yellow"/>
-        </w:rPr>
-        <w:t xml:space="preserve">P1 and P2: shares of cooperation codes in bilateral documents and of competition codes in unilateral documents, with one short documentary example each; asymmetry between Turkish and Chinese sources in self-promotion and exclusion markers.</w:t>
+        <w:rPr/>
+        <w:t xml:space="preserve">Cooperation dominates bilateral documents: 49.7% of their units carry cooperation codes and 20.3% competition codes (P1 supported). In unilateral documents cooperation falls to 27.4% while competition stays at 21.5%, the decline being absorbed by neutral statements (P2 partially supported). Excluding neutral units, competition accounts for 31.8% in connectivity, 36.6% in tourist flows, 32.8% in narrative and 44.4% in value capture, the last resting on only 20 units; the series is not monotonic and the gap stays below the threshold, so P3 is not supported under any coding set. Competition is strongly asymmetric: in Turkish sources it rises from 45.0% to 75.0% across the domains, whereas in Chinese sources it stays between 13.0% and 25.0%. Turkish sources present Türkiye as a bridge, crossroads or hub about twice as often as Chinese sources promote themselves; even the Turkish ambassador's interview in a Chinese magazine stressed that the new Istanbul Airport would be the world's largest. Arrivals rose from 138,876 in 2013 to 425,348 in 2025, but their share peaked at 0.998% in 2018 (TÜİK, 2026). This limited and one-sided competition cannot explain the gap, so P5 is not supported; distance is the more plausible explanation.</w:t>
+      </w:r>
+    </w:p>
+    <w:p>
+      <w:pPr>
+        <w:pStyle w:val="2cilbalk"/>
+        <w:jc w:val="left"/>
+      </w:pPr>
+      <w:r>
+        <w:t xml:space="preserve">Sonuç / Conclusions</w:t>
       </w:r>
     </w:p>
     <w:p>
@@ -6609,10 +6486,17 @@
         </w:rPr>
       </w:pPr>
       <w:r>
-        <w:rPr>
-          <w:highlight w:val="yellow"/>
-        </w:rPr>
-        <w:t xml:space="preserve">P3: shares of competition codes across the four domains (connectivity __%, tourist flows __%, narrative __%, value capture __%), with and without neutral units; outcome of the pre-registered rule; number and character of negative cases.</w:t>
+        <w:rPr/>
+        <w:t xml:space="preserve">The separation principle travels to inter-state heritage tourism only in part. Türkiye–China coopetition over the Silk Road appears as a one-sided discourse: Türkiye seeks to be the centre, while China keeps to partnership. Value capture is almost absent because states do not discuss money in official texts. Distance explains both the dominance of cooperation and its failure to bring tourists, consistent with evidence that distance reduces Chinese outbound flows (Deng &amp; Hu, 2019). A language of shared heritage is likely to reach Chinese tourists better than an emphasis on Türkiye as a hub, and more direct flights are the most concrete way to shorten the distance. The findings are limited by the selection of official documents, partial reliance on translation, the lack of revenue data and the use of border records rather than tourist counts.</w:t>
+      </w:r>
+    </w:p>
+    <w:p>
+      <w:pPr>
+        <w:pStyle w:val="2cilbalk"/>
+        <w:jc w:val="left"/>
+      </w:pPr>
+      <w:r>
+        <w:t xml:space="preserve">Özgün Değer / Originality and Value</w:t>
       </w:r>
     </w:p>
     <w:p>
@@ -6621,64 +6505,12 @@
         <w:rPr>
           <w:b/>
           <w:bCs/>
+          <w:lang w:val="en-US"/>
         </w:rPr>
       </w:pPr>
       <w:r>
         <w:rPr/>
-        <w:t xml:space="preserve">The descriptive series confirms the gap between discourse and flows. Arrivals of Chinese nationals rose from 138,876 in 2013 to 426,344 in 2019 and stood at 425,348 in 2025, but their share of all foreign arrivals peaked at 0.998% in 2018 (TÜİK, 2026). The connectivity domain helps to explain why. Cooperation along the Middle Corridor has produced freight capacity rather than passenger services: the corridor carried about 5.2 million tonnes of freight in 2025 without a scheduled international passenger service on its main axis (Farmanov et al., 2026). </w:t>
-      </w:r>
-      <w:r>
-        <w:rPr>
-          <w:highlight w:val="yellow"/>
-        </w:rPr>
-        <w:t xml:space="preserve">P4 and P5: what the coding adds to this picture, for example Chinese narratives that market domestic Silk Road destinations.</w:t>
-      </w:r>
-    </w:p>
-    <w:p>
-      <w:pPr>
-        <w:pStyle w:val="2cilbalk"/>
-        <w:jc w:val="left"/>
-      </w:pPr>
-      <w:r>
-        <w:t xml:space="preserve">Sonuç / Conclusions</w:t>
-      </w:r>
-    </w:p>
-    <w:p>
-      <w:pPr>
-        <w:pStyle w:val="Gvdemetin"/>
-        <w:rPr>
-          <w:b/>
-          <w:bCs/>
-        </w:rPr>
-      </w:pPr>
-      <w:r>
-        <w:rPr>
-          <w:highlight w:val="yellow"/>
-        </w:rPr>
-        <w:t xml:space="preserve">Conclusions (author): whether and how far the separation principle travels to inter-state heritage tourism; how the competing explanations of market-based separation (Bengtsson &amp; Kock, 2000, p. 420), geographic and cultural distance (Deng &amp; Hu, 2019) and status asymmetry (Norheim-Hansen et al., 2026) fare against the findings; one or two policy implications for Türkiye; limitations (document selection, Chinese-language sources, the construct–measure gap in value capture, arrivals as border records rather than tourist counts).</w:t>
-      </w:r>
-    </w:p>
-    <w:p>
-      <w:pPr>
-        <w:pStyle w:val="2cilbalk"/>
-        <w:jc w:val="left"/>
-      </w:pPr>
-      <w:r>
-        <w:t xml:space="preserve">Özgün Değer / Originality and Value</w:t>
-      </w:r>
-    </w:p>
-    <w:p>
-      <w:pPr>
-        <w:pStyle w:val="Gvdemetin"/>
-        <w:rPr>
-          <w:b/>
-          <w:bCs/>
-          <w:lang w:val="en-US"/>
-        </w:rPr>
-      </w:pPr>
-      <w:r>
-        <w:rPr/>
-        <w:t xml:space="preserve">The study contributes at three levels. Theoretically, it carries the separation principle, so far examined among firms and destinations (Chim-Miki &amp; Batista-Canino, 2017a; Wang &amp; Krakover, 2008), to heritage tourism between two states. This extension matters because the closest existing work addresses the multilateral management of the Silk Road Programme (Redi &amp; Pulido Fernández, 2018), while international relations studies of the Türkiye–China dyad and of great power coopetition explain the relationship as a whole without asking in which activities cooperation and competition concentrate (Wang &amp; Sun, 2024; Wisniewski, 2025). Conceptually, the study shows that the discourse of a "shared Silk Road" can carry partnership and ownership claims at the same time; for this reason it treats the Silk Road heritage as the object of coopetition rather than as a neutral common asset. Practically, it offers Türkiye's China tourism policy a way to distinguish the domains in which cooperation pays from those in which differentiation is needed.</w:t>
+        <w:t xml:space="preserve">The study is the first to carry the separation principle, so far examined among firms and destinations (Chim-Miki &amp; Batista-Canino, 2017a; Wang &amp; Krakover, 2008), to heritage tourism between two states. Existing work addresses the multilateral Silk Road Programme (Redi &amp; Pulido Fernández, 2018) or the Türkiye–China relationship as a whole (Wang &amp; Sun, 2024). By showing that a "shared Silk Road" can carry partnership and ownership claims at once, the study treats the heritage as the object of a one-sided coopetition rather than as a neutral common asset.</w:t>
       </w:r>
       <w:r>
         <w:br w:type="page"/>

</xml_diff>